<commit_message>
design notes for PB business logic
</commit_message>
<xml_diff>
--- a/docs/planning/post-conference/_current/tasks/Docs/PB-NEXT Workflow.docx
+++ b/docs/planning/post-conference/_current/tasks/Docs/PB-NEXT Workflow.docx
@@ -1290,10 +1290,7 @@
         <w:t>Group</w:t>
       </w:r>
       <w:r>
-        <w:t xml:space="preserve"> is a </w:t>
-      </w:r>
-      <w:r>
-        <w:t>system-scoped organization for preserving source/import group structure.</w:t>
+        <w:t xml:space="preserve"> is a system-scoped organization for preserving source/import group structure.</w:t>
       </w:r>
     </w:p>
     <w:p>
@@ -1390,10 +1387,7 @@
         <w:keepLines/>
       </w:pPr>
       <w:r>
-        <w:t xml:space="preserve">Groups are stored in </w:t>
-      </w:r>
-      <w:r>
-        <w:t>two schema tables:</w:t>
+        <w:t>Groups are stored in two schema tables:</w:t>
       </w:r>
     </w:p>
     <w:p>
@@ -3627,7 +3621,6 @@
           </w:tcPr>
           <w:p>
             <w:r>
-              <w:lastRenderedPageBreak/>
               <w:t>13</w:t>
             </w:r>
           </w:p>
@@ -3695,7 +3688,11 @@
           </w:tcPr>
           <w:p>
             <w:r>
-              <w:t>Add authorization boundary</w:t>
+              <w:t xml:space="preserve">Add authorization </w:t>
+            </w:r>
+            <w:r>
+              <w:lastRenderedPageBreak/>
+              <w:t>boundary</w:t>
             </w:r>
           </w:p>
         </w:tc>
@@ -3707,7 +3704,12 @@
           </w:tcPr>
           <w:p>
             <w:r>
-              <w:t>Membership check before system reads/writes</w:t>
+              <w:lastRenderedPageBreak/>
+              <w:t xml:space="preserve">Membership check before system </w:t>
+            </w:r>
+            <w:r>
+              <w:lastRenderedPageBreak/>
+              <w:t>reads/writes</w:t>
             </w:r>
           </w:p>
         </w:tc>
@@ -3719,7 +3721,12 @@
           </w:tcPr>
           <w:p>
             <w:r>
-              <w:t>API checks active membership before returning system data</w:t>
+              <w:lastRenderedPageBreak/>
+              <w:t xml:space="preserve">API checks active membership before </w:t>
+            </w:r>
+            <w:r>
+              <w:lastRenderedPageBreak/>
+              <w:t>returning system data</w:t>
             </w:r>
           </w:p>
         </w:tc>
@@ -3736,6 +3743,7 @@
           </w:tcPr>
           <w:p>
             <w:r>
+              <w:lastRenderedPageBreak/>
               <w:t>15</w:t>
             </w:r>
           </w:p>
@@ -4167,7 +4175,6 @@
           </w:tcPr>
           <w:p>
             <w:r>
-              <w:lastRenderedPageBreak/>
               <w:t>23</w:t>
             </w:r>
           </w:p>
@@ -4219,7 +4226,11 @@
           </w:tcPr>
           <w:p>
             <w:r>
-              <w:t>24-Prereq</w:t>
+              <w:t>24-</w:t>
+            </w:r>
+            <w:r>
+              <w:lastRenderedPageBreak/>
+              <w:t>Prereq</w:t>
             </w:r>
           </w:p>
         </w:tc>
@@ -4230,7 +4241,12 @@
           </w:tcPr>
           <w:p>
             <w:r>
-              <w:t>Add local rolling trace file sink</w:t>
+              <w:lastRenderedPageBreak/>
+              <w:t xml:space="preserve">Add local </w:t>
+            </w:r>
+            <w:r>
+              <w:lastRenderedPageBreak/>
+              <w:t>rolling trace file sink</w:t>
             </w:r>
           </w:p>
         </w:tc>
@@ -4241,7 +4257,12 @@
           </w:tcPr>
           <w:p>
             <w:r>
-              <w:t>A durable local development log file for existing PB_LEVEL1_TRACE entries, using the current ILogger trace boundary without adding new trace facts or changing /api/me behavior.</w:t>
+              <w:lastRenderedPageBreak/>
+              <w:t xml:space="preserve">A durable local development log </w:t>
+            </w:r>
+            <w:r>
+              <w:lastRenderedPageBreak/>
+              <w:t>file for existing PB_LEVEL1_TRACE entries, using the current ILogger trace boundary without adding new trace facts or changing /api/me behavior.</w:t>
             </w:r>
           </w:p>
         </w:tc>
@@ -4252,7 +4273,12 @@
           </w:tcPr>
           <w:p>
             <w:r>
-              <w:t>Running /api/me writes the existing Level 1 trace entries to a local rolling log file, the file can be searched for PB_LEVEL1_TRACE, TraceId, CorrelationId, Stage, and Outcome, and the API still builds and returns the verified owner path.</w:t>
+              <w:lastRenderedPageBreak/>
+              <w:t xml:space="preserve">Running /api/me writes the existing Level 1 </w:t>
+            </w:r>
+            <w:r>
+              <w:lastRenderedPageBreak/>
+              <w:t>trace entries to a local rolling log file, the file can be searched for PB_LEVEL1_TRACE, TraceId, CorrelationId, Stage, and Outcome, and the API still builds and returns the verified owner path.</w:t>
             </w:r>
           </w:p>
         </w:tc>
@@ -4268,6 +4294,7 @@
           </w:tcPr>
           <w:p>
             <w:r>
+              <w:lastRenderedPageBreak/>
               <w:t>24</w:t>
             </w:r>
           </w:p>
@@ -4470,77 +4497,77 @@
         <w:pStyle w:val="Heading2"/>
       </w:pPr>
       <w:r>
+        <w:t>Minimal database objects for Chapter 2</w:t>
+      </w:r>
+    </w:p>
+    <w:p>
+      <w:r>
+        <w:t>Existing:</w:t>
+      </w:r>
+    </w:p>
+    <w:p>
+      <w:pPr>
+        <w:pStyle w:val="ListParagraph"/>
+        <w:numPr>
+          <w:ilvl w:val="0"/>
+          <w:numId w:val="9"/>
+        </w:numPr>
+      </w:pPr>
+      <w:r>
+        <w:t>pb_systems</w:t>
+      </w:r>
+    </w:p>
+    <w:p>
+      <w:pPr>
+        <w:pStyle w:val="ListParagraph"/>
+        <w:numPr>
+          <w:ilvl w:val="0"/>
+          <w:numId w:val="9"/>
+        </w:numPr>
+      </w:pPr>
+      <w:r>
+        <w:t>pb_members</w:t>
+      </w:r>
+    </w:p>
+    <w:p>
+      <w:pPr>
+        <w:pStyle w:val="ListParagraph"/>
+        <w:numPr>
+          <w:ilvl w:val="0"/>
+          <w:numId w:val="9"/>
+        </w:numPr>
+      </w:pPr>
+      <w:r>
+        <w:t>pb_front_history</w:t>
+      </w:r>
+    </w:p>
+    <w:p>
+      <w:pPr>
+        <w:pStyle w:val="ListParagraph"/>
+        <w:numPr>
+          <w:ilvl w:val="0"/>
+          <w:numId w:val="9"/>
+        </w:numPr>
+      </w:pPr>
+      <w:r>
+        <w:t>pb_privacy_buckets</w:t>
+      </w:r>
+    </w:p>
+    <w:p>
+      <w:pPr>
+        <w:pStyle w:val="ListParagraph"/>
+        <w:numPr>
+          <w:ilvl w:val="0"/>
+          <w:numId w:val="9"/>
+        </w:numPr>
+      </w:pPr>
+      <w:r>
+        <w:t>pb_custom_fields</w:t>
+      </w:r>
+    </w:p>
+    <w:p>
+      <w:r>
         <w:lastRenderedPageBreak/>
-        <w:t>Minimal database objects for Chapter 2</w:t>
-      </w:r>
-    </w:p>
-    <w:p>
-      <w:r>
-        <w:t>Existing:</w:t>
-      </w:r>
-    </w:p>
-    <w:p>
-      <w:pPr>
-        <w:pStyle w:val="ListParagraph"/>
-        <w:numPr>
-          <w:ilvl w:val="0"/>
-          <w:numId w:val="9"/>
-        </w:numPr>
-      </w:pPr>
-      <w:r>
-        <w:t>pb_systems</w:t>
-      </w:r>
-    </w:p>
-    <w:p>
-      <w:pPr>
-        <w:pStyle w:val="ListParagraph"/>
-        <w:numPr>
-          <w:ilvl w:val="0"/>
-          <w:numId w:val="9"/>
-        </w:numPr>
-      </w:pPr>
-      <w:r>
-        <w:t>pb_members</w:t>
-      </w:r>
-    </w:p>
-    <w:p>
-      <w:pPr>
-        <w:pStyle w:val="ListParagraph"/>
-        <w:numPr>
-          <w:ilvl w:val="0"/>
-          <w:numId w:val="9"/>
-        </w:numPr>
-      </w:pPr>
-      <w:r>
-        <w:t>pb_front_history</w:t>
-      </w:r>
-    </w:p>
-    <w:p>
-      <w:pPr>
-        <w:pStyle w:val="ListParagraph"/>
-        <w:numPr>
-          <w:ilvl w:val="0"/>
-          <w:numId w:val="9"/>
-        </w:numPr>
-      </w:pPr>
-      <w:r>
-        <w:t>pb_privacy_buckets</w:t>
-      </w:r>
-    </w:p>
-    <w:p>
-      <w:pPr>
-        <w:pStyle w:val="ListParagraph"/>
-        <w:numPr>
-          <w:ilvl w:val="0"/>
-          <w:numId w:val="9"/>
-        </w:numPr>
-      </w:pPr>
-      <w:r>
-        <w:t>pb_custom_fields</w:t>
-      </w:r>
-    </w:p>
-    <w:p>
-      <w:r>
         <w:t>New:</w:t>
       </w:r>
     </w:p>
@@ -5176,7 +5203,6 @@
     </w:p>
     <w:p>
       <w:r>
-        <w:lastRenderedPageBreak/>
         <w:t>Level 1 is the black-box flight recorder. Tiny, reliable, always present.</w:t>
       </w:r>
     </w:p>
@@ -5219,6 +5245,7 @@
         </w:numPr>
       </w:pPr>
       <w:r>
+        <w:lastRenderedPageBreak/>
         <w:t>which resolver branch was used</w:t>
       </w:r>
     </w:p>
@@ -5432,7 +5459,6 @@
         </w:numPr>
       </w:pPr>
       <w:r>
-        <w:lastRenderedPageBreak/>
         <w:t>Baseline diagnostic tracing is always active.</w:t>
       </w:r>
     </w:p>
@@ -5507,6 +5533,7 @@
               <w:br/>
             </w:r>
             <w:r>
+              <w:lastRenderedPageBreak/>
               <w:t xml:space="preserve">  DiagnosticTraceAreaId</w:t>
             </w:r>
             <w:r>
@@ -5532,10 +5559,14 @@
               <w:spacing w:after="160" w:line="278" w:lineRule="auto"/>
             </w:pPr>
             <w:r>
+              <w:lastRenderedPageBreak/>
               <w:t>AccountDiag</w:t>
             </w:r>
             <w:r>
               <w:br/>
+            </w:r>
+            <w:r>
+              <w:lastRenderedPageBreak/>
               <w:t>MembershipDiag</w:t>
             </w:r>
             <w:r>
@@ -5753,91 +5784,91 @@
         </w:numPr>
       </w:pPr>
       <w:r>
+        <w:t>AccountDiag</w:t>
+      </w:r>
+    </w:p>
+    <w:p>
+      <w:pPr>
+        <w:pStyle w:val="ListParagraph"/>
+        <w:numPr>
+          <w:ilvl w:val="0"/>
+          <w:numId w:val="19"/>
+        </w:numPr>
+      </w:pPr>
+      <w:r>
+        <w:t>MembershipDiag</w:t>
+      </w:r>
+    </w:p>
+    <w:p>
+      <w:pPr>
+        <w:pStyle w:val="ListParagraph"/>
+        <w:numPr>
+          <w:ilvl w:val="0"/>
+          <w:numId w:val="19"/>
+        </w:numPr>
+      </w:pPr>
+      <w:r>
+        <w:t>AuthorizationDiag</w:t>
+      </w:r>
+    </w:p>
+    <w:p>
+      <w:pPr>
+        <w:pStyle w:val="ListParagraph"/>
+        <w:numPr>
+          <w:ilvl w:val="0"/>
+          <w:numId w:val="19"/>
+        </w:numPr>
+      </w:pPr>
+      <w:r>
+        <w:t>VisibilityDiag</w:t>
+      </w:r>
+    </w:p>
+    <w:p>
+      <w:pPr>
+        <w:pStyle w:val="ListParagraph"/>
+        <w:numPr>
+          <w:ilvl w:val="0"/>
+          <w:numId w:val="19"/>
+        </w:numPr>
+      </w:pPr>
+      <w:r>
+        <w:t>DataAccessDiag</w:t>
+      </w:r>
+    </w:p>
+    <w:p>
+      <w:pPr>
+        <w:pStyle w:val="ListParagraph"/>
+        <w:numPr>
+          <w:ilvl w:val="0"/>
+          <w:numId w:val="19"/>
+        </w:numPr>
+      </w:pPr>
+      <w:r>
+        <w:t>ConfigDiag</w:t>
+      </w:r>
+    </w:p>
+    <w:p>
+      <w:pPr>
+        <w:pStyle w:val="ListParagraph"/>
+        <w:numPr>
+          <w:ilvl w:val="0"/>
+          <w:numId w:val="19"/>
+        </w:numPr>
+      </w:pPr>
+      <w:r>
+        <w:t>ApiDiag</w:t>
+      </w:r>
+    </w:p>
+    <w:p>
+      <w:pPr>
+        <w:pStyle w:val="ListParagraph"/>
+        <w:numPr>
+          <w:ilvl w:val="0"/>
+          <w:numId w:val="19"/>
+        </w:numPr>
+      </w:pPr>
+      <w:r>
         <w:lastRenderedPageBreak/>
-        <w:t>AccountDiag</w:t>
-      </w:r>
-    </w:p>
-    <w:p>
-      <w:pPr>
-        <w:pStyle w:val="ListParagraph"/>
-        <w:numPr>
-          <w:ilvl w:val="0"/>
-          <w:numId w:val="19"/>
-        </w:numPr>
-      </w:pPr>
-      <w:r>
-        <w:t>MembershipDiag</w:t>
-      </w:r>
-    </w:p>
-    <w:p>
-      <w:pPr>
-        <w:pStyle w:val="ListParagraph"/>
-        <w:numPr>
-          <w:ilvl w:val="0"/>
-          <w:numId w:val="19"/>
-        </w:numPr>
-      </w:pPr>
-      <w:r>
-        <w:t>AuthorizationDiag</w:t>
-      </w:r>
-    </w:p>
-    <w:p>
-      <w:pPr>
-        <w:pStyle w:val="ListParagraph"/>
-        <w:numPr>
-          <w:ilvl w:val="0"/>
-          <w:numId w:val="19"/>
-        </w:numPr>
-      </w:pPr>
-      <w:r>
-        <w:t>VisibilityDiag</w:t>
-      </w:r>
-    </w:p>
-    <w:p>
-      <w:pPr>
-        <w:pStyle w:val="ListParagraph"/>
-        <w:numPr>
-          <w:ilvl w:val="0"/>
-          <w:numId w:val="19"/>
-        </w:numPr>
-      </w:pPr>
-      <w:r>
-        <w:t>DataAccessDiag</w:t>
-      </w:r>
-    </w:p>
-    <w:p>
-      <w:pPr>
-        <w:pStyle w:val="ListParagraph"/>
-        <w:numPr>
-          <w:ilvl w:val="0"/>
-          <w:numId w:val="19"/>
-        </w:numPr>
-      </w:pPr>
-      <w:r>
-        <w:t>ConfigDiag</w:t>
-      </w:r>
-    </w:p>
-    <w:p>
-      <w:pPr>
-        <w:pStyle w:val="ListParagraph"/>
-        <w:numPr>
-          <w:ilvl w:val="0"/>
-          <w:numId w:val="19"/>
-        </w:numPr>
-      </w:pPr>
-      <w:r>
-        <w:t>ApiDiag</w:t>
-      </w:r>
-    </w:p>
-    <w:p>
-      <w:pPr>
-        <w:pStyle w:val="ListParagraph"/>
-        <w:numPr>
-          <w:ilvl w:val="0"/>
-          <w:numId w:val="19"/>
-        </w:numPr>
-      </w:pPr>
-      <w:r>
         <w:t>ErrorDiag</w:t>
       </w:r>
     </w:p>
@@ -6075,38 +6106,1865 @@
     </w:p>
     <w:p>
       <w:r>
-        <w:t>Member add</w:t>
-      </w:r>
-      <w:r>
-        <w:br/>
-        <w:t>Member edit</w:t>
-      </w:r>
-      <w:r>
-        <w:br/>
-        <w:t>Member read</w:t>
-      </w:r>
-      <w:r>
-        <w:br/>
-        <w:t>Minimal audit</w:t>
-      </w:r>
-      <w:r>
-        <w:br/>
+        <w:t>Build the first real editable PluralBridge data path:</w:t>
+      </w:r>
+    </w:p>
+    <w:p>
+      <w:pPr>
+        <w:pStyle w:val="ListParagraph"/>
+        <w:numPr>
+          <w:ilvl w:val="0"/>
+          <w:numId w:val="27"/>
+        </w:numPr>
+      </w:pPr>
+      <w:r>
+        <w:t>member read</w:t>
+      </w:r>
+    </w:p>
+    <w:p>
+      <w:pPr>
+        <w:pStyle w:val="ListParagraph"/>
+        <w:numPr>
+          <w:ilvl w:val="0"/>
+          <w:numId w:val="27"/>
+        </w:numPr>
+      </w:pPr>
+      <w:r>
+        <w:t>member add</w:t>
+      </w:r>
+    </w:p>
+    <w:p>
+      <w:pPr>
+        <w:pStyle w:val="ListParagraph"/>
+        <w:numPr>
+          <w:ilvl w:val="0"/>
+          <w:numId w:val="27"/>
+        </w:numPr>
+      </w:pPr>
+      <w:r>
+        <w:t>member edit</w:t>
+      </w:r>
+    </w:p>
+    <w:p>
+      <w:pPr>
+        <w:pStyle w:val="ListParagraph"/>
+        <w:numPr>
+          <w:ilvl w:val="0"/>
+          <w:numId w:val="27"/>
+        </w:numPr>
+      </w:pPr>
+      <w:r>
+        <w:t>minimal audit</w:t>
+      </w:r>
+    </w:p>
+    <w:p>
+      <w:pPr>
+        <w:pStyle w:val="ListParagraph"/>
+        <w:numPr>
+          <w:ilvl w:val="0"/>
+          <w:numId w:val="27"/>
+        </w:numPr>
+      </w:pPr>
+      <w:r>
         <w:t>SystemId enforcement</w:t>
       </w:r>
-      <w:r>
-        <w:br/>
+    </w:p>
+    <w:p>
+      <w:pPr>
+        <w:pStyle w:val="ListParagraph"/>
+        <w:numPr>
+          <w:ilvl w:val="0"/>
+          <w:numId w:val="27"/>
+        </w:numPr>
+      </w:pPr>
+      <w:r>
         <w:t>Membership enforcement</w:t>
       </w:r>
-      <w:r>
-        <w:br/>
-        <w:t>Privacy bucket awareness</w:t>
-      </w:r>
-    </w:p>
-    <w:p>
-      <w:r>
-        <w:t>This turns PluralBridge from demo viewer into real software.</w:t>
-      </w:r>
-    </w:p>
+    </w:p>
+    <w:p>
+      <w:pPr>
+        <w:pStyle w:val="ListParagraph"/>
+        <w:numPr>
+          <w:ilvl w:val="0"/>
+          <w:numId w:val="27"/>
+        </w:numPr>
+      </w:pPr>
+      <w:r>
+        <w:t>privacy bucket awareness</w:t>
+      </w:r>
+    </w:p>
+    <w:p>
+      <w:pPr>
+        <w:pStyle w:val="Heading2"/>
+      </w:pPr>
+      <w:r>
+        <w:t>Tasks</w:t>
+      </w:r>
+    </w:p>
+    <w:p>
+      <w:r>
+        <w:t>This chapter turns the protected read-only proof into the first controlled write-capable application path.</w:t>
+      </w:r>
+    </w:p>
+    <w:p>
+      <w:r>
+        <w:t>Task 1 = planning/design boundary</w:t>
+      </w:r>
+    </w:p>
+    <w:p>
+      <w:r>
+        <w:t>Task 2 = request/response contract design</w:t>
+      </w:r>
+    </w:p>
+    <w:p>
+      <w:r>
+        <w:t>Task 3 = minimal audit SQL/schema support</w:t>
+      </w:r>
+    </w:p>
+    <w:p>
+      <w:r>
+        <w:t>Task 4 = C# write-access enforcement boundary</w:t>
+      </w:r>
+    </w:p>
+    <w:p>
+      <w:r>
+        <w:t>Task 5 = C# system-scoped member read path</w:t>
+      </w:r>
+    </w:p>
+    <w:p>
+      <w:r>
+        <w:t>Task 6 = C# member add endpoint</w:t>
+      </w:r>
+    </w:p>
+    <w:p>
+      <w:r>
+        <w:t>Task 7 = C# member edit endpoint</w:t>
+      </w:r>
+    </w:p>
+    <w:p>
+      <w:r>
+        <w:t>Task 8 = protected browser add/edit path</w:t>
+      </w:r>
+    </w:p>
+    <w:p>
+      <w:r>
+        <w:t>Task 9 = final Chapter 3 verification</w:t>
+      </w:r>
+    </w:p>
+    <w:p>
+      <w:pPr>
+        <w:pStyle w:val="Heading2"/>
+      </w:pPr>
+      <w:r>
+        <w:t>Task Steps</w:t>
+      </w:r>
+    </w:p>
+    <w:tbl>
+      <w:tblPr>
+        <w:tblW w:w="0" w:type="auto"/>
+        <w:tblCellSpacing w:w="15" w:type="dxa"/>
+        <w:tblLayout w:type="fixed"/>
+        <w:tblCellMar>
+          <w:top w:w="15" w:type="dxa"/>
+          <w:left w:w="15" w:type="dxa"/>
+          <w:bottom w:w="15" w:type="dxa"/>
+          <w:right w:w="15" w:type="dxa"/>
+        </w:tblCellMar>
+        <w:tblLook w:val="04A0" w:firstRow="1" w:lastRow="0" w:firstColumn="1" w:lastColumn="0" w:noHBand="0" w:noVBand="1"/>
+      </w:tblPr>
+      <w:tblGrid>
+        <w:gridCol w:w="855"/>
+        <w:gridCol w:w="1440"/>
+        <w:gridCol w:w="3420"/>
+        <w:gridCol w:w="4590"/>
+      </w:tblGrid>
+      <w:tr>
+        <w:trPr>
+          <w:tblCellSpacing w:w="15" w:type="dxa"/>
+        </w:trPr>
+        <w:tc>
+          <w:tcPr>
+            <w:tcW w:w="810" w:type="dxa"/>
+            <w:tcBorders>
+              <w:top w:val="single" w:sz="4" w:space="0" w:color="auto"/>
+            </w:tcBorders>
+            <w:vAlign w:val="center"/>
+          </w:tcPr>
+          <w:p>
+            <w:r>
+              <w:t>0</w:t>
+            </w:r>
+          </w:p>
+        </w:tc>
+        <w:tc>
+          <w:tcPr>
+            <w:tcW w:w="1410" w:type="dxa"/>
+            <w:tcBorders>
+              <w:top w:val="single" w:sz="4" w:space="0" w:color="auto"/>
+            </w:tcBorders>
+            <w:vAlign w:val="center"/>
+          </w:tcPr>
+          <w:p>
+            <w:r>
+              <w:t>Create feature branch</w:t>
+            </w:r>
+          </w:p>
+        </w:tc>
+        <w:tc>
+          <w:tcPr>
+            <w:tcW w:w="3390" w:type="dxa"/>
+            <w:tcBorders>
+              <w:top w:val="single" w:sz="4" w:space="0" w:color="auto"/>
+            </w:tcBorders>
+            <w:vAlign w:val="center"/>
+          </w:tcPr>
+          <w:p>
+            <w:r>
+              <w:t>Create Chapter 3 feature branch</w:t>
+            </w:r>
+          </w:p>
+        </w:tc>
+        <w:tc>
+          <w:tcPr>
+            <w:tcW w:w="4545" w:type="dxa"/>
+            <w:tcBorders>
+              <w:top w:val="single" w:sz="4" w:space="0" w:color="auto"/>
+            </w:tcBorders>
+            <w:vAlign w:val="center"/>
+          </w:tcPr>
+          <w:p>
+            <w:pPr>
+              <w:pStyle w:val="ListParagraph"/>
+              <w:spacing w:after="0"/>
+            </w:pPr>
+            <w:r>
+              <w:t>branch created from dev</w:t>
+            </w:r>
+            <w:r>
+              <w:br/>
+              <w:t>upstream set to origin/feature/pb-next-chapter-3-editable-members-001</w:t>
+            </w:r>
+            <w:r>
+              <w:br/>
+              <w:t>final status is clean</w:t>
+            </w:r>
+          </w:p>
+        </w:tc>
+      </w:tr>
+      <w:tr>
+        <w:trPr>
+          <w:tblCellSpacing w:w="15" w:type="dxa"/>
+        </w:trPr>
+        <w:tc>
+          <w:tcPr>
+            <w:tcW w:w="810" w:type="dxa"/>
+            <w:tcBorders>
+              <w:top w:val="single" w:sz="4" w:space="0" w:color="auto"/>
+            </w:tcBorders>
+            <w:vAlign w:val="center"/>
+            <w:hideMark/>
+          </w:tcPr>
+          <w:p>
+            <w:r>
+              <w:t>1</w:t>
+            </w:r>
+          </w:p>
+        </w:tc>
+        <w:tc>
+          <w:tcPr>
+            <w:tcW w:w="1410" w:type="dxa"/>
+            <w:tcBorders>
+              <w:top w:val="single" w:sz="4" w:space="0" w:color="auto"/>
+            </w:tcBorders>
+            <w:vAlign w:val="center"/>
+            <w:hideMark/>
+          </w:tcPr>
+          <w:p>
+            <w:r>
+              <w:t>Define editable member path boundary</w:t>
+            </w:r>
+          </w:p>
+        </w:tc>
+        <w:tc>
+          <w:tcPr>
+            <w:tcW w:w="3390" w:type="dxa"/>
+            <w:tcBorders>
+              <w:top w:val="single" w:sz="4" w:space="0" w:color="auto"/>
+            </w:tcBorders>
+            <w:vAlign w:val="center"/>
+            <w:hideMark/>
+          </w:tcPr>
+          <w:p>
+            <w:r>
+              <w:t>A Chapter 3 design boundary for the first editable path.</w:t>
+            </w:r>
+          </w:p>
+        </w:tc>
+        <w:tc>
+          <w:tcPr>
+            <w:tcW w:w="4545" w:type="dxa"/>
+            <w:tcBorders>
+              <w:top w:val="single" w:sz="4" w:space="0" w:color="auto"/>
+            </w:tcBorders>
+            <w:vAlign w:val="center"/>
+            <w:hideMark/>
+          </w:tcPr>
+          <w:p>
+            <w:pPr>
+              <w:pStyle w:val="ListParagraph"/>
+              <w:numPr>
+                <w:ilvl w:val="0"/>
+                <w:numId w:val="28"/>
+              </w:numPr>
+              <w:spacing w:after="0"/>
+            </w:pPr>
+            <w:r>
+              <w:t>member read is named as the baseline read path</w:t>
+            </w:r>
+          </w:p>
+          <w:p>
+            <w:pPr>
+              <w:pStyle w:val="ListParagraph"/>
+              <w:numPr>
+                <w:ilvl w:val="0"/>
+                <w:numId w:val="28"/>
+              </w:numPr>
+              <w:spacing w:after="0"/>
+            </w:pPr>
+            <w:r>
+              <w:t>member add is named as the first create path</w:t>
+            </w:r>
+          </w:p>
+          <w:p>
+            <w:pPr>
+              <w:pStyle w:val="ListParagraph"/>
+              <w:numPr>
+                <w:ilvl w:val="0"/>
+                <w:numId w:val="28"/>
+              </w:numPr>
+              <w:spacing w:after="0"/>
+            </w:pPr>
+            <w:r>
+              <w:t>member edit is named as the first update path</w:t>
+            </w:r>
+          </w:p>
+          <w:p>
+            <w:pPr>
+              <w:pStyle w:val="ListParagraph"/>
+              <w:numPr>
+                <w:ilvl w:val="0"/>
+                <w:numId w:val="28"/>
+              </w:numPr>
+              <w:spacing w:after="0"/>
+            </w:pPr>
+            <w:r>
+              <w:t>delete is explicitly out of scope</w:t>
+            </w:r>
+          </w:p>
+          <w:p>
+            <w:pPr>
+              <w:pStyle w:val="ListParagraph"/>
+              <w:numPr>
+                <w:ilvl w:val="0"/>
+                <w:numId w:val="28"/>
+              </w:numPr>
+              <w:spacing w:after="0"/>
+            </w:pPr>
+            <w:r>
+              <w:t xml:space="preserve">bulk import behavior is explicitly out </w:t>
+            </w:r>
+            <w:r>
+              <w:lastRenderedPageBreak/>
+              <w:t>of scope</w:t>
+            </w:r>
+          </w:p>
+          <w:p>
+            <w:pPr>
+              <w:pStyle w:val="ListParagraph"/>
+              <w:numPr>
+                <w:ilvl w:val="0"/>
+                <w:numId w:val="28"/>
+              </w:numPr>
+              <w:spacing w:after="0"/>
+            </w:pPr>
+            <w:r>
+              <w:t>member writes are system-scoped</w:t>
+            </w:r>
+          </w:p>
+          <w:p>
+            <w:pPr>
+              <w:pStyle w:val="ListParagraph"/>
+              <w:numPr>
+                <w:ilvl w:val="0"/>
+                <w:numId w:val="28"/>
+              </w:numPr>
+              <w:spacing w:after="0"/>
+            </w:pPr>
+            <w:r>
+              <w:t>member writes require active membership</w:t>
+            </w:r>
+          </w:p>
+          <w:p>
+            <w:pPr>
+              <w:pStyle w:val="ListParagraph"/>
+              <w:numPr>
+                <w:ilvl w:val="0"/>
+                <w:numId w:val="28"/>
+              </w:numPr>
+              <w:spacing w:after="0"/>
+            </w:pPr>
+            <w:r>
+              <w:t>member writes produce minimal audit evidence</w:t>
+            </w:r>
+          </w:p>
+          <w:p>
+            <w:pPr>
+              <w:pStyle w:val="ListParagraph"/>
+              <w:numPr>
+                <w:ilvl w:val="0"/>
+                <w:numId w:val="28"/>
+              </w:numPr>
+              <w:spacing w:after="0"/>
+            </w:pPr>
+            <w:r>
+              <w:t>member writes are privacy-bucket aware</w:t>
+            </w:r>
+          </w:p>
+        </w:tc>
+      </w:tr>
+      <w:tr>
+        <w:trPr>
+          <w:tblCellSpacing w:w="15" w:type="dxa"/>
+        </w:trPr>
+        <w:tc>
+          <w:tcPr>
+            <w:tcW w:w="810" w:type="dxa"/>
+            <w:tcBorders>
+              <w:top w:val="single" w:sz="4" w:space="0" w:color="auto"/>
+            </w:tcBorders>
+            <w:vAlign w:val="center"/>
+          </w:tcPr>
+          <w:p>
+            <w:r>
+              <w:lastRenderedPageBreak/>
+              <w:t>2</w:t>
+            </w:r>
+          </w:p>
+        </w:tc>
+        <w:tc>
+          <w:tcPr>
+            <w:tcW w:w="1410" w:type="dxa"/>
+            <w:tcBorders>
+              <w:top w:val="single" w:sz="4" w:space="0" w:color="auto"/>
+            </w:tcBorders>
+            <w:vAlign w:val="center"/>
+          </w:tcPr>
+          <w:p>
+            <w:r>
+              <w:t>Define member write contract</w:t>
+            </w:r>
+          </w:p>
+        </w:tc>
+        <w:tc>
+          <w:tcPr>
+            <w:tcW w:w="3390" w:type="dxa"/>
+            <w:tcBorders>
+              <w:top w:val="single" w:sz="4" w:space="0" w:color="auto"/>
+            </w:tcBorders>
+            <w:vAlign w:val="center"/>
+          </w:tcPr>
+          <w:p>
+            <w:r>
+              <w:t>The API contract for adding and editing members before runtime code changes.</w:t>
+            </w:r>
+          </w:p>
+        </w:tc>
+        <w:tc>
+          <w:tcPr>
+            <w:tcW w:w="4545" w:type="dxa"/>
+            <w:tcBorders>
+              <w:top w:val="single" w:sz="4" w:space="0" w:color="auto"/>
+            </w:tcBorders>
+            <w:vAlign w:val="center"/>
+          </w:tcPr>
+          <w:p>
+            <w:pPr>
+              <w:pStyle w:val="ListParagraph"/>
+              <w:numPr>
+                <w:ilvl w:val="0"/>
+                <w:numId w:val="29"/>
+              </w:numPr>
+              <w:spacing w:after="0"/>
+            </w:pPr>
+            <w:r>
+              <w:t>member add request shape is defined</w:t>
+            </w:r>
+          </w:p>
+          <w:p>
+            <w:pPr>
+              <w:pStyle w:val="ListParagraph"/>
+              <w:numPr>
+                <w:ilvl w:val="0"/>
+                <w:numId w:val="29"/>
+              </w:numPr>
+              <w:spacing w:after="0"/>
+            </w:pPr>
+            <w:r>
+              <w:t>member edit request shape is defined</w:t>
+            </w:r>
+          </w:p>
+          <w:p>
+            <w:pPr>
+              <w:pStyle w:val="ListParagraph"/>
+              <w:numPr>
+                <w:ilvl w:val="0"/>
+                <w:numId w:val="29"/>
+              </w:numPr>
+              <w:spacing w:after="0"/>
+            </w:pPr>
+            <w:r>
+              <w:t>required fields are defined</w:t>
+            </w:r>
+          </w:p>
+          <w:p>
+            <w:pPr>
+              <w:pStyle w:val="ListParagraph"/>
+              <w:numPr>
+                <w:ilvl w:val="0"/>
+                <w:numId w:val="29"/>
+              </w:numPr>
+              <w:spacing w:after="0"/>
+            </w:pPr>
+            <w:r>
+              <w:t>optional fields are defined</w:t>
+            </w:r>
+          </w:p>
+          <w:p>
+            <w:pPr>
+              <w:pStyle w:val="ListParagraph"/>
+              <w:numPr>
+                <w:ilvl w:val="0"/>
+                <w:numId w:val="29"/>
+              </w:numPr>
+              <w:spacing w:after="0"/>
+            </w:pPr>
+            <w:r>
+              <w:t>server-owned fields are excluded from client input</w:t>
+            </w:r>
+          </w:p>
+          <w:p>
+            <w:pPr>
+              <w:pStyle w:val="ListParagraph"/>
+              <w:numPr>
+                <w:ilvl w:val="0"/>
+                <w:numId w:val="29"/>
+              </w:numPr>
+              <w:spacing w:after="0"/>
+            </w:pPr>
+            <w:r>
+              <w:t>SystemId handling is defined</w:t>
+            </w:r>
+          </w:p>
+          <w:p>
+            <w:pPr>
+              <w:pStyle w:val="ListParagraph"/>
+              <w:numPr>
+                <w:ilvl w:val="0"/>
+                <w:numId w:val="29"/>
+              </w:numPr>
+              <w:spacing w:after="0"/>
+            </w:pPr>
+            <w:r>
+              <w:t>privacy bucket handling is defined</w:t>
+            </w:r>
+          </w:p>
+          <w:p>
+            <w:pPr>
+              <w:pStyle w:val="ListParagraph"/>
+              <w:numPr>
+                <w:ilvl w:val="0"/>
+                <w:numId w:val="29"/>
+              </w:numPr>
+              <w:spacing w:after="0"/>
+            </w:pPr>
+            <w:r>
+              <w:t>validation failures are defined</w:t>
+            </w:r>
+          </w:p>
+          <w:p>
+            <w:pPr>
+              <w:pStyle w:val="ListParagraph"/>
+              <w:numPr>
+                <w:ilvl w:val="0"/>
+                <w:numId w:val="29"/>
+              </w:numPr>
+              <w:spacing w:after="0"/>
+            </w:pPr>
+            <w:r>
+              <w:t>write success response shape is defined</w:t>
+            </w:r>
+          </w:p>
+          <w:p/>
+        </w:tc>
+      </w:tr>
+      <w:tr>
+        <w:trPr>
+          <w:tblCellSpacing w:w="15" w:type="dxa"/>
+        </w:trPr>
+        <w:tc>
+          <w:tcPr>
+            <w:tcW w:w="810" w:type="dxa"/>
+            <w:vAlign w:val="center"/>
+          </w:tcPr>
+          <w:p>
+            <w:r>
+              <w:t>3</w:t>
+            </w:r>
+          </w:p>
+        </w:tc>
+        <w:tc>
+          <w:tcPr>
+            <w:tcW w:w="1410" w:type="dxa"/>
+            <w:vAlign w:val="center"/>
+          </w:tcPr>
+          <w:p>
+            <w:r>
+              <w:t>Add minimal audit support for member writes</w:t>
+            </w:r>
+          </w:p>
+        </w:tc>
+        <w:tc>
+          <w:tcPr>
+            <w:tcW w:w="3390" w:type="dxa"/>
+            <w:vAlign w:val="center"/>
+          </w:tcPr>
+          <w:p>
+            <w:r>
+              <w:t>A minimal audit table and helper shape for member add/edit evidence.</w:t>
+            </w:r>
+          </w:p>
+        </w:tc>
+        <w:tc>
+          <w:tcPr>
+            <w:tcW w:w="4545" w:type="dxa"/>
+            <w:vAlign w:val="center"/>
+          </w:tcPr>
+          <w:p>
+            <w:pPr>
+              <w:pStyle w:val="ListParagraph"/>
+              <w:numPr>
+                <w:ilvl w:val="0"/>
+                <w:numId w:val="30"/>
+              </w:numPr>
+              <w:spacing w:after="0"/>
+            </w:pPr>
+            <w:r>
+              <w:t>audit table exists</w:t>
+            </w:r>
+          </w:p>
+          <w:p>
+            <w:pPr>
+              <w:pStyle w:val="ListParagraph"/>
+              <w:numPr>
+                <w:ilvl w:val="0"/>
+                <w:numId w:val="30"/>
+              </w:numPr>
+              <w:spacing w:after="0"/>
+            </w:pPr>
+            <w:r>
+              <w:t>audit records include AccountId</w:t>
+            </w:r>
+          </w:p>
+          <w:p>
+            <w:pPr>
+              <w:pStyle w:val="ListParagraph"/>
+              <w:numPr>
+                <w:ilvl w:val="0"/>
+                <w:numId w:val="30"/>
+              </w:numPr>
+              <w:spacing w:after="0"/>
+            </w:pPr>
+            <w:r>
+              <w:t>audit records include SystemId</w:t>
+            </w:r>
+          </w:p>
+          <w:p>
+            <w:pPr>
+              <w:pStyle w:val="ListParagraph"/>
+              <w:numPr>
+                <w:ilvl w:val="0"/>
+                <w:numId w:val="30"/>
+              </w:numPr>
+              <w:spacing w:after="0"/>
+            </w:pPr>
+            <w:r>
+              <w:t>audit records include MembershipId</w:t>
+            </w:r>
+          </w:p>
+          <w:p>
+            <w:pPr>
+              <w:pStyle w:val="ListParagraph"/>
+              <w:numPr>
+                <w:ilvl w:val="0"/>
+                <w:numId w:val="30"/>
+              </w:numPr>
+              <w:spacing w:after="0"/>
+            </w:pPr>
+            <w:r>
+              <w:t>audit records include action name</w:t>
+            </w:r>
+          </w:p>
+          <w:p>
+            <w:pPr>
+              <w:pStyle w:val="ListParagraph"/>
+              <w:numPr>
+                <w:ilvl w:val="0"/>
+                <w:numId w:val="30"/>
+              </w:numPr>
+              <w:spacing w:after="0"/>
+            </w:pPr>
+            <w:r>
+              <w:t>audit records include entity type</w:t>
+            </w:r>
+          </w:p>
+          <w:p>
+            <w:pPr>
+              <w:pStyle w:val="ListParagraph"/>
+              <w:numPr>
+                <w:ilvl w:val="0"/>
+                <w:numId w:val="30"/>
+              </w:numPr>
+              <w:spacing w:after="0"/>
+            </w:pPr>
+            <w:r>
+              <w:t>audit records include entity id</w:t>
+            </w:r>
+          </w:p>
+          <w:p>
+            <w:pPr>
+              <w:pStyle w:val="ListParagraph"/>
+              <w:numPr>
+                <w:ilvl w:val="0"/>
+                <w:numId w:val="30"/>
+              </w:numPr>
+              <w:spacing w:after="0"/>
+            </w:pPr>
+            <w:r>
+              <w:t>audit records include trace id or correlation id</w:t>
+            </w:r>
+          </w:p>
+          <w:p>
+            <w:pPr>
+              <w:pStyle w:val="ListParagraph"/>
+              <w:numPr>
+                <w:ilvl w:val="0"/>
+                <w:numId w:val="30"/>
+              </w:numPr>
+              <w:spacing w:after="0"/>
+            </w:pPr>
+            <w:r>
+              <w:t>audit records include CreatedAtUtc</w:t>
+            </w:r>
+          </w:p>
+          <w:p>
+            <w:pPr>
+              <w:pStyle w:val="ListParagraph"/>
+              <w:numPr>
+                <w:ilvl w:val="0"/>
+                <w:numId w:val="30"/>
+              </w:numPr>
+              <w:spacing w:after="0"/>
+            </w:pPr>
+            <w:r>
+              <w:t>member add can be audited</w:t>
+            </w:r>
+          </w:p>
+          <w:p>
+            <w:pPr>
+              <w:pStyle w:val="ListParagraph"/>
+              <w:numPr>
+                <w:ilvl w:val="0"/>
+                <w:numId w:val="30"/>
+              </w:numPr>
+              <w:spacing w:after="0"/>
+            </w:pPr>
+            <w:r>
+              <w:t>member edit can be audited</w:t>
+            </w:r>
+          </w:p>
+          <w:p>
+            <w:pPr>
+              <w:pStyle w:val="ListParagraph"/>
+              <w:numPr>
+                <w:ilvl w:val="0"/>
+                <w:numId w:val="30"/>
+              </w:numPr>
+              <w:spacing w:after="0"/>
+            </w:pPr>
+            <w:r>
+              <w:t>audit is evidence-only</w:t>
+            </w:r>
+          </w:p>
+          <w:p>
+            <w:pPr>
+              <w:pStyle w:val="ListParagraph"/>
+              <w:numPr>
+                <w:ilvl w:val="0"/>
+                <w:numId w:val="30"/>
+              </w:numPr>
+              <w:spacing w:after="0"/>
+            </w:pPr>
+            <w:r>
+              <w:t>audit does not drive authorization</w:t>
+            </w:r>
+          </w:p>
+        </w:tc>
+      </w:tr>
+      <w:tr>
+        <w:trPr>
+          <w:tblCellSpacing w:w="15" w:type="dxa"/>
+        </w:trPr>
+        <w:tc>
+          <w:tcPr>
+            <w:tcW w:w="810" w:type="dxa"/>
+            <w:tcBorders>
+              <w:top w:val="single" w:sz="4" w:space="0" w:color="auto"/>
+            </w:tcBorders>
+            <w:vAlign w:val="center"/>
+          </w:tcPr>
+          <w:p>
+            <w:r>
+              <w:t>4</w:t>
+            </w:r>
+          </w:p>
+        </w:tc>
+        <w:tc>
+          <w:tcPr>
+            <w:tcW w:w="1410" w:type="dxa"/>
+            <w:tcBorders>
+              <w:top w:val="single" w:sz="4" w:space="0" w:color="auto"/>
+            </w:tcBorders>
+            <w:vAlign w:val="center"/>
+          </w:tcPr>
+          <w:p>
+            <w:r>
+              <w:t>Enforce editable member access boundary</w:t>
+            </w:r>
+          </w:p>
+        </w:tc>
+        <w:tc>
+          <w:tcPr>
+            <w:tcW w:w="3390" w:type="dxa"/>
+            <w:tcBorders>
+              <w:top w:val="single" w:sz="4" w:space="0" w:color="auto"/>
+            </w:tcBorders>
+            <w:vAlign w:val="center"/>
+          </w:tcPr>
+          <w:p>
+            <w:r>
+              <w:t>A reusable write access boundary for member add/edit.</w:t>
+            </w:r>
+          </w:p>
+        </w:tc>
+        <w:tc>
+          <w:tcPr>
+            <w:tcW w:w="4545" w:type="dxa"/>
+            <w:tcBorders>
+              <w:top w:val="single" w:sz="4" w:space="0" w:color="auto"/>
+            </w:tcBorders>
+            <w:vAlign w:val="center"/>
+          </w:tcPr>
+          <w:p>
+            <w:pPr>
+              <w:pStyle w:val="ListParagraph"/>
+              <w:numPr>
+                <w:ilvl w:val="0"/>
+                <w:numId w:val="31"/>
+              </w:numPr>
+              <w:spacing w:after="0"/>
+            </w:pPr>
+            <w:r>
+              <w:t>active account is required</w:t>
+            </w:r>
+          </w:p>
+          <w:p>
+            <w:pPr>
+              <w:pStyle w:val="ListParagraph"/>
+              <w:numPr>
+                <w:ilvl w:val="0"/>
+                <w:numId w:val="31"/>
+              </w:numPr>
+              <w:spacing w:after="0"/>
+            </w:pPr>
+            <w:r>
+              <w:t>active membership is required</w:t>
+            </w:r>
+          </w:p>
+          <w:p>
+            <w:pPr>
+              <w:pStyle w:val="ListParagraph"/>
+              <w:numPr>
+                <w:ilvl w:val="0"/>
+                <w:numId w:val="31"/>
+              </w:numPr>
+              <w:spacing w:after="0"/>
+            </w:pPr>
+            <w:r>
+              <w:t>current SystemId is resolved through AccessContext</w:t>
+            </w:r>
+          </w:p>
+          <w:p>
+            <w:pPr>
+              <w:pStyle w:val="ListParagraph"/>
+              <w:numPr>
+                <w:ilvl w:val="0"/>
+                <w:numId w:val="31"/>
+              </w:numPr>
+              <w:spacing w:after="0"/>
+            </w:pPr>
+            <w:r>
+              <w:t>member writes are scoped to current SystemId</w:t>
+            </w:r>
+          </w:p>
+          <w:p>
+            <w:pPr>
+              <w:pStyle w:val="ListParagraph"/>
+              <w:numPr>
+                <w:ilvl w:val="0"/>
+                <w:numId w:val="31"/>
+              </w:numPr>
+              <w:spacing w:after="0"/>
+            </w:pPr>
+            <w:r>
+              <w:lastRenderedPageBreak/>
+              <w:t>caller-supplied SystemId cannot escape current SystemId</w:t>
+            </w:r>
+          </w:p>
+          <w:p>
+            <w:pPr>
+              <w:pStyle w:val="ListParagraph"/>
+              <w:numPr>
+                <w:ilvl w:val="0"/>
+                <w:numId w:val="31"/>
+              </w:numPr>
+              <w:spacing w:after="0"/>
+            </w:pPr>
+            <w:r>
+              <w:t>missing membership fails before data access</w:t>
+            </w:r>
+          </w:p>
+          <w:p>
+            <w:pPr>
+              <w:pStyle w:val="ListParagraph"/>
+              <w:numPr>
+                <w:ilvl w:val="0"/>
+                <w:numId w:val="31"/>
+              </w:numPr>
+              <w:spacing w:after="0"/>
+            </w:pPr>
+            <w:r>
+              <w:t>inactive membership fails before data access</w:t>
+            </w:r>
+          </w:p>
+          <w:p>
+            <w:pPr>
+              <w:pStyle w:val="ListParagraph"/>
+              <w:numPr>
+                <w:ilvl w:val="0"/>
+                <w:numId w:val="31"/>
+              </w:numPr>
+              <w:spacing w:after="0"/>
+            </w:pPr>
+            <w:r>
+              <w:t>write authorization failure has a predictable response</w:t>
+            </w:r>
+          </w:p>
+        </w:tc>
+      </w:tr>
+      <w:tr>
+        <w:trPr>
+          <w:tblCellSpacing w:w="15" w:type="dxa"/>
+        </w:trPr>
+        <w:tc>
+          <w:tcPr>
+            <w:tcW w:w="810" w:type="dxa"/>
+            <w:tcBorders>
+              <w:top w:val="single" w:sz="4" w:space="0" w:color="auto"/>
+            </w:tcBorders>
+            <w:vAlign w:val="center"/>
+          </w:tcPr>
+          <w:p>
+            <w:r>
+              <w:lastRenderedPageBreak/>
+              <w:t>5</w:t>
+            </w:r>
+          </w:p>
+        </w:tc>
+        <w:tc>
+          <w:tcPr>
+            <w:tcW w:w="1410" w:type="dxa"/>
+            <w:tcBorders>
+              <w:top w:val="single" w:sz="4" w:space="0" w:color="auto"/>
+            </w:tcBorders>
+            <w:vAlign w:val="center"/>
+          </w:tcPr>
+          <w:p>
+            <w:r>
+              <w:t>Implement system-scoped member read path</w:t>
+            </w:r>
+          </w:p>
+        </w:tc>
+        <w:tc>
+          <w:tcPr>
+            <w:tcW w:w="3390" w:type="dxa"/>
+            <w:tcBorders>
+              <w:top w:val="single" w:sz="4" w:space="0" w:color="auto"/>
+            </w:tcBorders>
+            <w:vAlign w:val="center"/>
+          </w:tcPr>
+          <w:p>
+            <w:r>
+              <w:t>A Chapter 3 member read path that proves the editable path starts from the same enforced SystemId boundary.</w:t>
+            </w:r>
+          </w:p>
+        </w:tc>
+        <w:tc>
+          <w:tcPr>
+            <w:tcW w:w="4545" w:type="dxa"/>
+            <w:tcBorders>
+              <w:top w:val="single" w:sz="4" w:space="0" w:color="auto"/>
+            </w:tcBorders>
+            <w:vAlign w:val="center"/>
+          </w:tcPr>
+          <w:p>
+            <w:pPr>
+              <w:pStyle w:val="ListParagraph"/>
+              <w:numPr>
+                <w:ilvl w:val="0"/>
+                <w:numId w:val="32"/>
+              </w:numPr>
+              <w:spacing w:after="0"/>
+            </w:pPr>
+            <w:r>
+              <w:t>member read uses AccessContext</w:t>
+            </w:r>
+          </w:p>
+          <w:p>
+            <w:pPr>
+              <w:pStyle w:val="ListParagraph"/>
+              <w:numPr>
+                <w:ilvl w:val="0"/>
+                <w:numId w:val="32"/>
+              </w:numPr>
+              <w:spacing w:after="0"/>
+            </w:pPr>
+            <w:r>
+              <w:t>member read filters by current SystemId</w:t>
+            </w:r>
+          </w:p>
+          <w:p>
+            <w:pPr>
+              <w:pStyle w:val="ListParagraph"/>
+              <w:numPr>
+                <w:ilvl w:val="0"/>
+                <w:numId w:val="32"/>
+              </w:numPr>
+              <w:spacing w:after="0"/>
+            </w:pPr>
+            <w:r>
+              <w:t>member read does not leak members from another SystemId</w:t>
+            </w:r>
+          </w:p>
+          <w:p>
+            <w:pPr>
+              <w:pStyle w:val="ListParagraph"/>
+              <w:numPr>
+                <w:ilvl w:val="0"/>
+                <w:numId w:val="32"/>
+              </w:numPr>
+              <w:spacing w:after="0"/>
+            </w:pPr>
+            <w:r>
+              <w:t>member read includes privacy bucket awareness</w:t>
+            </w:r>
+          </w:p>
+          <w:p>
+            <w:pPr>
+              <w:pStyle w:val="ListParagraph"/>
+              <w:numPr>
+                <w:ilvl w:val="0"/>
+                <w:numId w:val="32"/>
+              </w:numPr>
+              <w:spacing w:after="0"/>
+            </w:pPr>
+            <w:r>
+              <w:t>member read returns the expected existing 49 members</w:t>
+            </w:r>
+          </w:p>
+          <w:p>
+            <w:pPr>
+              <w:pStyle w:val="ListParagraph"/>
+              <w:numPr>
+                <w:ilvl w:val="0"/>
+                <w:numId w:val="32"/>
+              </w:numPr>
+              <w:spacing w:after="0"/>
+            </w:pPr>
+            <w:r>
+              <w:t>/api/me behavior remains unchanged</w:t>
+            </w:r>
+          </w:p>
+        </w:tc>
+      </w:tr>
+      <w:tr>
+        <w:trPr>
+          <w:tblCellSpacing w:w="15" w:type="dxa"/>
+        </w:trPr>
+        <w:tc>
+          <w:tcPr>
+            <w:tcW w:w="810" w:type="dxa"/>
+            <w:tcBorders>
+              <w:top w:val="single" w:sz="4" w:space="0" w:color="auto"/>
+            </w:tcBorders>
+            <w:vAlign w:val="center"/>
+          </w:tcPr>
+          <w:p>
+            <w:r>
+              <w:t>6</w:t>
+            </w:r>
+          </w:p>
+        </w:tc>
+        <w:tc>
+          <w:tcPr>
+            <w:tcW w:w="1410" w:type="dxa"/>
+            <w:tcBorders>
+              <w:top w:val="single" w:sz="4" w:space="0" w:color="auto"/>
+            </w:tcBorders>
+            <w:vAlign w:val="center"/>
+          </w:tcPr>
+          <w:p>
+            <w:r>
+              <w:t>Implement member add endpoint</w:t>
+            </w:r>
+          </w:p>
+        </w:tc>
+        <w:tc>
+          <w:tcPr>
+            <w:tcW w:w="3390" w:type="dxa"/>
+            <w:tcBorders>
+              <w:top w:val="single" w:sz="4" w:space="0" w:color="auto"/>
+            </w:tcBorders>
+            <w:vAlign w:val="center"/>
+          </w:tcPr>
+          <w:p>
+            <w:r>
+              <w:t>The first controlled create path for members.</w:t>
+            </w:r>
+          </w:p>
+        </w:tc>
+        <w:tc>
+          <w:tcPr>
+            <w:tcW w:w="4545" w:type="dxa"/>
+            <w:tcBorders>
+              <w:top w:val="single" w:sz="4" w:space="0" w:color="auto"/>
+            </w:tcBorders>
+            <w:vAlign w:val="center"/>
+          </w:tcPr>
+          <w:p>
+            <w:pPr>
+              <w:pStyle w:val="ListParagraph"/>
+              <w:numPr>
+                <w:ilvl w:val="0"/>
+                <w:numId w:val="33"/>
+              </w:numPr>
+              <w:spacing w:after="0"/>
+            </w:pPr>
+            <w:r>
+              <w:t>POST member endpoint exists</w:t>
+            </w:r>
+          </w:p>
+          <w:p>
+            <w:pPr>
+              <w:pStyle w:val="ListParagraph"/>
+              <w:numPr>
+                <w:ilvl w:val="0"/>
+                <w:numId w:val="33"/>
+              </w:numPr>
+              <w:spacing w:after="0"/>
+            </w:pPr>
+            <w:r>
+              <w:t>request validation exists</w:t>
+            </w:r>
+          </w:p>
+          <w:p>
+            <w:pPr>
+              <w:pStyle w:val="ListParagraph"/>
+              <w:numPr>
+                <w:ilvl w:val="0"/>
+                <w:numId w:val="33"/>
+              </w:numPr>
+              <w:spacing w:after="0"/>
+            </w:pPr>
+            <w:r>
+              <w:t>new member receives current SystemId</w:t>
+            </w:r>
+          </w:p>
+          <w:p>
+            <w:pPr>
+              <w:pStyle w:val="ListParagraph"/>
+              <w:numPr>
+                <w:ilvl w:val="0"/>
+                <w:numId w:val="33"/>
+              </w:numPr>
+              <w:spacing w:after="0"/>
+            </w:pPr>
+            <w:r>
+              <w:t>new member cannot choose another SystemId</w:t>
+            </w:r>
+          </w:p>
+          <w:p>
+            <w:pPr>
+              <w:pStyle w:val="ListParagraph"/>
+              <w:numPr>
+                <w:ilvl w:val="0"/>
+                <w:numId w:val="33"/>
+              </w:numPr>
+              <w:spacing w:after="0"/>
+            </w:pPr>
+            <w:r>
+              <w:t>privacy bucket input is handled</w:t>
+            </w:r>
+          </w:p>
+          <w:p>
+            <w:pPr>
+              <w:pStyle w:val="ListParagraph"/>
+              <w:numPr>
+                <w:ilvl w:val="0"/>
+                <w:numId w:val="33"/>
+              </w:numPr>
+              <w:spacing w:after="0"/>
+            </w:pPr>
+            <w:r>
+              <w:t>minimal audit record is written</w:t>
+            </w:r>
+          </w:p>
+          <w:p>
+            <w:pPr>
+              <w:pStyle w:val="ListParagraph"/>
+              <w:numPr>
+                <w:ilvl w:val="0"/>
+                <w:numId w:val="33"/>
+              </w:numPr>
+              <w:spacing w:after="0"/>
+            </w:pPr>
+            <w:r>
+              <w:t>diagnostic trace includes the write path</w:t>
+            </w:r>
+          </w:p>
+          <w:p>
+            <w:pPr>
+              <w:pStyle w:val="ListParagraph"/>
+              <w:numPr>
+                <w:ilvl w:val="0"/>
+                <w:numId w:val="33"/>
+              </w:numPr>
+              <w:spacing w:after="0"/>
+            </w:pPr>
+            <w:r>
+              <w:t>new member can be read back through the system-scoped read path</w:t>
+            </w:r>
+          </w:p>
+          <w:p>
+            <w:pPr>
+              <w:pStyle w:val="ListParagraph"/>
+              <w:numPr>
+                <w:ilvl w:val="0"/>
+                <w:numId w:val="33"/>
+              </w:numPr>
+              <w:spacing w:after="0"/>
+            </w:pPr>
+            <w:r>
+              <w:t>/api/me behavior remains unchanged</w:t>
+            </w:r>
+          </w:p>
+        </w:tc>
+      </w:tr>
+      <w:tr>
+        <w:trPr>
+          <w:tblCellSpacing w:w="15" w:type="dxa"/>
+        </w:trPr>
+        <w:tc>
+          <w:tcPr>
+            <w:tcW w:w="810" w:type="dxa"/>
+            <w:tcBorders>
+              <w:top w:val="single" w:sz="4" w:space="0" w:color="auto"/>
+            </w:tcBorders>
+            <w:vAlign w:val="center"/>
+          </w:tcPr>
+          <w:p>
+            <w:r>
+              <w:t>7</w:t>
+            </w:r>
+          </w:p>
+        </w:tc>
+        <w:tc>
+          <w:tcPr>
+            <w:tcW w:w="1410" w:type="dxa"/>
+            <w:tcBorders>
+              <w:top w:val="single" w:sz="4" w:space="0" w:color="auto"/>
+            </w:tcBorders>
+            <w:vAlign w:val="center"/>
+          </w:tcPr>
+          <w:p>
+            <w:r>
+              <w:t>Implement member edit endpoint</w:t>
+            </w:r>
+          </w:p>
+        </w:tc>
+        <w:tc>
+          <w:tcPr>
+            <w:tcW w:w="3390" w:type="dxa"/>
+            <w:tcBorders>
+              <w:top w:val="single" w:sz="4" w:space="0" w:color="auto"/>
+            </w:tcBorders>
+            <w:vAlign w:val="center"/>
+          </w:tcPr>
+          <w:p>
+            <w:r>
+              <w:t>The first controlled update path for members.</w:t>
+            </w:r>
+          </w:p>
+        </w:tc>
+        <w:tc>
+          <w:tcPr>
+            <w:tcW w:w="4545" w:type="dxa"/>
+            <w:tcBorders>
+              <w:top w:val="single" w:sz="4" w:space="0" w:color="auto"/>
+            </w:tcBorders>
+            <w:vAlign w:val="center"/>
+          </w:tcPr>
+          <w:p>
+            <w:pPr>
+              <w:pStyle w:val="ListParagraph"/>
+              <w:numPr>
+                <w:ilvl w:val="0"/>
+                <w:numId w:val="34"/>
+              </w:numPr>
+              <w:spacing w:after="0"/>
+            </w:pPr>
+            <w:r>
+              <w:t>member edit endpoint exists</w:t>
+            </w:r>
+          </w:p>
+          <w:p>
+            <w:pPr>
+              <w:pStyle w:val="ListParagraph"/>
+              <w:numPr>
+                <w:ilvl w:val="0"/>
+                <w:numId w:val="34"/>
+              </w:numPr>
+              <w:spacing w:after="0"/>
+            </w:pPr>
+            <w:r>
+              <w:t>request validation exists</w:t>
+            </w:r>
+          </w:p>
+          <w:p>
+            <w:pPr>
+              <w:pStyle w:val="ListParagraph"/>
+              <w:numPr>
+                <w:ilvl w:val="0"/>
+                <w:numId w:val="34"/>
+              </w:numPr>
+              <w:spacing w:after="0"/>
+            </w:pPr>
+            <w:r>
+              <w:t>target member must belong to current SystemId</w:t>
+            </w:r>
+          </w:p>
+          <w:p>
+            <w:pPr>
+              <w:pStyle w:val="ListParagraph"/>
+              <w:numPr>
+                <w:ilvl w:val="0"/>
+                <w:numId w:val="34"/>
+              </w:numPr>
+              <w:spacing w:after="0"/>
+            </w:pPr>
+            <w:r>
+              <w:t>member from another SystemId cannot be edited</w:t>
+            </w:r>
+          </w:p>
+          <w:p>
+            <w:pPr>
+              <w:pStyle w:val="ListParagraph"/>
+              <w:numPr>
+                <w:ilvl w:val="0"/>
+                <w:numId w:val="34"/>
+              </w:numPr>
+              <w:spacing w:after="0"/>
+            </w:pPr>
+            <w:r>
+              <w:t>privacy bucket change is handled</w:t>
+            </w:r>
+          </w:p>
+          <w:p>
+            <w:pPr>
+              <w:pStyle w:val="ListParagraph"/>
+              <w:numPr>
+                <w:ilvl w:val="0"/>
+                <w:numId w:val="34"/>
+              </w:numPr>
+              <w:spacing w:after="0"/>
+            </w:pPr>
+            <w:r>
+              <w:t>minimal audit record is written</w:t>
+            </w:r>
+          </w:p>
+          <w:p>
+            <w:pPr>
+              <w:pStyle w:val="ListParagraph"/>
+              <w:numPr>
+                <w:ilvl w:val="0"/>
+                <w:numId w:val="34"/>
+              </w:numPr>
+              <w:spacing w:after="0"/>
+            </w:pPr>
+            <w:r>
+              <w:t>diagnostic trace includes the edit path</w:t>
+            </w:r>
+          </w:p>
+          <w:p>
+            <w:pPr>
+              <w:pStyle w:val="ListParagraph"/>
+              <w:numPr>
+                <w:ilvl w:val="0"/>
+                <w:numId w:val="34"/>
+              </w:numPr>
+              <w:spacing w:after="0"/>
+            </w:pPr>
+            <w:r>
+              <w:lastRenderedPageBreak/>
+              <w:t>edited member can be read back through the system-scoped read path</w:t>
+            </w:r>
+          </w:p>
+          <w:p>
+            <w:pPr>
+              <w:pStyle w:val="ListParagraph"/>
+              <w:numPr>
+                <w:ilvl w:val="0"/>
+                <w:numId w:val="34"/>
+              </w:numPr>
+              <w:spacing w:after="0"/>
+            </w:pPr>
+            <w:r>
+              <w:t>/api/me behavior remains unchanged</w:t>
+            </w:r>
+          </w:p>
+        </w:tc>
+      </w:tr>
+      <w:tr>
+        <w:trPr>
+          <w:tblCellSpacing w:w="15" w:type="dxa"/>
+        </w:trPr>
+        <w:tc>
+          <w:tcPr>
+            <w:tcW w:w="810" w:type="dxa"/>
+            <w:tcBorders>
+              <w:top w:val="single" w:sz="4" w:space="0" w:color="auto"/>
+            </w:tcBorders>
+            <w:vAlign w:val="center"/>
+          </w:tcPr>
+          <w:p>
+            <w:r>
+              <w:lastRenderedPageBreak/>
+              <w:t>8</w:t>
+            </w:r>
+          </w:p>
+        </w:tc>
+        <w:tc>
+          <w:tcPr>
+            <w:tcW w:w="1410" w:type="dxa"/>
+            <w:tcBorders>
+              <w:top w:val="single" w:sz="4" w:space="0" w:color="auto"/>
+            </w:tcBorders>
+            <w:vAlign w:val="center"/>
+          </w:tcPr>
+          <w:p>
+            <w:r>
+              <w:t>Add protected browser member add/edit path</w:t>
+            </w:r>
+          </w:p>
+        </w:tc>
+        <w:tc>
+          <w:tcPr>
+            <w:tcW w:w="3390" w:type="dxa"/>
+            <w:tcBorders>
+              <w:top w:val="single" w:sz="4" w:space="0" w:color="auto"/>
+            </w:tcBorders>
+            <w:vAlign w:val="center"/>
+          </w:tcPr>
+          <w:p>
+            <w:r>
+              <w:t>The first user-visible editable browser path.</w:t>
+            </w:r>
+          </w:p>
+        </w:tc>
+        <w:tc>
+          <w:tcPr>
+            <w:tcW w:w="4545" w:type="dxa"/>
+            <w:tcBorders>
+              <w:top w:val="single" w:sz="4" w:space="0" w:color="auto"/>
+            </w:tcBorders>
+            <w:vAlign w:val="center"/>
+          </w:tcPr>
+          <w:p>
+            <w:pPr>
+              <w:pStyle w:val="ListParagraph"/>
+              <w:numPr>
+                <w:ilvl w:val="0"/>
+                <w:numId w:val="35"/>
+              </w:numPr>
+              <w:spacing w:after="0"/>
+            </w:pPr>
+            <w:r>
+              <w:t>protected browser can read members</w:t>
+            </w:r>
+          </w:p>
+          <w:p>
+            <w:pPr>
+              <w:pStyle w:val="ListParagraph"/>
+              <w:numPr>
+                <w:ilvl w:val="0"/>
+                <w:numId w:val="35"/>
+              </w:numPr>
+              <w:spacing w:after="0"/>
+            </w:pPr>
+            <w:r>
+              <w:t>protected browser can add a member</w:t>
+            </w:r>
+          </w:p>
+          <w:p>
+            <w:pPr>
+              <w:pStyle w:val="ListParagraph"/>
+              <w:numPr>
+                <w:ilvl w:val="0"/>
+                <w:numId w:val="35"/>
+              </w:numPr>
+              <w:spacing w:after="0"/>
+            </w:pPr>
+            <w:r>
+              <w:t>protected browser can edit a member</w:t>
+            </w:r>
+          </w:p>
+          <w:p>
+            <w:pPr>
+              <w:pStyle w:val="ListParagraph"/>
+              <w:numPr>
+                <w:ilvl w:val="0"/>
+                <w:numId w:val="35"/>
+              </w:numPr>
+              <w:spacing w:after="0"/>
+            </w:pPr>
+            <w:r>
+              <w:t>browser path uses authenticated API calls</w:t>
+            </w:r>
+          </w:p>
+          <w:p>
+            <w:pPr>
+              <w:pStyle w:val="ListParagraph"/>
+              <w:numPr>
+                <w:ilvl w:val="0"/>
+                <w:numId w:val="35"/>
+              </w:numPr>
+              <w:spacing w:after="0"/>
+            </w:pPr>
+            <w:r>
+              <w:t>browser path shows validation errors</w:t>
+            </w:r>
+          </w:p>
+          <w:p>
+            <w:pPr>
+              <w:pStyle w:val="ListParagraph"/>
+              <w:numPr>
+                <w:ilvl w:val="0"/>
+                <w:numId w:val="35"/>
+              </w:numPr>
+              <w:spacing w:after="0"/>
+            </w:pPr>
+            <w:r>
+              <w:t>browser path shows successful save result</w:t>
+            </w:r>
+          </w:p>
+          <w:p>
+            <w:pPr>
+              <w:pStyle w:val="ListParagraph"/>
+              <w:numPr>
+                <w:ilvl w:val="0"/>
+                <w:numId w:val="35"/>
+              </w:numPr>
+              <w:spacing w:after="0"/>
+            </w:pPr>
+            <w:r>
+              <w:t>browser path does not expose raw unsafe write behavior</w:t>
+            </w:r>
+          </w:p>
+          <w:p>
+            <w:pPr>
+              <w:pStyle w:val="ListParagraph"/>
+              <w:numPr>
+                <w:ilvl w:val="0"/>
+                <w:numId w:val="35"/>
+              </w:numPr>
+              <w:spacing w:after="0"/>
+            </w:pPr>
+            <w:r>
+              <w:t>/api/me owner path remains unchanged</w:t>
+            </w:r>
+          </w:p>
+        </w:tc>
+      </w:tr>
+      <w:tr>
+        <w:trPr>
+          <w:tblCellSpacing w:w="15" w:type="dxa"/>
+        </w:trPr>
+        <w:tc>
+          <w:tcPr>
+            <w:tcW w:w="810" w:type="dxa"/>
+            <w:tcBorders>
+              <w:top w:val="single" w:sz="4" w:space="0" w:color="auto"/>
+            </w:tcBorders>
+            <w:vAlign w:val="center"/>
+          </w:tcPr>
+          <w:p>
+            <w:r>
+              <w:t>9</w:t>
+            </w:r>
+          </w:p>
+        </w:tc>
+        <w:tc>
+          <w:tcPr>
+            <w:tcW w:w="1410" w:type="dxa"/>
+            <w:tcBorders>
+              <w:top w:val="single" w:sz="4" w:space="0" w:color="auto"/>
+            </w:tcBorders>
+            <w:vAlign w:val="center"/>
+          </w:tcPr>
+          <w:p>
+            <w:r>
+              <w:t>Final Chapter 3 verification</w:t>
+            </w:r>
+          </w:p>
+        </w:tc>
+        <w:tc>
+          <w:tcPr>
+            <w:tcW w:w="3390" w:type="dxa"/>
+            <w:tcBorders>
+              <w:top w:val="single" w:sz="4" w:space="0" w:color="auto"/>
+            </w:tcBorders>
+            <w:vAlign w:val="center"/>
+          </w:tcPr>
+          <w:p>
+            <w:r>
+              <w:t>The Chapter 3 closeout gate.</w:t>
+            </w:r>
+          </w:p>
+        </w:tc>
+        <w:tc>
+          <w:tcPr>
+            <w:tcW w:w="4545" w:type="dxa"/>
+            <w:tcBorders>
+              <w:top w:val="single" w:sz="4" w:space="0" w:color="auto"/>
+            </w:tcBorders>
+            <w:vAlign w:val="center"/>
+          </w:tcPr>
+          <w:p>
+            <w:pPr>
+              <w:pStyle w:val="ListParagraph"/>
+              <w:numPr>
+                <w:ilvl w:val="0"/>
+                <w:numId w:val="36"/>
+              </w:numPr>
+              <w:spacing w:after="0"/>
+            </w:pPr>
+            <w:r>
+              <w:t>API solution builds</w:t>
+            </w:r>
+          </w:p>
+          <w:p>
+            <w:pPr>
+              <w:pStyle w:val="ListParagraph"/>
+              <w:numPr>
+                <w:ilvl w:val="0"/>
+                <w:numId w:val="36"/>
+              </w:numPr>
+              <w:spacing w:after="0"/>
+            </w:pPr>
+            <w:r>
+              <w:t>tests pass</w:t>
+            </w:r>
+          </w:p>
+          <w:p>
+            <w:pPr>
+              <w:pStyle w:val="ListParagraph"/>
+              <w:numPr>
+                <w:ilvl w:val="0"/>
+                <w:numId w:val="36"/>
+              </w:numPr>
+              <w:spacing w:after="0"/>
+            </w:pPr>
+            <w:r>
+              <w:t>protected login works</w:t>
+            </w:r>
+          </w:p>
+          <w:p>
+            <w:pPr>
+              <w:pStyle w:val="ListParagraph"/>
+              <w:numPr>
+                <w:ilvl w:val="0"/>
+                <w:numId w:val="36"/>
+              </w:numPr>
+              <w:spacing w:after="0"/>
+            </w:pPr>
+            <w:r>
+              <w:t>/api/me requires login when logged out</w:t>
+            </w:r>
+          </w:p>
+          <w:p>
+            <w:pPr>
+              <w:pStyle w:val="ListParagraph"/>
+              <w:numPr>
+                <w:ilvl w:val="0"/>
+                <w:numId w:val="36"/>
+              </w:numPr>
+              <w:spacing w:after="0"/>
+            </w:pPr>
+            <w:r>
+              <w:t>/api/me succeeds when logged in</w:t>
+            </w:r>
+          </w:p>
+          <w:p>
+            <w:pPr>
+              <w:pStyle w:val="ListParagraph"/>
+              <w:numPr>
+                <w:ilvl w:val="0"/>
+                <w:numId w:val="36"/>
+              </w:numPr>
+              <w:spacing w:after="0"/>
+            </w:pPr>
+            <w:r>
+              <w:t>member read returns expected scoped data</w:t>
+            </w:r>
+          </w:p>
+          <w:p>
+            <w:pPr>
+              <w:pStyle w:val="ListParagraph"/>
+              <w:numPr>
+                <w:ilvl w:val="0"/>
+                <w:numId w:val="36"/>
+              </w:numPr>
+              <w:spacing w:after="0"/>
+            </w:pPr>
+            <w:r>
+              <w:t>member add works</w:t>
+            </w:r>
+          </w:p>
+          <w:p>
+            <w:pPr>
+              <w:pStyle w:val="ListParagraph"/>
+              <w:numPr>
+                <w:ilvl w:val="0"/>
+                <w:numId w:val="36"/>
+              </w:numPr>
+              <w:spacing w:after="0"/>
+            </w:pPr>
+            <w:r>
+              <w:t>member edit works</w:t>
+            </w:r>
+          </w:p>
+          <w:p>
+            <w:pPr>
+              <w:pStyle w:val="ListParagraph"/>
+              <w:numPr>
+                <w:ilvl w:val="0"/>
+                <w:numId w:val="36"/>
+              </w:numPr>
+              <w:spacing w:after="0"/>
+            </w:pPr>
+            <w:r>
+              <w:t>minimal audit records exist for add/edit</w:t>
+            </w:r>
+          </w:p>
+          <w:p>
+            <w:pPr>
+              <w:pStyle w:val="ListParagraph"/>
+              <w:numPr>
+                <w:ilvl w:val="0"/>
+                <w:numId w:val="36"/>
+              </w:numPr>
+              <w:spacing w:after="0"/>
+            </w:pPr>
+            <w:r>
+              <w:t>SystemId enforcement is verified</w:t>
+            </w:r>
+          </w:p>
+          <w:p>
+            <w:pPr>
+              <w:pStyle w:val="ListParagraph"/>
+              <w:numPr>
+                <w:ilvl w:val="0"/>
+                <w:numId w:val="36"/>
+              </w:numPr>
+              <w:spacing w:after="0"/>
+            </w:pPr>
+            <w:r>
+              <w:t>Membership enforcement is verified</w:t>
+            </w:r>
+          </w:p>
+          <w:p>
+            <w:pPr>
+              <w:pStyle w:val="ListParagraph"/>
+              <w:numPr>
+                <w:ilvl w:val="0"/>
+                <w:numId w:val="36"/>
+              </w:numPr>
+              <w:spacing w:after="0"/>
+            </w:pPr>
+            <w:r>
+              <w:t>privacy bucket awareness is verified</w:t>
+            </w:r>
+          </w:p>
+          <w:p>
+            <w:pPr>
+              <w:pStyle w:val="ListParagraph"/>
+              <w:numPr>
+                <w:ilvl w:val="0"/>
+                <w:numId w:val="36"/>
+              </w:numPr>
+              <w:spacing w:after="0"/>
+            </w:pPr>
+            <w:r>
+              <w:t>diagnostic trace records read/add/edit path</w:t>
+            </w:r>
+          </w:p>
+          <w:p>
+            <w:pPr>
+              <w:pStyle w:val="ListParagraph"/>
+              <w:numPr>
+                <w:ilvl w:val="0"/>
+                <w:numId w:val="36"/>
+              </w:numPr>
+              <w:spacing w:after="0"/>
+            </w:pPr>
+            <w:r>
+              <w:t>Chapter 3 release tail is ready</w:t>
+            </w:r>
+          </w:p>
+          <w:p/>
+        </w:tc>
+      </w:tr>
+    </w:tbl>
+    <w:p/>
     <w:p>
       <w:r>
         <w:br w:type="page"/>
@@ -6376,6 +8234,232 @@
     </w:lvl>
   </w:abstractNum>
   <w:abstractNum w:abstractNumId="1" w15:restartNumberingAfterBreak="0">
+    <w:nsid w:val="06550A20"/>
+    <w:multiLevelType w:val="hybridMultilevel"/>
+    <w:tmpl w:val="18887482"/>
+    <w:lvl w:ilvl="0" w:tplc="04090001">
+      <w:start w:val="1"/>
+      <w:numFmt w:val="bullet"/>
+      <w:lvlText w:val=""/>
+      <w:lvlJc w:val="left"/>
+      <w:pPr>
+        <w:ind w:left="720" w:hanging="360"/>
+      </w:pPr>
+      <w:rPr>
+        <w:rFonts w:ascii="Symbol" w:hAnsi="Symbol" w:hint="default"/>
+      </w:rPr>
+    </w:lvl>
+    <w:lvl w:ilvl="1" w:tplc="04090003" w:tentative="1">
+      <w:start w:val="1"/>
+      <w:numFmt w:val="bullet"/>
+      <w:lvlText w:val="o"/>
+      <w:lvlJc w:val="left"/>
+      <w:pPr>
+        <w:ind w:left="1440" w:hanging="360"/>
+      </w:pPr>
+      <w:rPr>
+        <w:rFonts w:ascii="Courier New" w:hAnsi="Courier New" w:cs="Courier New" w:hint="default"/>
+      </w:rPr>
+    </w:lvl>
+    <w:lvl w:ilvl="2" w:tplc="04090005" w:tentative="1">
+      <w:start w:val="1"/>
+      <w:numFmt w:val="bullet"/>
+      <w:lvlText w:val=""/>
+      <w:lvlJc w:val="left"/>
+      <w:pPr>
+        <w:ind w:left="2160" w:hanging="360"/>
+      </w:pPr>
+      <w:rPr>
+        <w:rFonts w:ascii="Wingdings" w:hAnsi="Wingdings" w:hint="default"/>
+      </w:rPr>
+    </w:lvl>
+    <w:lvl w:ilvl="3" w:tplc="04090001" w:tentative="1">
+      <w:start w:val="1"/>
+      <w:numFmt w:val="bullet"/>
+      <w:lvlText w:val=""/>
+      <w:lvlJc w:val="left"/>
+      <w:pPr>
+        <w:ind w:left="2880" w:hanging="360"/>
+      </w:pPr>
+      <w:rPr>
+        <w:rFonts w:ascii="Symbol" w:hAnsi="Symbol" w:hint="default"/>
+      </w:rPr>
+    </w:lvl>
+    <w:lvl w:ilvl="4" w:tplc="04090003" w:tentative="1">
+      <w:start w:val="1"/>
+      <w:numFmt w:val="bullet"/>
+      <w:lvlText w:val="o"/>
+      <w:lvlJc w:val="left"/>
+      <w:pPr>
+        <w:ind w:left="3600" w:hanging="360"/>
+      </w:pPr>
+      <w:rPr>
+        <w:rFonts w:ascii="Courier New" w:hAnsi="Courier New" w:cs="Courier New" w:hint="default"/>
+      </w:rPr>
+    </w:lvl>
+    <w:lvl w:ilvl="5" w:tplc="04090005" w:tentative="1">
+      <w:start w:val="1"/>
+      <w:numFmt w:val="bullet"/>
+      <w:lvlText w:val=""/>
+      <w:lvlJc w:val="left"/>
+      <w:pPr>
+        <w:ind w:left="4320" w:hanging="360"/>
+      </w:pPr>
+      <w:rPr>
+        <w:rFonts w:ascii="Wingdings" w:hAnsi="Wingdings" w:hint="default"/>
+      </w:rPr>
+    </w:lvl>
+    <w:lvl w:ilvl="6" w:tplc="04090001" w:tentative="1">
+      <w:start w:val="1"/>
+      <w:numFmt w:val="bullet"/>
+      <w:lvlText w:val=""/>
+      <w:lvlJc w:val="left"/>
+      <w:pPr>
+        <w:ind w:left="5040" w:hanging="360"/>
+      </w:pPr>
+      <w:rPr>
+        <w:rFonts w:ascii="Symbol" w:hAnsi="Symbol" w:hint="default"/>
+      </w:rPr>
+    </w:lvl>
+    <w:lvl w:ilvl="7" w:tplc="04090003" w:tentative="1">
+      <w:start w:val="1"/>
+      <w:numFmt w:val="bullet"/>
+      <w:lvlText w:val="o"/>
+      <w:lvlJc w:val="left"/>
+      <w:pPr>
+        <w:ind w:left="5760" w:hanging="360"/>
+      </w:pPr>
+      <w:rPr>
+        <w:rFonts w:ascii="Courier New" w:hAnsi="Courier New" w:cs="Courier New" w:hint="default"/>
+      </w:rPr>
+    </w:lvl>
+    <w:lvl w:ilvl="8" w:tplc="04090005" w:tentative="1">
+      <w:start w:val="1"/>
+      <w:numFmt w:val="bullet"/>
+      <w:lvlText w:val=""/>
+      <w:lvlJc w:val="left"/>
+      <w:pPr>
+        <w:ind w:left="6480" w:hanging="360"/>
+      </w:pPr>
+      <w:rPr>
+        <w:rFonts w:ascii="Wingdings" w:hAnsi="Wingdings" w:hint="default"/>
+      </w:rPr>
+    </w:lvl>
+  </w:abstractNum>
+  <w:abstractNum w:abstractNumId="2" w15:restartNumberingAfterBreak="0">
+    <w:nsid w:val="06CD1CB3"/>
+    <w:multiLevelType w:val="hybridMultilevel"/>
+    <w:tmpl w:val="53E8532E"/>
+    <w:lvl w:ilvl="0" w:tplc="04090001">
+      <w:start w:val="1"/>
+      <w:numFmt w:val="bullet"/>
+      <w:lvlText w:val=""/>
+      <w:lvlJc w:val="left"/>
+      <w:pPr>
+        <w:ind w:left="720" w:hanging="360"/>
+      </w:pPr>
+      <w:rPr>
+        <w:rFonts w:ascii="Symbol" w:hAnsi="Symbol" w:hint="default"/>
+      </w:rPr>
+    </w:lvl>
+    <w:lvl w:ilvl="1" w:tplc="04090003" w:tentative="1">
+      <w:start w:val="1"/>
+      <w:numFmt w:val="bullet"/>
+      <w:lvlText w:val="o"/>
+      <w:lvlJc w:val="left"/>
+      <w:pPr>
+        <w:ind w:left="1440" w:hanging="360"/>
+      </w:pPr>
+      <w:rPr>
+        <w:rFonts w:ascii="Courier New" w:hAnsi="Courier New" w:cs="Courier New" w:hint="default"/>
+      </w:rPr>
+    </w:lvl>
+    <w:lvl w:ilvl="2" w:tplc="04090005" w:tentative="1">
+      <w:start w:val="1"/>
+      <w:numFmt w:val="bullet"/>
+      <w:lvlText w:val=""/>
+      <w:lvlJc w:val="left"/>
+      <w:pPr>
+        <w:ind w:left="2160" w:hanging="360"/>
+      </w:pPr>
+      <w:rPr>
+        <w:rFonts w:ascii="Wingdings" w:hAnsi="Wingdings" w:hint="default"/>
+      </w:rPr>
+    </w:lvl>
+    <w:lvl w:ilvl="3" w:tplc="04090001" w:tentative="1">
+      <w:start w:val="1"/>
+      <w:numFmt w:val="bullet"/>
+      <w:lvlText w:val=""/>
+      <w:lvlJc w:val="left"/>
+      <w:pPr>
+        <w:ind w:left="2880" w:hanging="360"/>
+      </w:pPr>
+      <w:rPr>
+        <w:rFonts w:ascii="Symbol" w:hAnsi="Symbol" w:hint="default"/>
+      </w:rPr>
+    </w:lvl>
+    <w:lvl w:ilvl="4" w:tplc="04090003" w:tentative="1">
+      <w:start w:val="1"/>
+      <w:numFmt w:val="bullet"/>
+      <w:lvlText w:val="o"/>
+      <w:lvlJc w:val="left"/>
+      <w:pPr>
+        <w:ind w:left="3600" w:hanging="360"/>
+      </w:pPr>
+      <w:rPr>
+        <w:rFonts w:ascii="Courier New" w:hAnsi="Courier New" w:cs="Courier New" w:hint="default"/>
+      </w:rPr>
+    </w:lvl>
+    <w:lvl w:ilvl="5" w:tplc="04090005" w:tentative="1">
+      <w:start w:val="1"/>
+      <w:numFmt w:val="bullet"/>
+      <w:lvlText w:val=""/>
+      <w:lvlJc w:val="left"/>
+      <w:pPr>
+        <w:ind w:left="4320" w:hanging="360"/>
+      </w:pPr>
+      <w:rPr>
+        <w:rFonts w:ascii="Wingdings" w:hAnsi="Wingdings" w:hint="default"/>
+      </w:rPr>
+    </w:lvl>
+    <w:lvl w:ilvl="6" w:tplc="04090001" w:tentative="1">
+      <w:start w:val="1"/>
+      <w:numFmt w:val="bullet"/>
+      <w:lvlText w:val=""/>
+      <w:lvlJc w:val="left"/>
+      <w:pPr>
+        <w:ind w:left="5040" w:hanging="360"/>
+      </w:pPr>
+      <w:rPr>
+        <w:rFonts w:ascii="Symbol" w:hAnsi="Symbol" w:hint="default"/>
+      </w:rPr>
+    </w:lvl>
+    <w:lvl w:ilvl="7" w:tplc="04090003" w:tentative="1">
+      <w:start w:val="1"/>
+      <w:numFmt w:val="bullet"/>
+      <w:lvlText w:val="o"/>
+      <w:lvlJc w:val="left"/>
+      <w:pPr>
+        <w:ind w:left="5760" w:hanging="360"/>
+      </w:pPr>
+      <w:rPr>
+        <w:rFonts w:ascii="Courier New" w:hAnsi="Courier New" w:cs="Courier New" w:hint="default"/>
+      </w:rPr>
+    </w:lvl>
+    <w:lvl w:ilvl="8" w:tplc="04090005" w:tentative="1">
+      <w:start w:val="1"/>
+      <w:numFmt w:val="bullet"/>
+      <w:lvlText w:val=""/>
+      <w:lvlJc w:val="left"/>
+      <w:pPr>
+        <w:ind w:left="6480" w:hanging="360"/>
+      </w:pPr>
+      <w:rPr>
+        <w:rFonts w:ascii="Wingdings" w:hAnsi="Wingdings" w:hint="default"/>
+      </w:rPr>
+    </w:lvl>
+  </w:abstractNum>
+  <w:abstractNum w:abstractNumId="3" w15:restartNumberingAfterBreak="0">
     <w:nsid w:val="09884ABF"/>
     <w:multiLevelType w:val="hybridMultilevel"/>
     <w:tmpl w:val="6C404F90"/>
@@ -6488,7 +8572,7 @@
       </w:rPr>
     </w:lvl>
   </w:abstractNum>
-  <w:abstractNum w:abstractNumId="2" w15:restartNumberingAfterBreak="0">
+  <w:abstractNum w:abstractNumId="4" w15:restartNumberingAfterBreak="0">
     <w:nsid w:val="09D30550"/>
     <w:multiLevelType w:val="hybridMultilevel"/>
     <w:tmpl w:val="16B6B898"/>
@@ -6601,7 +8685,7 @@
       </w:rPr>
     </w:lvl>
   </w:abstractNum>
-  <w:abstractNum w:abstractNumId="3" w15:restartNumberingAfterBreak="0">
+  <w:abstractNum w:abstractNumId="5" w15:restartNumberingAfterBreak="0">
     <w:nsid w:val="0F90348E"/>
     <w:multiLevelType w:val="hybridMultilevel"/>
     <w:tmpl w:val="C07031FC"/>
@@ -6714,7 +8798,120 @@
       </w:rPr>
     </w:lvl>
   </w:abstractNum>
-  <w:abstractNum w:abstractNumId="4" w15:restartNumberingAfterBreak="0">
+  <w:abstractNum w:abstractNumId="6" w15:restartNumberingAfterBreak="0">
+    <w:nsid w:val="11F63F13"/>
+    <w:multiLevelType w:val="hybridMultilevel"/>
+    <w:tmpl w:val="F398A0FC"/>
+    <w:lvl w:ilvl="0" w:tplc="04090001">
+      <w:start w:val="1"/>
+      <w:numFmt w:val="bullet"/>
+      <w:lvlText w:val=""/>
+      <w:lvlJc w:val="left"/>
+      <w:pPr>
+        <w:ind w:left="720" w:hanging="360"/>
+      </w:pPr>
+      <w:rPr>
+        <w:rFonts w:ascii="Symbol" w:hAnsi="Symbol" w:hint="default"/>
+      </w:rPr>
+    </w:lvl>
+    <w:lvl w:ilvl="1" w:tplc="04090003" w:tentative="1">
+      <w:start w:val="1"/>
+      <w:numFmt w:val="bullet"/>
+      <w:lvlText w:val="o"/>
+      <w:lvlJc w:val="left"/>
+      <w:pPr>
+        <w:ind w:left="1440" w:hanging="360"/>
+      </w:pPr>
+      <w:rPr>
+        <w:rFonts w:ascii="Courier New" w:hAnsi="Courier New" w:cs="Courier New" w:hint="default"/>
+      </w:rPr>
+    </w:lvl>
+    <w:lvl w:ilvl="2" w:tplc="04090005" w:tentative="1">
+      <w:start w:val="1"/>
+      <w:numFmt w:val="bullet"/>
+      <w:lvlText w:val=""/>
+      <w:lvlJc w:val="left"/>
+      <w:pPr>
+        <w:ind w:left="2160" w:hanging="360"/>
+      </w:pPr>
+      <w:rPr>
+        <w:rFonts w:ascii="Wingdings" w:hAnsi="Wingdings" w:hint="default"/>
+      </w:rPr>
+    </w:lvl>
+    <w:lvl w:ilvl="3" w:tplc="04090001" w:tentative="1">
+      <w:start w:val="1"/>
+      <w:numFmt w:val="bullet"/>
+      <w:lvlText w:val=""/>
+      <w:lvlJc w:val="left"/>
+      <w:pPr>
+        <w:ind w:left="2880" w:hanging="360"/>
+      </w:pPr>
+      <w:rPr>
+        <w:rFonts w:ascii="Symbol" w:hAnsi="Symbol" w:hint="default"/>
+      </w:rPr>
+    </w:lvl>
+    <w:lvl w:ilvl="4" w:tplc="04090003" w:tentative="1">
+      <w:start w:val="1"/>
+      <w:numFmt w:val="bullet"/>
+      <w:lvlText w:val="o"/>
+      <w:lvlJc w:val="left"/>
+      <w:pPr>
+        <w:ind w:left="3600" w:hanging="360"/>
+      </w:pPr>
+      <w:rPr>
+        <w:rFonts w:ascii="Courier New" w:hAnsi="Courier New" w:cs="Courier New" w:hint="default"/>
+      </w:rPr>
+    </w:lvl>
+    <w:lvl w:ilvl="5" w:tplc="04090005" w:tentative="1">
+      <w:start w:val="1"/>
+      <w:numFmt w:val="bullet"/>
+      <w:lvlText w:val=""/>
+      <w:lvlJc w:val="left"/>
+      <w:pPr>
+        <w:ind w:left="4320" w:hanging="360"/>
+      </w:pPr>
+      <w:rPr>
+        <w:rFonts w:ascii="Wingdings" w:hAnsi="Wingdings" w:hint="default"/>
+      </w:rPr>
+    </w:lvl>
+    <w:lvl w:ilvl="6" w:tplc="04090001" w:tentative="1">
+      <w:start w:val="1"/>
+      <w:numFmt w:val="bullet"/>
+      <w:lvlText w:val=""/>
+      <w:lvlJc w:val="left"/>
+      <w:pPr>
+        <w:ind w:left="5040" w:hanging="360"/>
+      </w:pPr>
+      <w:rPr>
+        <w:rFonts w:ascii="Symbol" w:hAnsi="Symbol" w:hint="default"/>
+      </w:rPr>
+    </w:lvl>
+    <w:lvl w:ilvl="7" w:tplc="04090003" w:tentative="1">
+      <w:start w:val="1"/>
+      <w:numFmt w:val="bullet"/>
+      <w:lvlText w:val="o"/>
+      <w:lvlJc w:val="left"/>
+      <w:pPr>
+        <w:ind w:left="5760" w:hanging="360"/>
+      </w:pPr>
+      <w:rPr>
+        <w:rFonts w:ascii="Courier New" w:hAnsi="Courier New" w:cs="Courier New" w:hint="default"/>
+      </w:rPr>
+    </w:lvl>
+    <w:lvl w:ilvl="8" w:tplc="04090005" w:tentative="1">
+      <w:start w:val="1"/>
+      <w:numFmt w:val="bullet"/>
+      <w:lvlText w:val=""/>
+      <w:lvlJc w:val="left"/>
+      <w:pPr>
+        <w:ind w:left="6480" w:hanging="360"/>
+      </w:pPr>
+      <w:rPr>
+        <w:rFonts w:ascii="Wingdings" w:hAnsi="Wingdings" w:hint="default"/>
+      </w:rPr>
+    </w:lvl>
+  </w:abstractNum>
+  <w:abstractNum w:abstractNumId="7" w15:restartNumberingAfterBreak="0">
     <w:nsid w:val="1ACA5B3D"/>
     <w:multiLevelType w:val="hybridMultilevel"/>
     <w:tmpl w:val="0F2A05DC"/>
@@ -6800,7 +8997,120 @@
       </w:pPr>
     </w:lvl>
   </w:abstractNum>
-  <w:abstractNum w:abstractNumId="5" w15:restartNumberingAfterBreak="0">
+  <w:abstractNum w:abstractNumId="8" w15:restartNumberingAfterBreak="0">
+    <w:nsid w:val="22820787"/>
+    <w:multiLevelType w:val="hybridMultilevel"/>
+    <w:tmpl w:val="0010B684"/>
+    <w:lvl w:ilvl="0" w:tplc="04090001">
+      <w:start w:val="1"/>
+      <w:numFmt w:val="bullet"/>
+      <w:lvlText w:val=""/>
+      <w:lvlJc w:val="left"/>
+      <w:pPr>
+        <w:ind w:left="720" w:hanging="360"/>
+      </w:pPr>
+      <w:rPr>
+        <w:rFonts w:ascii="Symbol" w:hAnsi="Symbol" w:hint="default"/>
+      </w:rPr>
+    </w:lvl>
+    <w:lvl w:ilvl="1" w:tplc="04090003" w:tentative="1">
+      <w:start w:val="1"/>
+      <w:numFmt w:val="bullet"/>
+      <w:lvlText w:val="o"/>
+      <w:lvlJc w:val="left"/>
+      <w:pPr>
+        <w:ind w:left="1440" w:hanging="360"/>
+      </w:pPr>
+      <w:rPr>
+        <w:rFonts w:ascii="Courier New" w:hAnsi="Courier New" w:cs="Courier New" w:hint="default"/>
+      </w:rPr>
+    </w:lvl>
+    <w:lvl w:ilvl="2" w:tplc="04090005" w:tentative="1">
+      <w:start w:val="1"/>
+      <w:numFmt w:val="bullet"/>
+      <w:lvlText w:val=""/>
+      <w:lvlJc w:val="left"/>
+      <w:pPr>
+        <w:ind w:left="2160" w:hanging="360"/>
+      </w:pPr>
+      <w:rPr>
+        <w:rFonts w:ascii="Wingdings" w:hAnsi="Wingdings" w:hint="default"/>
+      </w:rPr>
+    </w:lvl>
+    <w:lvl w:ilvl="3" w:tplc="04090001" w:tentative="1">
+      <w:start w:val="1"/>
+      <w:numFmt w:val="bullet"/>
+      <w:lvlText w:val=""/>
+      <w:lvlJc w:val="left"/>
+      <w:pPr>
+        <w:ind w:left="2880" w:hanging="360"/>
+      </w:pPr>
+      <w:rPr>
+        <w:rFonts w:ascii="Symbol" w:hAnsi="Symbol" w:hint="default"/>
+      </w:rPr>
+    </w:lvl>
+    <w:lvl w:ilvl="4" w:tplc="04090003" w:tentative="1">
+      <w:start w:val="1"/>
+      <w:numFmt w:val="bullet"/>
+      <w:lvlText w:val="o"/>
+      <w:lvlJc w:val="left"/>
+      <w:pPr>
+        <w:ind w:left="3600" w:hanging="360"/>
+      </w:pPr>
+      <w:rPr>
+        <w:rFonts w:ascii="Courier New" w:hAnsi="Courier New" w:cs="Courier New" w:hint="default"/>
+      </w:rPr>
+    </w:lvl>
+    <w:lvl w:ilvl="5" w:tplc="04090005" w:tentative="1">
+      <w:start w:val="1"/>
+      <w:numFmt w:val="bullet"/>
+      <w:lvlText w:val=""/>
+      <w:lvlJc w:val="left"/>
+      <w:pPr>
+        <w:ind w:left="4320" w:hanging="360"/>
+      </w:pPr>
+      <w:rPr>
+        <w:rFonts w:ascii="Wingdings" w:hAnsi="Wingdings" w:hint="default"/>
+      </w:rPr>
+    </w:lvl>
+    <w:lvl w:ilvl="6" w:tplc="04090001" w:tentative="1">
+      <w:start w:val="1"/>
+      <w:numFmt w:val="bullet"/>
+      <w:lvlText w:val=""/>
+      <w:lvlJc w:val="left"/>
+      <w:pPr>
+        <w:ind w:left="5040" w:hanging="360"/>
+      </w:pPr>
+      <w:rPr>
+        <w:rFonts w:ascii="Symbol" w:hAnsi="Symbol" w:hint="default"/>
+      </w:rPr>
+    </w:lvl>
+    <w:lvl w:ilvl="7" w:tplc="04090003" w:tentative="1">
+      <w:start w:val="1"/>
+      <w:numFmt w:val="bullet"/>
+      <w:lvlText w:val="o"/>
+      <w:lvlJc w:val="left"/>
+      <w:pPr>
+        <w:ind w:left="5760" w:hanging="360"/>
+      </w:pPr>
+      <w:rPr>
+        <w:rFonts w:ascii="Courier New" w:hAnsi="Courier New" w:cs="Courier New" w:hint="default"/>
+      </w:rPr>
+    </w:lvl>
+    <w:lvl w:ilvl="8" w:tplc="04090005" w:tentative="1">
+      <w:start w:val="1"/>
+      <w:numFmt w:val="bullet"/>
+      <w:lvlText w:val=""/>
+      <w:lvlJc w:val="left"/>
+      <w:pPr>
+        <w:ind w:left="6480" w:hanging="360"/>
+      </w:pPr>
+      <w:rPr>
+        <w:rFonts w:ascii="Wingdings" w:hAnsi="Wingdings" w:hint="default"/>
+      </w:rPr>
+    </w:lvl>
+  </w:abstractNum>
+  <w:abstractNum w:abstractNumId="9" w15:restartNumberingAfterBreak="0">
     <w:nsid w:val="23BC27A0"/>
     <w:multiLevelType w:val="hybridMultilevel"/>
     <w:tmpl w:val="B0485EE2"/>
@@ -6886,7 +9196,7 @@
       </w:pPr>
     </w:lvl>
   </w:abstractNum>
-  <w:abstractNum w:abstractNumId="6" w15:restartNumberingAfterBreak="0">
+  <w:abstractNum w:abstractNumId="10" w15:restartNumberingAfterBreak="0">
     <w:nsid w:val="27D37935"/>
     <w:multiLevelType w:val="hybridMultilevel"/>
     <w:tmpl w:val="67885FF4"/>
@@ -6999,7 +9309,7 @@
       </w:rPr>
     </w:lvl>
   </w:abstractNum>
-  <w:abstractNum w:abstractNumId="7" w15:restartNumberingAfterBreak="0">
+  <w:abstractNum w:abstractNumId="11" w15:restartNumberingAfterBreak="0">
     <w:nsid w:val="2B16309C"/>
     <w:multiLevelType w:val="hybridMultilevel"/>
     <w:tmpl w:val="3D8C7844"/>
@@ -7112,7 +9422,7 @@
       </w:rPr>
     </w:lvl>
   </w:abstractNum>
-  <w:abstractNum w:abstractNumId="8" w15:restartNumberingAfterBreak="0">
+  <w:abstractNum w:abstractNumId="12" w15:restartNumberingAfterBreak="0">
     <w:nsid w:val="2D887D5F"/>
     <w:multiLevelType w:val="hybridMultilevel"/>
     <w:tmpl w:val="CF00E6F8"/>
@@ -7225,7 +9535,7 @@
       </w:rPr>
     </w:lvl>
   </w:abstractNum>
-  <w:abstractNum w:abstractNumId="9" w15:restartNumberingAfterBreak="0">
+  <w:abstractNum w:abstractNumId="13" w15:restartNumberingAfterBreak="0">
     <w:nsid w:val="343F2150"/>
     <w:multiLevelType w:val="hybridMultilevel"/>
     <w:tmpl w:val="6CBE3A94"/>
@@ -7338,7 +9648,7 @@
       </w:rPr>
     </w:lvl>
   </w:abstractNum>
-  <w:abstractNum w:abstractNumId="10" w15:restartNumberingAfterBreak="0">
+  <w:abstractNum w:abstractNumId="14" w15:restartNumberingAfterBreak="0">
     <w:nsid w:val="35AF3907"/>
     <w:multiLevelType w:val="hybridMultilevel"/>
     <w:tmpl w:val="219A72A6"/>
@@ -7451,7 +9761,7 @@
       </w:rPr>
     </w:lvl>
   </w:abstractNum>
-  <w:abstractNum w:abstractNumId="11" w15:restartNumberingAfterBreak="0">
+  <w:abstractNum w:abstractNumId="15" w15:restartNumberingAfterBreak="0">
     <w:nsid w:val="36657A01"/>
     <w:multiLevelType w:val="hybridMultilevel"/>
     <w:tmpl w:val="9CBC721A"/>
@@ -7537,7 +9847,120 @@
       </w:pPr>
     </w:lvl>
   </w:abstractNum>
-  <w:abstractNum w:abstractNumId="12" w15:restartNumberingAfterBreak="0">
+  <w:abstractNum w:abstractNumId="16" w15:restartNumberingAfterBreak="0">
+    <w:nsid w:val="39B51442"/>
+    <w:multiLevelType w:val="hybridMultilevel"/>
+    <w:tmpl w:val="AD9E2E62"/>
+    <w:lvl w:ilvl="0" w:tplc="04090001">
+      <w:start w:val="1"/>
+      <w:numFmt w:val="bullet"/>
+      <w:lvlText w:val=""/>
+      <w:lvlJc w:val="left"/>
+      <w:pPr>
+        <w:ind w:left="720" w:hanging="360"/>
+      </w:pPr>
+      <w:rPr>
+        <w:rFonts w:ascii="Symbol" w:hAnsi="Symbol" w:hint="default"/>
+      </w:rPr>
+    </w:lvl>
+    <w:lvl w:ilvl="1" w:tplc="04090003" w:tentative="1">
+      <w:start w:val="1"/>
+      <w:numFmt w:val="bullet"/>
+      <w:lvlText w:val="o"/>
+      <w:lvlJc w:val="left"/>
+      <w:pPr>
+        <w:ind w:left="1440" w:hanging="360"/>
+      </w:pPr>
+      <w:rPr>
+        <w:rFonts w:ascii="Courier New" w:hAnsi="Courier New" w:cs="Courier New" w:hint="default"/>
+      </w:rPr>
+    </w:lvl>
+    <w:lvl w:ilvl="2" w:tplc="04090005" w:tentative="1">
+      <w:start w:val="1"/>
+      <w:numFmt w:val="bullet"/>
+      <w:lvlText w:val=""/>
+      <w:lvlJc w:val="left"/>
+      <w:pPr>
+        <w:ind w:left="2160" w:hanging="360"/>
+      </w:pPr>
+      <w:rPr>
+        <w:rFonts w:ascii="Wingdings" w:hAnsi="Wingdings" w:hint="default"/>
+      </w:rPr>
+    </w:lvl>
+    <w:lvl w:ilvl="3" w:tplc="04090001" w:tentative="1">
+      <w:start w:val="1"/>
+      <w:numFmt w:val="bullet"/>
+      <w:lvlText w:val=""/>
+      <w:lvlJc w:val="left"/>
+      <w:pPr>
+        <w:ind w:left="2880" w:hanging="360"/>
+      </w:pPr>
+      <w:rPr>
+        <w:rFonts w:ascii="Symbol" w:hAnsi="Symbol" w:hint="default"/>
+      </w:rPr>
+    </w:lvl>
+    <w:lvl w:ilvl="4" w:tplc="04090003" w:tentative="1">
+      <w:start w:val="1"/>
+      <w:numFmt w:val="bullet"/>
+      <w:lvlText w:val="o"/>
+      <w:lvlJc w:val="left"/>
+      <w:pPr>
+        <w:ind w:left="3600" w:hanging="360"/>
+      </w:pPr>
+      <w:rPr>
+        <w:rFonts w:ascii="Courier New" w:hAnsi="Courier New" w:cs="Courier New" w:hint="default"/>
+      </w:rPr>
+    </w:lvl>
+    <w:lvl w:ilvl="5" w:tplc="04090005" w:tentative="1">
+      <w:start w:val="1"/>
+      <w:numFmt w:val="bullet"/>
+      <w:lvlText w:val=""/>
+      <w:lvlJc w:val="left"/>
+      <w:pPr>
+        <w:ind w:left="4320" w:hanging="360"/>
+      </w:pPr>
+      <w:rPr>
+        <w:rFonts w:ascii="Wingdings" w:hAnsi="Wingdings" w:hint="default"/>
+      </w:rPr>
+    </w:lvl>
+    <w:lvl w:ilvl="6" w:tplc="04090001" w:tentative="1">
+      <w:start w:val="1"/>
+      <w:numFmt w:val="bullet"/>
+      <w:lvlText w:val=""/>
+      <w:lvlJc w:val="left"/>
+      <w:pPr>
+        <w:ind w:left="5040" w:hanging="360"/>
+      </w:pPr>
+      <w:rPr>
+        <w:rFonts w:ascii="Symbol" w:hAnsi="Symbol" w:hint="default"/>
+      </w:rPr>
+    </w:lvl>
+    <w:lvl w:ilvl="7" w:tplc="04090003" w:tentative="1">
+      <w:start w:val="1"/>
+      <w:numFmt w:val="bullet"/>
+      <w:lvlText w:val="o"/>
+      <w:lvlJc w:val="left"/>
+      <w:pPr>
+        <w:ind w:left="5760" w:hanging="360"/>
+      </w:pPr>
+      <w:rPr>
+        <w:rFonts w:ascii="Courier New" w:hAnsi="Courier New" w:cs="Courier New" w:hint="default"/>
+      </w:rPr>
+    </w:lvl>
+    <w:lvl w:ilvl="8" w:tplc="04090005" w:tentative="1">
+      <w:start w:val="1"/>
+      <w:numFmt w:val="bullet"/>
+      <w:lvlText w:val=""/>
+      <w:lvlJc w:val="left"/>
+      <w:pPr>
+        <w:ind w:left="6480" w:hanging="360"/>
+      </w:pPr>
+      <w:rPr>
+        <w:rFonts w:ascii="Wingdings" w:hAnsi="Wingdings" w:hint="default"/>
+      </w:rPr>
+    </w:lvl>
+  </w:abstractNum>
+  <w:abstractNum w:abstractNumId="17" w15:restartNumberingAfterBreak="0">
     <w:nsid w:val="409E2D02"/>
     <w:multiLevelType w:val="hybridMultilevel"/>
     <w:tmpl w:val="B942CD3C"/>
@@ -7650,7 +10073,233 @@
       </w:rPr>
     </w:lvl>
   </w:abstractNum>
-  <w:abstractNum w:abstractNumId="13" w15:restartNumberingAfterBreak="0">
+  <w:abstractNum w:abstractNumId="18" w15:restartNumberingAfterBreak="0">
+    <w:nsid w:val="41440DF4"/>
+    <w:multiLevelType w:val="hybridMultilevel"/>
+    <w:tmpl w:val="EB2EFC28"/>
+    <w:lvl w:ilvl="0" w:tplc="04090001">
+      <w:start w:val="1"/>
+      <w:numFmt w:val="bullet"/>
+      <w:lvlText w:val=""/>
+      <w:lvlJc w:val="left"/>
+      <w:pPr>
+        <w:ind w:left="720" w:hanging="360"/>
+      </w:pPr>
+      <w:rPr>
+        <w:rFonts w:ascii="Symbol" w:hAnsi="Symbol" w:hint="default"/>
+      </w:rPr>
+    </w:lvl>
+    <w:lvl w:ilvl="1" w:tplc="04090003" w:tentative="1">
+      <w:start w:val="1"/>
+      <w:numFmt w:val="bullet"/>
+      <w:lvlText w:val="o"/>
+      <w:lvlJc w:val="left"/>
+      <w:pPr>
+        <w:ind w:left="1440" w:hanging="360"/>
+      </w:pPr>
+      <w:rPr>
+        <w:rFonts w:ascii="Courier New" w:hAnsi="Courier New" w:cs="Courier New" w:hint="default"/>
+      </w:rPr>
+    </w:lvl>
+    <w:lvl w:ilvl="2" w:tplc="04090005" w:tentative="1">
+      <w:start w:val="1"/>
+      <w:numFmt w:val="bullet"/>
+      <w:lvlText w:val=""/>
+      <w:lvlJc w:val="left"/>
+      <w:pPr>
+        <w:ind w:left="2160" w:hanging="360"/>
+      </w:pPr>
+      <w:rPr>
+        <w:rFonts w:ascii="Wingdings" w:hAnsi="Wingdings" w:hint="default"/>
+      </w:rPr>
+    </w:lvl>
+    <w:lvl w:ilvl="3" w:tplc="04090001" w:tentative="1">
+      <w:start w:val="1"/>
+      <w:numFmt w:val="bullet"/>
+      <w:lvlText w:val=""/>
+      <w:lvlJc w:val="left"/>
+      <w:pPr>
+        <w:ind w:left="2880" w:hanging="360"/>
+      </w:pPr>
+      <w:rPr>
+        <w:rFonts w:ascii="Symbol" w:hAnsi="Symbol" w:hint="default"/>
+      </w:rPr>
+    </w:lvl>
+    <w:lvl w:ilvl="4" w:tplc="04090003" w:tentative="1">
+      <w:start w:val="1"/>
+      <w:numFmt w:val="bullet"/>
+      <w:lvlText w:val="o"/>
+      <w:lvlJc w:val="left"/>
+      <w:pPr>
+        <w:ind w:left="3600" w:hanging="360"/>
+      </w:pPr>
+      <w:rPr>
+        <w:rFonts w:ascii="Courier New" w:hAnsi="Courier New" w:cs="Courier New" w:hint="default"/>
+      </w:rPr>
+    </w:lvl>
+    <w:lvl w:ilvl="5" w:tplc="04090005" w:tentative="1">
+      <w:start w:val="1"/>
+      <w:numFmt w:val="bullet"/>
+      <w:lvlText w:val=""/>
+      <w:lvlJc w:val="left"/>
+      <w:pPr>
+        <w:ind w:left="4320" w:hanging="360"/>
+      </w:pPr>
+      <w:rPr>
+        <w:rFonts w:ascii="Wingdings" w:hAnsi="Wingdings" w:hint="default"/>
+      </w:rPr>
+    </w:lvl>
+    <w:lvl w:ilvl="6" w:tplc="04090001" w:tentative="1">
+      <w:start w:val="1"/>
+      <w:numFmt w:val="bullet"/>
+      <w:lvlText w:val=""/>
+      <w:lvlJc w:val="left"/>
+      <w:pPr>
+        <w:ind w:left="5040" w:hanging="360"/>
+      </w:pPr>
+      <w:rPr>
+        <w:rFonts w:ascii="Symbol" w:hAnsi="Symbol" w:hint="default"/>
+      </w:rPr>
+    </w:lvl>
+    <w:lvl w:ilvl="7" w:tplc="04090003" w:tentative="1">
+      <w:start w:val="1"/>
+      <w:numFmt w:val="bullet"/>
+      <w:lvlText w:val="o"/>
+      <w:lvlJc w:val="left"/>
+      <w:pPr>
+        <w:ind w:left="5760" w:hanging="360"/>
+      </w:pPr>
+      <w:rPr>
+        <w:rFonts w:ascii="Courier New" w:hAnsi="Courier New" w:cs="Courier New" w:hint="default"/>
+      </w:rPr>
+    </w:lvl>
+    <w:lvl w:ilvl="8" w:tplc="04090005" w:tentative="1">
+      <w:start w:val="1"/>
+      <w:numFmt w:val="bullet"/>
+      <w:lvlText w:val=""/>
+      <w:lvlJc w:val="left"/>
+      <w:pPr>
+        <w:ind w:left="6480" w:hanging="360"/>
+      </w:pPr>
+      <w:rPr>
+        <w:rFonts w:ascii="Wingdings" w:hAnsi="Wingdings" w:hint="default"/>
+      </w:rPr>
+    </w:lvl>
+  </w:abstractNum>
+  <w:abstractNum w:abstractNumId="19" w15:restartNumberingAfterBreak="0">
+    <w:nsid w:val="42947547"/>
+    <w:multiLevelType w:val="hybridMultilevel"/>
+    <w:tmpl w:val="C9CC1344"/>
+    <w:lvl w:ilvl="0" w:tplc="04090001">
+      <w:start w:val="1"/>
+      <w:numFmt w:val="bullet"/>
+      <w:lvlText w:val=""/>
+      <w:lvlJc w:val="left"/>
+      <w:pPr>
+        <w:ind w:left="720" w:hanging="360"/>
+      </w:pPr>
+      <w:rPr>
+        <w:rFonts w:ascii="Symbol" w:hAnsi="Symbol" w:hint="default"/>
+      </w:rPr>
+    </w:lvl>
+    <w:lvl w:ilvl="1" w:tplc="04090003" w:tentative="1">
+      <w:start w:val="1"/>
+      <w:numFmt w:val="bullet"/>
+      <w:lvlText w:val="o"/>
+      <w:lvlJc w:val="left"/>
+      <w:pPr>
+        <w:ind w:left="1440" w:hanging="360"/>
+      </w:pPr>
+      <w:rPr>
+        <w:rFonts w:ascii="Courier New" w:hAnsi="Courier New" w:cs="Courier New" w:hint="default"/>
+      </w:rPr>
+    </w:lvl>
+    <w:lvl w:ilvl="2" w:tplc="04090005" w:tentative="1">
+      <w:start w:val="1"/>
+      <w:numFmt w:val="bullet"/>
+      <w:lvlText w:val=""/>
+      <w:lvlJc w:val="left"/>
+      <w:pPr>
+        <w:ind w:left="2160" w:hanging="360"/>
+      </w:pPr>
+      <w:rPr>
+        <w:rFonts w:ascii="Wingdings" w:hAnsi="Wingdings" w:hint="default"/>
+      </w:rPr>
+    </w:lvl>
+    <w:lvl w:ilvl="3" w:tplc="04090001" w:tentative="1">
+      <w:start w:val="1"/>
+      <w:numFmt w:val="bullet"/>
+      <w:lvlText w:val=""/>
+      <w:lvlJc w:val="left"/>
+      <w:pPr>
+        <w:ind w:left="2880" w:hanging="360"/>
+      </w:pPr>
+      <w:rPr>
+        <w:rFonts w:ascii="Symbol" w:hAnsi="Symbol" w:hint="default"/>
+      </w:rPr>
+    </w:lvl>
+    <w:lvl w:ilvl="4" w:tplc="04090003" w:tentative="1">
+      <w:start w:val="1"/>
+      <w:numFmt w:val="bullet"/>
+      <w:lvlText w:val="o"/>
+      <w:lvlJc w:val="left"/>
+      <w:pPr>
+        <w:ind w:left="3600" w:hanging="360"/>
+      </w:pPr>
+      <w:rPr>
+        <w:rFonts w:ascii="Courier New" w:hAnsi="Courier New" w:cs="Courier New" w:hint="default"/>
+      </w:rPr>
+    </w:lvl>
+    <w:lvl w:ilvl="5" w:tplc="04090005" w:tentative="1">
+      <w:start w:val="1"/>
+      <w:numFmt w:val="bullet"/>
+      <w:lvlText w:val=""/>
+      <w:lvlJc w:val="left"/>
+      <w:pPr>
+        <w:ind w:left="4320" w:hanging="360"/>
+      </w:pPr>
+      <w:rPr>
+        <w:rFonts w:ascii="Wingdings" w:hAnsi="Wingdings" w:hint="default"/>
+      </w:rPr>
+    </w:lvl>
+    <w:lvl w:ilvl="6" w:tplc="04090001" w:tentative="1">
+      <w:start w:val="1"/>
+      <w:numFmt w:val="bullet"/>
+      <w:lvlText w:val=""/>
+      <w:lvlJc w:val="left"/>
+      <w:pPr>
+        <w:ind w:left="5040" w:hanging="360"/>
+      </w:pPr>
+      <w:rPr>
+        <w:rFonts w:ascii="Symbol" w:hAnsi="Symbol" w:hint="default"/>
+      </w:rPr>
+    </w:lvl>
+    <w:lvl w:ilvl="7" w:tplc="04090003" w:tentative="1">
+      <w:start w:val="1"/>
+      <w:numFmt w:val="bullet"/>
+      <w:lvlText w:val="o"/>
+      <w:lvlJc w:val="left"/>
+      <w:pPr>
+        <w:ind w:left="5760" w:hanging="360"/>
+      </w:pPr>
+      <w:rPr>
+        <w:rFonts w:ascii="Courier New" w:hAnsi="Courier New" w:cs="Courier New" w:hint="default"/>
+      </w:rPr>
+    </w:lvl>
+    <w:lvl w:ilvl="8" w:tplc="04090005" w:tentative="1">
+      <w:start w:val="1"/>
+      <w:numFmt w:val="bullet"/>
+      <w:lvlText w:val=""/>
+      <w:lvlJc w:val="left"/>
+      <w:pPr>
+        <w:ind w:left="6480" w:hanging="360"/>
+      </w:pPr>
+      <w:rPr>
+        <w:rFonts w:ascii="Wingdings" w:hAnsi="Wingdings" w:hint="default"/>
+      </w:rPr>
+    </w:lvl>
+  </w:abstractNum>
+  <w:abstractNum w:abstractNumId="20" w15:restartNumberingAfterBreak="0">
     <w:nsid w:val="442E4A88"/>
     <w:multiLevelType w:val="hybridMultilevel"/>
     <w:tmpl w:val="000ADE16"/>
@@ -7763,7 +10412,7 @@
       </w:rPr>
     </w:lvl>
   </w:abstractNum>
-  <w:abstractNum w:abstractNumId="14" w15:restartNumberingAfterBreak="0">
+  <w:abstractNum w:abstractNumId="21" w15:restartNumberingAfterBreak="0">
     <w:nsid w:val="4529787A"/>
     <w:multiLevelType w:val="hybridMultilevel"/>
     <w:tmpl w:val="667641C2"/>
@@ -7876,7 +10525,7 @@
       </w:rPr>
     </w:lvl>
   </w:abstractNum>
-  <w:abstractNum w:abstractNumId="15" w15:restartNumberingAfterBreak="0">
+  <w:abstractNum w:abstractNumId="22" w15:restartNumberingAfterBreak="0">
     <w:nsid w:val="4848396F"/>
     <w:multiLevelType w:val="hybridMultilevel"/>
     <w:tmpl w:val="1E3AE816"/>
@@ -7989,7 +10638,7 @@
       </w:rPr>
     </w:lvl>
   </w:abstractNum>
-  <w:abstractNum w:abstractNumId="16" w15:restartNumberingAfterBreak="0">
+  <w:abstractNum w:abstractNumId="23" w15:restartNumberingAfterBreak="0">
     <w:nsid w:val="49FB6FCC"/>
     <w:multiLevelType w:val="hybridMultilevel"/>
     <w:tmpl w:val="7710096A"/>
@@ -8102,7 +10751,7 @@
       </w:rPr>
     </w:lvl>
   </w:abstractNum>
-  <w:abstractNum w:abstractNumId="17" w15:restartNumberingAfterBreak="0">
+  <w:abstractNum w:abstractNumId="24" w15:restartNumberingAfterBreak="0">
     <w:nsid w:val="508B3D82"/>
     <w:multiLevelType w:val="hybridMultilevel"/>
     <w:tmpl w:val="C11CC89E"/>
@@ -8215,7 +10864,7 @@
       </w:rPr>
     </w:lvl>
   </w:abstractNum>
-  <w:abstractNum w:abstractNumId="18" w15:restartNumberingAfterBreak="0">
+  <w:abstractNum w:abstractNumId="25" w15:restartNumberingAfterBreak="0">
     <w:nsid w:val="517C3D40"/>
     <w:multiLevelType w:val="hybridMultilevel"/>
     <w:tmpl w:val="DDC8EFBC"/>
@@ -8328,7 +10977,120 @@
       </w:rPr>
     </w:lvl>
   </w:abstractNum>
-  <w:abstractNum w:abstractNumId="19" w15:restartNumberingAfterBreak="0">
+  <w:abstractNum w:abstractNumId="26" w15:restartNumberingAfterBreak="0">
+    <w:nsid w:val="56AA75E0"/>
+    <w:multiLevelType w:val="hybridMultilevel"/>
+    <w:tmpl w:val="A7227706"/>
+    <w:lvl w:ilvl="0" w:tplc="04090001">
+      <w:start w:val="1"/>
+      <w:numFmt w:val="bullet"/>
+      <w:lvlText w:val=""/>
+      <w:lvlJc w:val="left"/>
+      <w:pPr>
+        <w:ind w:left="720" w:hanging="360"/>
+      </w:pPr>
+      <w:rPr>
+        <w:rFonts w:ascii="Symbol" w:hAnsi="Symbol" w:hint="default"/>
+      </w:rPr>
+    </w:lvl>
+    <w:lvl w:ilvl="1" w:tplc="04090003" w:tentative="1">
+      <w:start w:val="1"/>
+      <w:numFmt w:val="bullet"/>
+      <w:lvlText w:val="o"/>
+      <w:lvlJc w:val="left"/>
+      <w:pPr>
+        <w:ind w:left="1440" w:hanging="360"/>
+      </w:pPr>
+      <w:rPr>
+        <w:rFonts w:ascii="Courier New" w:hAnsi="Courier New" w:cs="Courier New" w:hint="default"/>
+      </w:rPr>
+    </w:lvl>
+    <w:lvl w:ilvl="2" w:tplc="04090005" w:tentative="1">
+      <w:start w:val="1"/>
+      <w:numFmt w:val="bullet"/>
+      <w:lvlText w:val=""/>
+      <w:lvlJc w:val="left"/>
+      <w:pPr>
+        <w:ind w:left="2160" w:hanging="360"/>
+      </w:pPr>
+      <w:rPr>
+        <w:rFonts w:ascii="Wingdings" w:hAnsi="Wingdings" w:hint="default"/>
+      </w:rPr>
+    </w:lvl>
+    <w:lvl w:ilvl="3" w:tplc="04090001" w:tentative="1">
+      <w:start w:val="1"/>
+      <w:numFmt w:val="bullet"/>
+      <w:lvlText w:val=""/>
+      <w:lvlJc w:val="left"/>
+      <w:pPr>
+        <w:ind w:left="2880" w:hanging="360"/>
+      </w:pPr>
+      <w:rPr>
+        <w:rFonts w:ascii="Symbol" w:hAnsi="Symbol" w:hint="default"/>
+      </w:rPr>
+    </w:lvl>
+    <w:lvl w:ilvl="4" w:tplc="04090003" w:tentative="1">
+      <w:start w:val="1"/>
+      <w:numFmt w:val="bullet"/>
+      <w:lvlText w:val="o"/>
+      <w:lvlJc w:val="left"/>
+      <w:pPr>
+        <w:ind w:left="3600" w:hanging="360"/>
+      </w:pPr>
+      <w:rPr>
+        <w:rFonts w:ascii="Courier New" w:hAnsi="Courier New" w:cs="Courier New" w:hint="default"/>
+      </w:rPr>
+    </w:lvl>
+    <w:lvl w:ilvl="5" w:tplc="04090005" w:tentative="1">
+      <w:start w:val="1"/>
+      <w:numFmt w:val="bullet"/>
+      <w:lvlText w:val=""/>
+      <w:lvlJc w:val="left"/>
+      <w:pPr>
+        <w:ind w:left="4320" w:hanging="360"/>
+      </w:pPr>
+      <w:rPr>
+        <w:rFonts w:ascii="Wingdings" w:hAnsi="Wingdings" w:hint="default"/>
+      </w:rPr>
+    </w:lvl>
+    <w:lvl w:ilvl="6" w:tplc="04090001" w:tentative="1">
+      <w:start w:val="1"/>
+      <w:numFmt w:val="bullet"/>
+      <w:lvlText w:val=""/>
+      <w:lvlJc w:val="left"/>
+      <w:pPr>
+        <w:ind w:left="5040" w:hanging="360"/>
+      </w:pPr>
+      <w:rPr>
+        <w:rFonts w:ascii="Symbol" w:hAnsi="Symbol" w:hint="default"/>
+      </w:rPr>
+    </w:lvl>
+    <w:lvl w:ilvl="7" w:tplc="04090003" w:tentative="1">
+      <w:start w:val="1"/>
+      <w:numFmt w:val="bullet"/>
+      <w:lvlText w:val="o"/>
+      <w:lvlJc w:val="left"/>
+      <w:pPr>
+        <w:ind w:left="5760" w:hanging="360"/>
+      </w:pPr>
+      <w:rPr>
+        <w:rFonts w:ascii="Courier New" w:hAnsi="Courier New" w:cs="Courier New" w:hint="default"/>
+      </w:rPr>
+    </w:lvl>
+    <w:lvl w:ilvl="8" w:tplc="04090005" w:tentative="1">
+      <w:start w:val="1"/>
+      <w:numFmt w:val="bullet"/>
+      <w:lvlText w:val=""/>
+      <w:lvlJc w:val="left"/>
+      <w:pPr>
+        <w:ind w:left="6480" w:hanging="360"/>
+      </w:pPr>
+      <w:rPr>
+        <w:rFonts w:ascii="Wingdings" w:hAnsi="Wingdings" w:hint="default"/>
+      </w:rPr>
+    </w:lvl>
+  </w:abstractNum>
+  <w:abstractNum w:abstractNumId="27" w15:restartNumberingAfterBreak="0">
     <w:nsid w:val="5B2D0E7D"/>
     <w:multiLevelType w:val="hybridMultilevel"/>
     <w:tmpl w:val="FB825F40"/>
@@ -8441,7 +11203,7 @@
       </w:rPr>
     </w:lvl>
   </w:abstractNum>
-  <w:abstractNum w:abstractNumId="20" w15:restartNumberingAfterBreak="0">
+  <w:abstractNum w:abstractNumId="28" w15:restartNumberingAfterBreak="0">
     <w:nsid w:val="5B4B0F6C"/>
     <w:multiLevelType w:val="hybridMultilevel"/>
     <w:tmpl w:val="CE145320"/>
@@ -8554,7 +11316,7 @@
       </w:rPr>
     </w:lvl>
   </w:abstractNum>
-  <w:abstractNum w:abstractNumId="21" w15:restartNumberingAfterBreak="0">
+  <w:abstractNum w:abstractNumId="29" w15:restartNumberingAfterBreak="0">
     <w:nsid w:val="5C5D1EDC"/>
     <w:multiLevelType w:val="hybridMultilevel"/>
     <w:tmpl w:val="05B2BD02"/>
@@ -8667,7 +11429,7 @@
       </w:rPr>
     </w:lvl>
   </w:abstractNum>
-  <w:abstractNum w:abstractNumId="22" w15:restartNumberingAfterBreak="0">
+  <w:abstractNum w:abstractNumId="30" w15:restartNumberingAfterBreak="0">
     <w:nsid w:val="608D45AB"/>
     <w:multiLevelType w:val="hybridMultilevel"/>
     <w:tmpl w:val="D9345EA6"/>
@@ -8780,7 +11542,120 @@
       </w:rPr>
     </w:lvl>
   </w:abstractNum>
-  <w:abstractNum w:abstractNumId="23" w15:restartNumberingAfterBreak="0">
+  <w:abstractNum w:abstractNumId="31" w15:restartNumberingAfterBreak="0">
+    <w:nsid w:val="6B0F6190"/>
+    <w:multiLevelType w:val="hybridMultilevel"/>
+    <w:tmpl w:val="30F8E8C0"/>
+    <w:lvl w:ilvl="0" w:tplc="04090001">
+      <w:start w:val="1"/>
+      <w:numFmt w:val="bullet"/>
+      <w:lvlText w:val=""/>
+      <w:lvlJc w:val="left"/>
+      <w:pPr>
+        <w:ind w:left="720" w:hanging="360"/>
+      </w:pPr>
+      <w:rPr>
+        <w:rFonts w:ascii="Symbol" w:hAnsi="Symbol" w:hint="default"/>
+      </w:rPr>
+    </w:lvl>
+    <w:lvl w:ilvl="1" w:tplc="04090003" w:tentative="1">
+      <w:start w:val="1"/>
+      <w:numFmt w:val="bullet"/>
+      <w:lvlText w:val="o"/>
+      <w:lvlJc w:val="left"/>
+      <w:pPr>
+        <w:ind w:left="1440" w:hanging="360"/>
+      </w:pPr>
+      <w:rPr>
+        <w:rFonts w:ascii="Courier New" w:hAnsi="Courier New" w:cs="Courier New" w:hint="default"/>
+      </w:rPr>
+    </w:lvl>
+    <w:lvl w:ilvl="2" w:tplc="04090005" w:tentative="1">
+      <w:start w:val="1"/>
+      <w:numFmt w:val="bullet"/>
+      <w:lvlText w:val=""/>
+      <w:lvlJc w:val="left"/>
+      <w:pPr>
+        <w:ind w:left="2160" w:hanging="360"/>
+      </w:pPr>
+      <w:rPr>
+        <w:rFonts w:ascii="Wingdings" w:hAnsi="Wingdings" w:hint="default"/>
+      </w:rPr>
+    </w:lvl>
+    <w:lvl w:ilvl="3" w:tplc="04090001" w:tentative="1">
+      <w:start w:val="1"/>
+      <w:numFmt w:val="bullet"/>
+      <w:lvlText w:val=""/>
+      <w:lvlJc w:val="left"/>
+      <w:pPr>
+        <w:ind w:left="2880" w:hanging="360"/>
+      </w:pPr>
+      <w:rPr>
+        <w:rFonts w:ascii="Symbol" w:hAnsi="Symbol" w:hint="default"/>
+      </w:rPr>
+    </w:lvl>
+    <w:lvl w:ilvl="4" w:tplc="04090003" w:tentative="1">
+      <w:start w:val="1"/>
+      <w:numFmt w:val="bullet"/>
+      <w:lvlText w:val="o"/>
+      <w:lvlJc w:val="left"/>
+      <w:pPr>
+        <w:ind w:left="3600" w:hanging="360"/>
+      </w:pPr>
+      <w:rPr>
+        <w:rFonts w:ascii="Courier New" w:hAnsi="Courier New" w:cs="Courier New" w:hint="default"/>
+      </w:rPr>
+    </w:lvl>
+    <w:lvl w:ilvl="5" w:tplc="04090005" w:tentative="1">
+      <w:start w:val="1"/>
+      <w:numFmt w:val="bullet"/>
+      <w:lvlText w:val=""/>
+      <w:lvlJc w:val="left"/>
+      <w:pPr>
+        <w:ind w:left="4320" w:hanging="360"/>
+      </w:pPr>
+      <w:rPr>
+        <w:rFonts w:ascii="Wingdings" w:hAnsi="Wingdings" w:hint="default"/>
+      </w:rPr>
+    </w:lvl>
+    <w:lvl w:ilvl="6" w:tplc="04090001" w:tentative="1">
+      <w:start w:val="1"/>
+      <w:numFmt w:val="bullet"/>
+      <w:lvlText w:val=""/>
+      <w:lvlJc w:val="left"/>
+      <w:pPr>
+        <w:ind w:left="5040" w:hanging="360"/>
+      </w:pPr>
+      <w:rPr>
+        <w:rFonts w:ascii="Symbol" w:hAnsi="Symbol" w:hint="default"/>
+      </w:rPr>
+    </w:lvl>
+    <w:lvl w:ilvl="7" w:tplc="04090003" w:tentative="1">
+      <w:start w:val="1"/>
+      <w:numFmt w:val="bullet"/>
+      <w:lvlText w:val="o"/>
+      <w:lvlJc w:val="left"/>
+      <w:pPr>
+        <w:ind w:left="5760" w:hanging="360"/>
+      </w:pPr>
+      <w:rPr>
+        <w:rFonts w:ascii="Courier New" w:hAnsi="Courier New" w:cs="Courier New" w:hint="default"/>
+      </w:rPr>
+    </w:lvl>
+    <w:lvl w:ilvl="8" w:tplc="04090005" w:tentative="1">
+      <w:start w:val="1"/>
+      <w:numFmt w:val="bullet"/>
+      <w:lvlText w:val=""/>
+      <w:lvlJc w:val="left"/>
+      <w:pPr>
+        <w:ind w:left="6480" w:hanging="360"/>
+      </w:pPr>
+      <w:rPr>
+        <w:rFonts w:ascii="Wingdings" w:hAnsi="Wingdings" w:hint="default"/>
+      </w:rPr>
+    </w:lvl>
+  </w:abstractNum>
+  <w:abstractNum w:abstractNumId="32" w15:restartNumberingAfterBreak="0">
     <w:nsid w:val="6D3848C7"/>
     <w:multiLevelType w:val="hybridMultilevel"/>
     <w:tmpl w:val="63842770"/>
@@ -8893,7 +11768,120 @@
       </w:rPr>
     </w:lvl>
   </w:abstractNum>
-  <w:abstractNum w:abstractNumId="24" w15:restartNumberingAfterBreak="0">
+  <w:abstractNum w:abstractNumId="33" w15:restartNumberingAfterBreak="0">
+    <w:nsid w:val="7B8D1B7B"/>
+    <w:multiLevelType w:val="hybridMultilevel"/>
+    <w:tmpl w:val="02942032"/>
+    <w:lvl w:ilvl="0" w:tplc="04090001">
+      <w:start w:val="1"/>
+      <w:numFmt w:val="bullet"/>
+      <w:lvlText w:val=""/>
+      <w:lvlJc w:val="left"/>
+      <w:pPr>
+        <w:ind w:left="720" w:hanging="360"/>
+      </w:pPr>
+      <w:rPr>
+        <w:rFonts w:ascii="Symbol" w:hAnsi="Symbol" w:hint="default"/>
+      </w:rPr>
+    </w:lvl>
+    <w:lvl w:ilvl="1" w:tplc="04090003" w:tentative="1">
+      <w:start w:val="1"/>
+      <w:numFmt w:val="bullet"/>
+      <w:lvlText w:val="o"/>
+      <w:lvlJc w:val="left"/>
+      <w:pPr>
+        <w:ind w:left="1440" w:hanging="360"/>
+      </w:pPr>
+      <w:rPr>
+        <w:rFonts w:ascii="Courier New" w:hAnsi="Courier New" w:cs="Courier New" w:hint="default"/>
+      </w:rPr>
+    </w:lvl>
+    <w:lvl w:ilvl="2" w:tplc="04090005" w:tentative="1">
+      <w:start w:val="1"/>
+      <w:numFmt w:val="bullet"/>
+      <w:lvlText w:val=""/>
+      <w:lvlJc w:val="left"/>
+      <w:pPr>
+        <w:ind w:left="2160" w:hanging="360"/>
+      </w:pPr>
+      <w:rPr>
+        <w:rFonts w:ascii="Wingdings" w:hAnsi="Wingdings" w:hint="default"/>
+      </w:rPr>
+    </w:lvl>
+    <w:lvl w:ilvl="3" w:tplc="04090001" w:tentative="1">
+      <w:start w:val="1"/>
+      <w:numFmt w:val="bullet"/>
+      <w:lvlText w:val=""/>
+      <w:lvlJc w:val="left"/>
+      <w:pPr>
+        <w:ind w:left="2880" w:hanging="360"/>
+      </w:pPr>
+      <w:rPr>
+        <w:rFonts w:ascii="Symbol" w:hAnsi="Symbol" w:hint="default"/>
+      </w:rPr>
+    </w:lvl>
+    <w:lvl w:ilvl="4" w:tplc="04090003" w:tentative="1">
+      <w:start w:val="1"/>
+      <w:numFmt w:val="bullet"/>
+      <w:lvlText w:val="o"/>
+      <w:lvlJc w:val="left"/>
+      <w:pPr>
+        <w:ind w:left="3600" w:hanging="360"/>
+      </w:pPr>
+      <w:rPr>
+        <w:rFonts w:ascii="Courier New" w:hAnsi="Courier New" w:cs="Courier New" w:hint="default"/>
+      </w:rPr>
+    </w:lvl>
+    <w:lvl w:ilvl="5" w:tplc="04090005" w:tentative="1">
+      <w:start w:val="1"/>
+      <w:numFmt w:val="bullet"/>
+      <w:lvlText w:val=""/>
+      <w:lvlJc w:val="left"/>
+      <w:pPr>
+        <w:ind w:left="4320" w:hanging="360"/>
+      </w:pPr>
+      <w:rPr>
+        <w:rFonts w:ascii="Wingdings" w:hAnsi="Wingdings" w:hint="default"/>
+      </w:rPr>
+    </w:lvl>
+    <w:lvl w:ilvl="6" w:tplc="04090001" w:tentative="1">
+      <w:start w:val="1"/>
+      <w:numFmt w:val="bullet"/>
+      <w:lvlText w:val=""/>
+      <w:lvlJc w:val="left"/>
+      <w:pPr>
+        <w:ind w:left="5040" w:hanging="360"/>
+      </w:pPr>
+      <w:rPr>
+        <w:rFonts w:ascii="Symbol" w:hAnsi="Symbol" w:hint="default"/>
+      </w:rPr>
+    </w:lvl>
+    <w:lvl w:ilvl="7" w:tplc="04090003" w:tentative="1">
+      <w:start w:val="1"/>
+      <w:numFmt w:val="bullet"/>
+      <w:lvlText w:val="o"/>
+      <w:lvlJc w:val="left"/>
+      <w:pPr>
+        <w:ind w:left="5760" w:hanging="360"/>
+      </w:pPr>
+      <w:rPr>
+        <w:rFonts w:ascii="Courier New" w:hAnsi="Courier New" w:cs="Courier New" w:hint="default"/>
+      </w:rPr>
+    </w:lvl>
+    <w:lvl w:ilvl="8" w:tplc="04090005" w:tentative="1">
+      <w:start w:val="1"/>
+      <w:numFmt w:val="bullet"/>
+      <w:lvlText w:val=""/>
+      <w:lvlJc w:val="left"/>
+      <w:pPr>
+        <w:ind w:left="6480" w:hanging="360"/>
+      </w:pPr>
+      <w:rPr>
+        <w:rFonts w:ascii="Wingdings" w:hAnsi="Wingdings" w:hint="default"/>
+      </w:rPr>
+    </w:lvl>
+  </w:abstractNum>
+  <w:abstractNum w:abstractNumId="34" w15:restartNumberingAfterBreak="0">
     <w:nsid w:val="7EDE6229"/>
     <w:multiLevelType w:val="hybridMultilevel"/>
     <w:tmpl w:val="34945C06"/>
@@ -9006,7 +11994,7 @@
       </w:rPr>
     </w:lvl>
   </w:abstractNum>
-  <w:abstractNum w:abstractNumId="25" w15:restartNumberingAfterBreak="0">
+  <w:abstractNum w:abstractNumId="35" w15:restartNumberingAfterBreak="0">
     <w:nsid w:val="7FF65407"/>
     <w:multiLevelType w:val="hybridMultilevel"/>
     <w:tmpl w:val="CAAA563C"/>
@@ -9120,82 +12108,112 @@
     </w:lvl>
   </w:abstractNum>
   <w:num w:numId="1" w16cid:durableId="459080217">
-    <w:abstractNumId w:val="4"/>
+    <w:abstractNumId w:val="7"/>
   </w:num>
   <w:num w:numId="2" w16cid:durableId="217133460">
+    <w:abstractNumId w:val="20"/>
+  </w:num>
+  <w:num w:numId="3" w16cid:durableId="514803117">
+    <w:abstractNumId w:val="21"/>
+  </w:num>
+  <w:num w:numId="4" w16cid:durableId="1576670211">
+    <w:abstractNumId w:val="29"/>
+  </w:num>
+  <w:num w:numId="5" w16cid:durableId="1668703457">
+    <w:abstractNumId w:val="27"/>
+  </w:num>
+  <w:num w:numId="6" w16cid:durableId="907035537">
+    <w:abstractNumId w:val="30"/>
+  </w:num>
+  <w:num w:numId="7" w16cid:durableId="39980543">
     <w:abstractNumId w:val="13"/>
   </w:num>
-  <w:num w:numId="3" w16cid:durableId="514803117">
-    <w:abstractNumId w:val="14"/>
-  </w:num>
-  <w:num w:numId="4" w16cid:durableId="1576670211">
-    <w:abstractNumId w:val="21"/>
-  </w:num>
-  <w:num w:numId="5" w16cid:durableId="1668703457">
-    <w:abstractNumId w:val="19"/>
-  </w:num>
-  <w:num w:numId="6" w16cid:durableId="907035537">
-    <w:abstractNumId w:val="22"/>
-  </w:num>
-  <w:num w:numId="7" w16cid:durableId="39980543">
-    <w:abstractNumId w:val="9"/>
-  </w:num>
   <w:num w:numId="8" w16cid:durableId="905145948">
-    <w:abstractNumId w:val="3"/>
+    <w:abstractNumId w:val="5"/>
   </w:num>
   <w:num w:numId="9" w16cid:durableId="759059323">
-    <w:abstractNumId w:val="20"/>
+    <w:abstractNumId w:val="28"/>
   </w:num>
   <w:num w:numId="10" w16cid:durableId="779836732">
     <w:abstractNumId w:val="0"/>
   </w:num>
   <w:num w:numId="11" w16cid:durableId="2091196027">
+    <w:abstractNumId w:val="4"/>
+  </w:num>
+  <w:num w:numId="12" w16cid:durableId="1107191646">
+    <w:abstractNumId w:val="23"/>
+  </w:num>
+  <w:num w:numId="13" w16cid:durableId="1210655280">
+    <w:abstractNumId w:val="25"/>
+  </w:num>
+  <w:num w:numId="14" w16cid:durableId="220755351">
+    <w:abstractNumId w:val="35"/>
+  </w:num>
+  <w:num w:numId="15" w16cid:durableId="472454215">
+    <w:abstractNumId w:val="12"/>
+  </w:num>
+  <w:num w:numId="16" w16cid:durableId="211500607">
+    <w:abstractNumId w:val="15"/>
+  </w:num>
+  <w:num w:numId="17" w16cid:durableId="1495147969">
+    <w:abstractNumId w:val="3"/>
+  </w:num>
+  <w:num w:numId="18" w16cid:durableId="367947514">
+    <w:abstractNumId w:val="22"/>
+  </w:num>
+  <w:num w:numId="19" w16cid:durableId="223880672">
+    <w:abstractNumId w:val="17"/>
+  </w:num>
+  <w:num w:numId="20" w16cid:durableId="712080595">
+    <w:abstractNumId w:val="34"/>
+  </w:num>
+  <w:num w:numId="21" w16cid:durableId="51738637">
+    <w:abstractNumId w:val="24"/>
+  </w:num>
+  <w:num w:numId="22" w16cid:durableId="831523958">
+    <w:abstractNumId w:val="11"/>
+  </w:num>
+  <w:num w:numId="23" w16cid:durableId="317461121">
+    <w:abstractNumId w:val="9"/>
+  </w:num>
+  <w:num w:numId="24" w16cid:durableId="1154448970">
+    <w:abstractNumId w:val="14"/>
+  </w:num>
+  <w:num w:numId="25" w16cid:durableId="1623228143">
+    <w:abstractNumId w:val="32"/>
+  </w:num>
+  <w:num w:numId="26" w16cid:durableId="1360156104">
+    <w:abstractNumId w:val="10"/>
+  </w:num>
+  <w:num w:numId="27" w16cid:durableId="282926766">
+    <w:abstractNumId w:val="19"/>
+  </w:num>
+  <w:num w:numId="28" w16cid:durableId="1010529074">
+    <w:abstractNumId w:val="6"/>
+  </w:num>
+  <w:num w:numId="29" w16cid:durableId="743912654">
+    <w:abstractNumId w:val="1"/>
+  </w:num>
+  <w:num w:numId="30" w16cid:durableId="1532910577">
+    <w:abstractNumId w:val="33"/>
+  </w:num>
+  <w:num w:numId="31" w16cid:durableId="477499357">
+    <w:abstractNumId w:val="16"/>
+  </w:num>
+  <w:num w:numId="32" w16cid:durableId="1002010938">
+    <w:abstractNumId w:val="31"/>
+  </w:num>
+  <w:num w:numId="33" w16cid:durableId="1446461177">
+    <w:abstractNumId w:val="8"/>
+  </w:num>
+  <w:num w:numId="34" w16cid:durableId="36127356">
+    <w:abstractNumId w:val="26"/>
+  </w:num>
+  <w:num w:numId="35" w16cid:durableId="2060087837">
     <w:abstractNumId w:val="2"/>
   </w:num>
-  <w:num w:numId="12" w16cid:durableId="1107191646">
-    <w:abstractNumId w:val="16"/>
-  </w:num>
-  <w:num w:numId="13" w16cid:durableId="1210655280">
+  <w:num w:numId="36" w16cid:durableId="677346480">
     <w:abstractNumId w:val="18"/>
-  </w:num>
-  <w:num w:numId="14" w16cid:durableId="220755351">
-    <w:abstractNumId w:val="25"/>
-  </w:num>
-  <w:num w:numId="15" w16cid:durableId="472454215">
-    <w:abstractNumId w:val="8"/>
-  </w:num>
-  <w:num w:numId="16" w16cid:durableId="211500607">
-    <w:abstractNumId w:val="11"/>
-  </w:num>
-  <w:num w:numId="17" w16cid:durableId="1495147969">
-    <w:abstractNumId w:val="1"/>
-  </w:num>
-  <w:num w:numId="18" w16cid:durableId="367947514">
-    <w:abstractNumId w:val="15"/>
-  </w:num>
-  <w:num w:numId="19" w16cid:durableId="223880672">
-    <w:abstractNumId w:val="12"/>
-  </w:num>
-  <w:num w:numId="20" w16cid:durableId="712080595">
-    <w:abstractNumId w:val="24"/>
-  </w:num>
-  <w:num w:numId="21" w16cid:durableId="51738637">
-    <w:abstractNumId w:val="17"/>
-  </w:num>
-  <w:num w:numId="22" w16cid:durableId="831523958">
-    <w:abstractNumId w:val="7"/>
-  </w:num>
-  <w:num w:numId="23" w16cid:durableId="317461121">
-    <w:abstractNumId w:val="5"/>
-  </w:num>
-  <w:num w:numId="24" w16cid:durableId="1154448970">
-    <w:abstractNumId w:val="10"/>
-  </w:num>
-  <w:num w:numId="25" w16cid:durableId="1623228143">
-    <w:abstractNumId w:val="23"/>
-  </w:num>
-  <w:num w:numId="26" w16cid:durableId="1360156104">
-    <w:abstractNumId w:val="6"/>
   </w:num>
 </w:numbering>
 </file>

</xml_diff>

<commit_message>
Task 3A retrofit access context enforcement
</commit_message>
<xml_diff>
--- a/docs/planning/post-conference/_current/tasks/Docs/PB-NEXT Workflow.docx
+++ b/docs/planning/post-conference/_current/tasks/Docs/PB-NEXT Workflow.docx
@@ -82,7 +82,14 @@
       </w:r>
       <w:r>
         <w:br/>
-        <w:t>SystemId enforcement</w:t>
+      </w:r>
+      <w:proofErr w:type="spellStart"/>
+      <w:r>
+        <w:t>SystemId</w:t>
+      </w:r>
+      <w:proofErr w:type="spellEnd"/>
+      <w:r>
+        <w:t xml:space="preserve"> enforcement</w:t>
       </w:r>
       <w:r>
         <w:br/>
@@ -95,7 +102,15 @@
     </w:p>
     <w:p>
       <w:r>
-        <w:t>This turns PluralBridge from demo viewer into real software.</w:t>
+        <w:t xml:space="preserve">This turns </w:t>
+      </w:r>
+      <w:proofErr w:type="spellStart"/>
+      <w:r>
+        <w:t>PluralBridge</w:t>
+      </w:r>
+      <w:proofErr w:type="spellEnd"/>
+      <w:r>
+        <w:t xml:space="preserve"> from demo viewer into real software.</w:t>
       </w:r>
     </w:p>
     <w:p>
@@ -268,32 +283,74 @@
       </w:r>
       <w:r>
         <w:br/>
+      </w:r>
+      <w:proofErr w:type="spellStart"/>
+      <w:r>
         <w:t>SystemMembership</w:t>
       </w:r>
+      <w:proofErr w:type="spellEnd"/>
       <w:r>
         <w:br/>
-        <w:t>MembershipRole or permission enum</w:t>
-      </w:r>
+      </w:r>
+      <w:proofErr w:type="spellStart"/>
+      <w:r>
+        <w:t>MembershipRole</w:t>
+      </w:r>
+      <w:proofErr w:type="spellEnd"/>
+      <w:r>
+        <w:t xml:space="preserve"> or permission </w:t>
+      </w:r>
+      <w:proofErr w:type="spellStart"/>
+      <w:r>
+        <w:t>enum</w:t>
+      </w:r>
+      <w:proofErr w:type="spellEnd"/>
       <w:r>
         <w:br/>
+      </w:r>
+      <w:proofErr w:type="spellStart"/>
+      <w:r>
         <w:t>AuditEvent</w:t>
       </w:r>
+      <w:proofErr w:type="spellEnd"/>
       <w:r>
         <w:br/>
-        <w:t>PrivacyBucket enforcement model</w:t>
+      </w:r>
+      <w:proofErr w:type="spellStart"/>
+      <w:r>
+        <w:t>PrivacyBucket</w:t>
+      </w:r>
+      <w:proofErr w:type="spellEnd"/>
+      <w:r>
+        <w:t xml:space="preserve"> enforcement model</w:t>
       </w:r>
       <w:r>
         <w:br/>
-        <w:t>SoftDelete metadata</w:t>
+      </w:r>
+      <w:proofErr w:type="spellStart"/>
+      <w:r>
+        <w:t>SoftDelete</w:t>
+      </w:r>
+      <w:proofErr w:type="spellEnd"/>
+      <w:r>
+        <w:t xml:space="preserve"> metadata</w:t>
       </w:r>
       <w:r>
         <w:br/>
+      </w:r>
+      <w:proofErr w:type="spellStart"/>
+      <w:r>
         <w:t>ImportJob</w:t>
       </w:r>
+      <w:proofErr w:type="spellEnd"/>
       <w:r>
         <w:br/>
+      </w:r>
+      <w:proofErr w:type="spellStart"/>
+      <w:r>
         <w:t>ImportJobStatus</w:t>
       </w:r>
+      <w:proofErr w:type="spellEnd"/>
     </w:p>
     <w:p>
       <w:pPr>
@@ -309,24 +366,44 @@
       </w:r>
       <w:r>
         <w:br/>
+      </w:r>
+      <w:proofErr w:type="spellStart"/>
+      <w:r>
         <w:t>CustomField</w:t>
       </w:r>
+      <w:proofErr w:type="spellEnd"/>
       <w:r>
         <w:br/>
+      </w:r>
+      <w:proofErr w:type="spellStart"/>
+      <w:r>
         <w:t>PrivacyBucket</w:t>
       </w:r>
+      <w:proofErr w:type="spellEnd"/>
       <w:r>
         <w:br/>
+      </w:r>
+      <w:proofErr w:type="spellStart"/>
+      <w:r>
         <w:t>FrontHistory</w:t>
       </w:r>
+      <w:proofErr w:type="spellEnd"/>
       <w:r>
         <w:br/>
+      </w:r>
+      <w:proofErr w:type="spellStart"/>
+      <w:r>
         <w:t>SourceRecord</w:t>
       </w:r>
+      <w:proofErr w:type="spellEnd"/>
       <w:r>
         <w:br/>
+      </w:r>
+      <w:proofErr w:type="spellStart"/>
+      <w:r>
         <w:t>SourceIdMap</w:t>
       </w:r>
+      <w:proofErr w:type="spellEnd"/>
       <w:r>
         <w:br/>
         <w:t>Demo login/API paths</w:t>
@@ -343,7 +420,15 @@
     </w:p>
     <w:p>
       <w:r>
-        <w:t>/api/me still returns expected demo counts</w:t>
+        <w:t>/</w:t>
+      </w:r>
+      <w:proofErr w:type="spellStart"/>
+      <w:r>
+        <w:t>api</w:t>
+      </w:r>
+      <w:proofErr w:type="spellEnd"/>
+      <w:r>
+        <w:t>/me still returns expected demo counts</w:t>
       </w:r>
       <w:r>
         <w:br/>
@@ -355,7 +440,15 @@
       </w:r>
       <w:r>
         <w:br/>
-        <w:t>wrong/missing SystemId cannot read data</w:t>
+        <w:t xml:space="preserve">wrong/missing </w:t>
+      </w:r>
+      <w:proofErr w:type="spellStart"/>
+      <w:r>
+        <w:t>SystemId</w:t>
+      </w:r>
+      <w:proofErr w:type="spellEnd"/>
+      <w:r>
+        <w:t xml:space="preserve"> cannot read data</w:t>
       </w:r>
       <w:r>
         <w:br/>
@@ -501,7 +594,15 @@
         </w:numPr>
       </w:pPr>
       <w:r>
-        <w:t>Force API reads/writes through SystemId and membership checks.</w:t>
+        <w:t xml:space="preserve">Force API reads/writes through </w:t>
+      </w:r>
+      <w:proofErr w:type="spellStart"/>
+      <w:r>
+        <w:t>SystemId</w:t>
+      </w:r>
+      <w:proofErr w:type="spellEnd"/>
+      <w:r>
+        <w:t xml:space="preserve"> and membership checks.</w:t>
       </w:r>
     </w:p>
     <w:p>
@@ -586,7 +687,15 @@
         <w:t>access-control spine</w:t>
       </w:r>
       <w:r>
-        <w:t xml:space="preserve"> for PluralBridge. It describes who exists, what they own, how they are connected, and where access decisions happen.</w:t>
+        <w:t xml:space="preserve"> for </w:t>
+      </w:r>
+      <w:proofErr w:type="spellStart"/>
+      <w:r>
+        <w:t>PluralBridge</w:t>
+      </w:r>
+      <w:proofErr w:type="spellEnd"/>
+      <w:r>
+        <w:t>. It describes who exists, what they own, how they are connected, and where access decisions happen.</w:t>
       </w:r>
     </w:p>
     <w:p>
@@ -930,7 +1039,23 @@
     </w:p>
     <w:p>
       <w:r>
-        <w:t>Most real PluralBridge data should hang under SystemId:</w:t>
+        <w:t xml:space="preserve">Most real </w:t>
+      </w:r>
+      <w:proofErr w:type="spellStart"/>
+      <w:r>
+        <w:t>PluralBridge</w:t>
+      </w:r>
+      <w:proofErr w:type="spellEnd"/>
+      <w:r>
+        <w:t xml:space="preserve"> data should hang under </w:t>
+      </w:r>
+      <w:proofErr w:type="spellStart"/>
+      <w:r>
+        <w:t>SystemId</w:t>
+      </w:r>
+      <w:proofErr w:type="spellEnd"/>
+      <w:r>
+        <w:t>:</w:t>
       </w:r>
     </w:p>
     <w:p>
@@ -1085,12 +1210,21 @@
           <w:iCs/>
         </w:rPr>
       </w:pPr>
+      <w:proofErr w:type="spellStart"/>
       <w:r>
         <w:rPr>
           <w:i/>
           <w:iCs/>
         </w:rPr>
-        <w:t>AccountId: Molly</w:t>
+        <w:t>AccountId</w:t>
+      </w:r>
+      <w:proofErr w:type="spellEnd"/>
+      <w:r>
+        <w:rPr>
+          <w:i/>
+          <w:iCs/>
+        </w:rPr>
+        <w:t>: Molly</w:t>
       </w:r>
       <w:r>
         <w:rPr>
@@ -1098,7 +1232,22 @@
           <w:iCs/>
         </w:rPr>
         <w:br/>
-        <w:t>SystemId: Westin System</w:t>
+      </w:r>
+      <w:proofErr w:type="spellStart"/>
+      <w:r>
+        <w:rPr>
+          <w:i/>
+          <w:iCs/>
+        </w:rPr>
+        <w:t>SystemId</w:t>
+      </w:r>
+      <w:proofErr w:type="spellEnd"/>
+      <w:r>
+        <w:rPr>
+          <w:i/>
+          <w:iCs/>
+        </w:rPr>
+        <w:t>: Westin System</w:t>
       </w:r>
       <w:r>
         <w:rPr>
@@ -1131,20 +1280,53 @@
           <w:iCs/>
         </w:rPr>
       </w:pPr>
+      <w:proofErr w:type="spellStart"/>
       <w:r>
         <w:rPr>
           <w:i/>
           <w:iCs/>
         </w:rPr>
-        <w:t>AccountId: TherapistAccount</w:t>
-      </w:r>
+        <w:t>AccountId</w:t>
+      </w:r>
+      <w:proofErr w:type="spellEnd"/>
+      <w:r>
+        <w:rPr>
+          <w:i/>
+          <w:iCs/>
+        </w:rPr>
+        <w:t xml:space="preserve">: </w:t>
+      </w:r>
+      <w:proofErr w:type="spellStart"/>
+      <w:r>
+        <w:rPr>
+          <w:i/>
+          <w:iCs/>
+        </w:rPr>
+        <w:t>TherapistAccount</w:t>
+      </w:r>
+      <w:proofErr w:type="spellEnd"/>
       <w:r>
         <w:rPr>
           <w:i/>
           <w:iCs/>
         </w:rPr>
         <w:br/>
-        <w:t>SystemId: Westin System</w:t>
+      </w:r>
+      <w:proofErr w:type="spellStart"/>
+      <w:r>
+        <w:rPr>
+          <w:i/>
+          <w:iCs/>
+        </w:rPr>
+        <w:t>SystemId</w:t>
+      </w:r>
+      <w:proofErr w:type="spellEnd"/>
+      <w:r>
+        <w:rPr>
+          <w:i/>
+          <w:iCs/>
+        </w:rPr>
+        <w:t>: Westin System</w:t>
       </w:r>
       <w:r>
         <w:rPr>
@@ -1152,8 +1334,17 @@
           <w:iCs/>
         </w:rPr>
         <w:br/>
-        <w:t>Role: ReadLimited</w:t>
-      </w:r>
+        <w:t xml:space="preserve">Role: </w:t>
+      </w:r>
+      <w:proofErr w:type="spellStart"/>
+      <w:r>
+        <w:rPr>
+          <w:i/>
+          <w:iCs/>
+        </w:rPr>
+        <w:t>ReadLimited</w:t>
+      </w:r>
+      <w:proofErr w:type="spellEnd"/>
     </w:p>
     <w:p>
       <w:r>
@@ -1180,9 +1371,11 @@
           <w:numId w:val="5"/>
         </w:numPr>
       </w:pPr>
+      <w:proofErr w:type="spellStart"/>
       <w:r>
         <w:t>AccountId</w:t>
       </w:r>
+      <w:proofErr w:type="spellEnd"/>
     </w:p>
     <w:p>
       <w:pPr>
@@ -1194,9 +1387,11 @@
           <w:numId w:val="5"/>
         </w:numPr>
       </w:pPr>
+      <w:proofErr w:type="spellStart"/>
       <w:r>
         <w:t>SystemId</w:t>
       </w:r>
+      <w:proofErr w:type="spellEnd"/>
     </w:p>
     <w:p>
       <w:pPr>
@@ -1208,12 +1403,14 @@
           <w:numId w:val="5"/>
         </w:numPr>
       </w:pPr>
+      <w:proofErr w:type="spellStart"/>
       <w:r>
         <w:t>Role</w:t>
       </w:r>
       <w:r>
         <w:t>Id</w:t>
       </w:r>
+      <w:proofErr w:type="spellEnd"/>
     </w:p>
     <w:p>
       <w:pPr>
@@ -1225,9 +1422,11 @@
           <w:numId w:val="5"/>
         </w:numPr>
       </w:pPr>
+      <w:proofErr w:type="spellStart"/>
       <w:r>
         <w:t>MembershipStatusId</w:t>
       </w:r>
+      <w:proofErr w:type="spellEnd"/>
     </w:p>
     <w:p>
       <w:pPr>
@@ -1239,12 +1438,14 @@
           <w:numId w:val="5"/>
         </w:numPr>
       </w:pPr>
+      <w:proofErr w:type="spellStart"/>
       <w:r>
         <w:t>CreatedAt</w:t>
       </w:r>
       <w:r>
         <w:t>Utc</w:t>
       </w:r>
+      <w:proofErr w:type="spellEnd"/>
     </w:p>
     <w:p>
       <w:pPr>
@@ -1256,6 +1457,7 @@
           <w:numId w:val="5"/>
         </w:numPr>
       </w:pPr>
+      <w:proofErr w:type="spellStart"/>
       <w:r>
         <w:t>Updat</w:t>
       </w:r>
@@ -1265,6 +1467,7 @@
       <w:r>
         <w:t>Utc</w:t>
       </w:r>
+      <w:proofErr w:type="spellEnd"/>
     </w:p>
     <w:p>
       <w:pPr>
@@ -1400,9 +1603,11 @@
           <w:numId w:val="25"/>
         </w:numPr>
       </w:pPr>
+      <w:proofErr w:type="spellStart"/>
       <w:r>
         <w:t>dbo.pb_groups</w:t>
       </w:r>
+      <w:proofErr w:type="spellEnd"/>
     </w:p>
     <w:p>
       <w:pPr>
@@ -1414,9 +1619,11 @@
           <w:numId w:val="25"/>
         </w:numPr>
       </w:pPr>
+      <w:proofErr w:type="spellStart"/>
       <w:r>
         <w:t>dbo.pb_group_members</w:t>
       </w:r>
+      <w:proofErr w:type="spellEnd"/>
     </w:p>
     <w:p>
       <w:pPr>
@@ -1437,8 +1644,13 @@
           <w:numId w:val="26"/>
         </w:numPr>
       </w:pPr>
-      <w:r>
-        <w:t>dbo.pb_groups stores group records.</w:t>
+      <w:proofErr w:type="spellStart"/>
+      <w:r>
+        <w:t>dbo.pb_groups</w:t>
+      </w:r>
+      <w:proofErr w:type="spellEnd"/>
+      <w:r>
+        <w:t xml:space="preserve"> stores group records.</w:t>
       </w:r>
     </w:p>
     <w:p>
@@ -1451,8 +1663,13 @@
           <w:numId w:val="26"/>
         </w:numPr>
       </w:pPr>
-      <w:r>
-        <w:t>dbo.pb_group_members stores member assignments to groups.</w:t>
+      <w:proofErr w:type="spellStart"/>
+      <w:r>
+        <w:t>dbo.pb_group_members</w:t>
+      </w:r>
+      <w:proofErr w:type="spellEnd"/>
+      <w:r>
+        <w:t xml:space="preserve"> stores member assignments to groups.</w:t>
       </w:r>
     </w:p>
     <w:p>
@@ -1475,7 +1692,15 @@
         <w:t>Authorization boundary</w:t>
       </w:r>
       <w:r>
-        <w:t xml:space="preserve"> is the code boundary where PluralBridge decides whether an account may access a system or perform an action.</w:t>
+        <w:t xml:space="preserve"> is the code boundary where </w:t>
+      </w:r>
+      <w:proofErr w:type="spellStart"/>
+      <w:r>
+        <w:t>PluralBridge</w:t>
+      </w:r>
+      <w:proofErr w:type="spellEnd"/>
+      <w:r>
+        <w:t xml:space="preserve"> decides whether an account may access a system or perform an action.</w:t>
       </w:r>
     </w:p>
     <w:p>
@@ -1523,7 +1748,23 @@
           <w:i/>
           <w:iCs/>
         </w:rPr>
-        <w:t>Can this account read members for SystemId 123?</w:t>
+        <w:t xml:space="preserve">Can this account read members for </w:t>
+      </w:r>
+      <w:proofErr w:type="spellStart"/>
+      <w:r>
+        <w:rPr>
+          <w:i/>
+          <w:iCs/>
+        </w:rPr>
+        <w:t>SystemId</w:t>
+      </w:r>
+      <w:proofErr w:type="spellEnd"/>
+      <w:r>
+        <w:rPr>
+          <w:i/>
+          <w:iCs/>
+        </w:rPr>
+        <w:t xml:space="preserve"> 123?</w:t>
       </w:r>
       <w:r>
         <w:rPr>
@@ -1539,7 +1780,23 @@
           <w:iCs/>
         </w:rPr>
         <w:br/>
-        <w:t>Can this account import data into SystemId 123?</w:t>
+        <w:t xml:space="preserve">Can this account import data into </w:t>
+      </w:r>
+      <w:proofErr w:type="spellStart"/>
+      <w:r>
+        <w:rPr>
+          <w:i/>
+          <w:iCs/>
+        </w:rPr>
+        <w:t>SystemId</w:t>
+      </w:r>
+      <w:proofErr w:type="spellEnd"/>
+      <w:r>
+        <w:rPr>
+          <w:i/>
+          <w:iCs/>
+        </w:rPr>
+        <w:t xml:space="preserve"> 123?</w:t>
       </w:r>
     </w:p>
     <w:p>
@@ -1552,6 +1809,7 @@
       <w:r>
         <w:t xml:space="preserve">In NT terms, this is the </w:t>
       </w:r>
+      <w:proofErr w:type="spellStart"/>
       <w:r>
         <w:rPr>
           <w:b/>
@@ -1559,6 +1817,7 @@
         </w:rPr>
         <w:t>AccessCheck</w:t>
       </w:r>
+      <w:proofErr w:type="spellEnd"/>
       <w:r>
         <w:t xml:space="preserve"> line.</w:t>
       </w:r>
@@ -1659,7 +1918,15 @@
     </w:p>
     <w:p>
       <w:r>
-        <w:t>For PluralBridge, this is where privacy buckets become meaningful instead of decorative.</w:t>
+        <w:t xml:space="preserve">For </w:t>
+      </w:r>
+      <w:proofErr w:type="spellStart"/>
+      <w:r>
+        <w:t>PluralBridge</w:t>
+      </w:r>
+      <w:proofErr w:type="spellEnd"/>
+      <w:r>
+        <w:t>, this is where privacy buckets become meaningful instead of decorative.</w:t>
       </w:r>
     </w:p>
     <w:p>
@@ -1682,7 +1949,15 @@
         <w:t>Audit boundary</w:t>
       </w:r>
       <w:r>
-        <w:t xml:space="preserve"> is the place where PluralBridge would record security-relevant or privacy-relevant actions.</w:t>
+        <w:t xml:space="preserve"> is the place where </w:t>
+      </w:r>
+      <w:proofErr w:type="spellStart"/>
+      <w:r>
+        <w:t>PluralBridge</w:t>
+      </w:r>
+      <w:proofErr w:type="spellEnd"/>
+      <w:r>
+        <w:t xml:space="preserve"> would record security-relevant or privacy-relevant actions.</w:t>
       </w:r>
     </w:p>
     <w:p>
@@ -1831,7 +2106,15 @@
         <w:pStyle w:val="Heading2"/>
       </w:pPr>
       <w:r>
-        <w:t>Current Demo Xlat Database</w:t>
+        <w:t xml:space="preserve">Current Demo </w:t>
+      </w:r>
+      <w:proofErr w:type="spellStart"/>
+      <w:r>
+        <w:t>Xlat</w:t>
+      </w:r>
+      <w:proofErr w:type="spellEnd"/>
+      <w:r>
+        <w:t xml:space="preserve"> Database</w:t>
       </w:r>
     </w:p>
     <w:p>
@@ -1840,25 +2123,47 @@
       </w:r>
     </w:p>
     <w:p>
+      <w:proofErr w:type="spellStart"/>
       <w:r>
         <w:t>pb_systems</w:t>
       </w:r>
+      <w:proofErr w:type="spellEnd"/>
       <w:r>
         <w:br/>
-        <w:t xml:space="preserve">  -&gt; pb_members</w:t>
-      </w:r>
+        <w:t xml:space="preserve">  -&gt; </w:t>
+      </w:r>
+      <w:proofErr w:type="spellStart"/>
+      <w:r>
+        <w:t>pb_members</w:t>
+      </w:r>
+      <w:proofErr w:type="spellEnd"/>
       <w:r>
         <w:br/>
-        <w:t xml:space="preserve">  -&gt; pb_front_history</w:t>
-      </w:r>
+        <w:t xml:space="preserve">  -&gt; </w:t>
+      </w:r>
+      <w:proofErr w:type="spellStart"/>
+      <w:r>
+        <w:t>pb_front_history</w:t>
+      </w:r>
+      <w:proofErr w:type="spellEnd"/>
       <w:r>
         <w:br/>
-        <w:t xml:space="preserve">  -&gt; pb_privacy_buckets</w:t>
-      </w:r>
+        <w:t xml:space="preserve">  -&gt; </w:t>
+      </w:r>
+      <w:proofErr w:type="spellStart"/>
+      <w:r>
+        <w:t>pb_privacy_buckets</w:t>
+      </w:r>
+      <w:proofErr w:type="spellEnd"/>
       <w:r>
         <w:br/>
-        <w:t xml:space="preserve">  -&gt; pb_custom_fields</w:t>
-      </w:r>
+        <w:t xml:space="preserve">  -&gt; </w:t>
+      </w:r>
+      <w:proofErr w:type="spellStart"/>
+      <w:r>
+        <w:t>pb_custom_fields</w:t>
+      </w:r>
+      <w:proofErr w:type="spellEnd"/>
     </w:p>
     <w:p/>
     <w:p>
@@ -1919,7 +2224,15 @@
     <w:p/>
     <w:p>
       <w:r>
-        <w:t>That means SystemId is already acting as the natural partition key for day-to-day data. Members, front history, privacy buckets, and custom fields all hang under a system. That is exactly the right base to build on.</w:t>
+        <w:t xml:space="preserve">That means </w:t>
+      </w:r>
+      <w:proofErr w:type="spellStart"/>
+      <w:r>
+        <w:t>SystemId</w:t>
+      </w:r>
+      <w:proofErr w:type="spellEnd"/>
+      <w:r>
+        <w:t xml:space="preserve"> is already acting as the natural partition key for day-to-day data. Members, front history, privacy buckets, and custom fields all hang under a system. That is exactly the right base to build on.</w:t>
       </w:r>
     </w:p>
     <w:p>
@@ -1935,8 +2248,13 @@
           <w:numId w:val="6"/>
         </w:numPr>
       </w:pPr>
-      <w:r>
-        <w:t>pb_systems = plural system data container</w:t>
+      <w:proofErr w:type="spellStart"/>
+      <w:r>
+        <w:t>pb_systems</w:t>
+      </w:r>
+      <w:proofErr w:type="spellEnd"/>
+      <w:r>
+        <w:t xml:space="preserve"> = plural system data container</w:t>
       </w:r>
     </w:p>
     <w:p>
@@ -1947,8 +2265,13 @@
           <w:numId w:val="6"/>
         </w:numPr>
       </w:pPr>
-      <w:r>
-        <w:t>pb_members = members belonging to that system</w:t>
+      <w:proofErr w:type="spellStart"/>
+      <w:r>
+        <w:t>pb_members</w:t>
+      </w:r>
+      <w:proofErr w:type="spellEnd"/>
+      <w:r>
+        <w:t xml:space="preserve"> = members belonging to that system</w:t>
       </w:r>
     </w:p>
     <w:p>
@@ -1959,8 +2282,13 @@
           <w:numId w:val="6"/>
         </w:numPr>
       </w:pPr>
-      <w:r>
-        <w:t>pb_front_history = fronting records belonging to that system and member</w:t>
+      <w:proofErr w:type="spellStart"/>
+      <w:r>
+        <w:t>pb_front_history</w:t>
+      </w:r>
+      <w:proofErr w:type="spellEnd"/>
+      <w:r>
+        <w:t xml:space="preserve"> = fronting records belonging to that system and member</w:t>
       </w:r>
     </w:p>
     <w:p>
@@ -1971,8 +2299,13 @@
           <w:numId w:val="6"/>
         </w:numPr>
       </w:pPr>
-      <w:r>
-        <w:t>pb_privacy_buckets = privacy categories belonging to that system</w:t>
+      <w:proofErr w:type="spellStart"/>
+      <w:r>
+        <w:t>pb_privacy_buckets</w:t>
+      </w:r>
+      <w:proofErr w:type="spellEnd"/>
+      <w:r>
+        <w:t xml:space="preserve"> = privacy categories belonging to that system</w:t>
       </w:r>
     </w:p>
     <w:p>
@@ -1983,9 +2316,14 @@
           <w:numId w:val="6"/>
         </w:numPr>
       </w:pPr>
+      <w:proofErr w:type="spellStart"/>
       <w:r>
         <w:lastRenderedPageBreak/>
-        <w:t>pb_custom_fields = system-defined metadata fields</w:t>
+        <w:t>pb_custom_fields</w:t>
+      </w:r>
+      <w:proofErr w:type="spellEnd"/>
+      <w:r>
+        <w:t xml:space="preserve"> = system-defined metadata fields</w:t>
       </w:r>
     </w:p>
     <w:p>
@@ -2011,9 +2349,11 @@
           <w:numId w:val="7"/>
         </w:numPr>
       </w:pPr>
+      <w:proofErr w:type="spellStart"/>
       <w:r>
         <w:t>pb_accounts</w:t>
       </w:r>
+      <w:proofErr w:type="spellEnd"/>
     </w:p>
     <w:p>
       <w:pPr>
@@ -2023,9 +2363,11 @@
           <w:numId w:val="7"/>
         </w:numPr>
       </w:pPr>
+      <w:proofErr w:type="spellStart"/>
       <w:r>
         <w:t>pb_system_memberships</w:t>
       </w:r>
+      <w:proofErr w:type="spellEnd"/>
     </w:p>
     <w:p>
       <w:pPr>
@@ -2035,12 +2377,14 @@
           <w:numId w:val="7"/>
         </w:numPr>
       </w:pPr>
+      <w:proofErr w:type="spellStart"/>
       <w:r>
         <w:t>pb_</w:t>
       </w:r>
       <w:r>
         <w:t>roles</w:t>
       </w:r>
+      <w:proofErr w:type="spellEnd"/>
     </w:p>
     <w:p>
       <w:pPr>
@@ -2050,9 +2394,11 @@
           <w:numId w:val="7"/>
         </w:numPr>
       </w:pPr>
+      <w:proofErr w:type="spellStart"/>
       <w:r>
         <w:t>pb_account_statuses</w:t>
       </w:r>
+      <w:proofErr w:type="spellEnd"/>
     </w:p>
     <w:p>
       <w:pPr>
@@ -2086,6 +2432,7 @@
               <w:keepNext/>
               <w:keepLines/>
             </w:pPr>
+            <w:proofErr w:type="spellStart"/>
             <w:r>
               <w:rPr>
                 <w:b/>
@@ -2094,10 +2441,15 @@
               </w:rPr>
               <w:t>pb_accounts</w:t>
             </w:r>
+            <w:proofErr w:type="spellEnd"/>
             <w:r>
               <w:br/>
+            </w:r>
+            <w:proofErr w:type="spellStart"/>
+            <w:r>
               <w:t>AccountId</w:t>
             </w:r>
+            <w:proofErr w:type="spellEnd"/>
             <w:r>
               <w:br/>
               <w:t>Email</w:t>
@@ -2109,20 +2461,30 @@
             <w:r>
               <w:br/>
             </w:r>
+            <w:proofErr w:type="spellStart"/>
             <w:r>
               <w:t>Account</w:t>
             </w:r>
             <w:r>
               <w:t>StatusId</w:t>
             </w:r>
+            <w:proofErr w:type="spellEnd"/>
             <w:r>
               <w:br/>
+            </w:r>
+            <w:proofErr w:type="spellStart"/>
+            <w:r>
               <w:t>CreatedAtUtc</w:t>
             </w:r>
+            <w:proofErr w:type="spellEnd"/>
             <w:r>
               <w:br/>
+            </w:r>
+            <w:proofErr w:type="spellStart"/>
+            <w:r>
               <w:t>UpdatedAtUtc</w:t>
             </w:r>
+            <w:proofErr w:type="spellEnd"/>
           </w:p>
         </w:tc>
         <w:tc>
@@ -2139,6 +2501,7 @@
                 <w:u w:val="single"/>
               </w:rPr>
             </w:pPr>
+            <w:proofErr w:type="spellStart"/>
             <w:r>
               <w:rPr>
                 <w:b/>
@@ -2147,6 +2510,7 @@
               </w:rPr>
               <w:t>pb_account_statuses</w:t>
             </w:r>
+            <w:proofErr w:type="spellEnd"/>
             <w:r>
               <w:rPr>
                 <w:b/>
@@ -2155,21 +2519,35 @@
               </w:rPr>
               <w:br/>
             </w:r>
+            <w:proofErr w:type="spellStart"/>
             <w:r>
               <w:t>AccountStatusId</w:t>
             </w:r>
+            <w:proofErr w:type="spellEnd"/>
             <w:r>
               <w:br/>
+            </w:r>
+            <w:proofErr w:type="spellStart"/>
+            <w:r>
               <w:t>StatusName</w:t>
             </w:r>
+            <w:proofErr w:type="spellEnd"/>
             <w:r>
               <w:br/>
+            </w:r>
+            <w:proofErr w:type="spellStart"/>
+            <w:r>
               <w:t>DisplayOrder</w:t>
             </w:r>
+            <w:proofErr w:type="spellEnd"/>
             <w:r>
               <w:br/>
+            </w:r>
+            <w:proofErr w:type="spellStart"/>
+            <w:r>
               <w:t>IsActive</w:t>
             </w:r>
+            <w:proofErr w:type="spellEnd"/>
             <w:r>
               <w:br/>
             </w:r>
@@ -2195,8 +2573,12 @@
             </w:r>
             <w:r>
               <w:br/>
+            </w:r>
+            <w:proofErr w:type="spellStart"/>
+            <w:r>
               <w:t>PendingEmailVerification</w:t>
             </w:r>
+            <w:proofErr w:type="spellEnd"/>
             <w:r>
               <w:br/>
               <w:t>Disabled</w:t>
@@ -2231,6 +2613,7 @@
               <w:keepNext/>
               <w:keepLines/>
             </w:pPr>
+            <w:proofErr w:type="spellStart"/>
             <w:r>
               <w:rPr>
                 <w:b/>
@@ -2239,22 +2622,39 @@
               </w:rPr>
               <w:t>pb_roles</w:t>
             </w:r>
+            <w:proofErr w:type="spellEnd"/>
             <w:r>
               <w:br/>
+            </w:r>
+            <w:proofErr w:type="spellStart"/>
+            <w:r>
               <w:t>RoleId</w:t>
             </w:r>
+            <w:proofErr w:type="spellEnd"/>
             <w:r>
               <w:br/>
+            </w:r>
+            <w:proofErr w:type="spellStart"/>
+            <w:r>
               <w:t>RoleName</w:t>
             </w:r>
+            <w:proofErr w:type="spellEnd"/>
             <w:r>
               <w:br/>
+            </w:r>
+            <w:proofErr w:type="spellStart"/>
+            <w:r>
               <w:t>DisplayOrder</w:t>
             </w:r>
+            <w:proofErr w:type="spellEnd"/>
             <w:r>
               <w:br/>
+            </w:r>
+            <w:proofErr w:type="spellStart"/>
+            <w:r>
               <w:t>IsActive</w:t>
             </w:r>
+            <w:proofErr w:type="spellEnd"/>
           </w:p>
         </w:tc>
         <w:tc>
@@ -2266,6 +2666,7 @@
               <w:keepNext/>
               <w:keepLines/>
             </w:pPr>
+            <w:proofErr w:type="spellStart"/>
             <w:r>
               <w:rPr>
                 <w:b/>
@@ -2274,39 +2675,66 @@
               </w:rPr>
               <w:t>pb_system_memberships</w:t>
             </w:r>
+            <w:proofErr w:type="spellEnd"/>
             <w:r>
               <w:br/>
+            </w:r>
+            <w:proofErr w:type="spellStart"/>
+            <w:r>
               <w:t>SystemMembershipId</w:t>
             </w:r>
+            <w:proofErr w:type="spellEnd"/>
             <w:r>
               <w:br/>
+            </w:r>
+            <w:proofErr w:type="spellStart"/>
+            <w:r>
               <w:t>AccountId</w:t>
             </w:r>
+            <w:proofErr w:type="spellEnd"/>
             <w:r>
               <w:br/>
+            </w:r>
+            <w:proofErr w:type="spellStart"/>
+            <w:r>
               <w:t>SystemId</w:t>
             </w:r>
+            <w:proofErr w:type="spellEnd"/>
             <w:r>
               <w:br/>
+            </w:r>
+            <w:proofErr w:type="spellStart"/>
+            <w:r>
               <w:t>RoleId</w:t>
             </w:r>
+            <w:proofErr w:type="spellEnd"/>
             <w:r>
               <w:br/>
             </w:r>
+            <w:proofErr w:type="spellStart"/>
             <w:r>
               <w:t>Membership</w:t>
             </w:r>
             <w:r>
               <w:t>StatusId</w:t>
             </w:r>
+            <w:proofErr w:type="spellEnd"/>
             <w:r>
               <w:br/>
+            </w:r>
+            <w:proofErr w:type="spellStart"/>
+            <w:r>
               <w:t>CreatedAtUtc</w:t>
             </w:r>
+            <w:proofErr w:type="spellEnd"/>
             <w:r>
               <w:br/>
+            </w:r>
+            <w:proofErr w:type="spellStart"/>
+            <w:r>
               <w:t>UpdatedAtUtc</w:t>
             </w:r>
+            <w:proofErr w:type="spellEnd"/>
           </w:p>
         </w:tc>
       </w:tr>
@@ -2325,6 +2753,7 @@
                 <w:u w:val="single"/>
               </w:rPr>
             </w:pPr>
+            <w:proofErr w:type="spellStart"/>
             <w:r>
               <w:rPr>
                 <w:b/>
@@ -2333,6 +2762,7 @@
               </w:rPr>
               <w:t>pb_system_membership_statuses</w:t>
             </w:r>
+            <w:proofErr w:type="spellEnd"/>
             <w:r>
               <w:rPr>
                 <w:b/>
@@ -2341,21 +2771,35 @@
               </w:rPr>
               <w:br/>
             </w:r>
+            <w:proofErr w:type="spellStart"/>
             <w:r>
               <w:t>MembershipStatusId</w:t>
             </w:r>
+            <w:proofErr w:type="spellEnd"/>
             <w:r>
               <w:br/>
+            </w:r>
+            <w:proofErr w:type="spellStart"/>
+            <w:r>
               <w:t>StatusName</w:t>
             </w:r>
+            <w:proofErr w:type="spellEnd"/>
             <w:r>
               <w:br/>
+            </w:r>
+            <w:proofErr w:type="spellStart"/>
+            <w:r>
               <w:t>DisplayOrder</w:t>
             </w:r>
+            <w:proofErr w:type="spellEnd"/>
             <w:r>
               <w:br/>
+            </w:r>
+            <w:proofErr w:type="spellStart"/>
+            <w:r>
               <w:t>IsActive</w:t>
             </w:r>
+            <w:proofErr w:type="spellEnd"/>
             <w:r>
               <w:br/>
             </w:r>
@@ -2487,6 +2931,7 @@
                 <w:u w:val="single"/>
               </w:rPr>
             </w:pPr>
+            <w:proofErr w:type="spellStart"/>
             <w:r>
               <w:rPr>
                 <w:b/>
@@ -2495,6 +2940,7 @@
               </w:rPr>
               <w:t>RoleName</w:t>
             </w:r>
+            <w:proofErr w:type="spellEnd"/>
           </w:p>
         </w:tc>
         <w:tc>
@@ -2618,10 +3064,12 @@
             <w:tcW w:w="2988" w:type="dxa"/>
           </w:tcPr>
           <w:p>
+            <w:proofErr w:type="spellStart"/>
             <w:r>
               <w:lastRenderedPageBreak/>
               <w:t>LimitedViewer</w:t>
             </w:r>
+            <w:proofErr w:type="spellEnd"/>
           </w:p>
         </w:tc>
         <w:tc>
@@ -2749,8 +3197,29 @@
         </w:numPr>
       </w:pPr>
       <w:r>
-        <w:t>System owns Members / FrontHistory / PrivacyBuckets / CustomFields</w:t>
-      </w:r>
+        <w:t xml:space="preserve">System owns Members / </w:t>
+      </w:r>
+      <w:proofErr w:type="spellStart"/>
+      <w:r>
+        <w:t>FrontHistory</w:t>
+      </w:r>
+      <w:proofErr w:type="spellEnd"/>
+      <w:r>
+        <w:t xml:space="preserve"> / </w:t>
+      </w:r>
+      <w:proofErr w:type="spellStart"/>
+      <w:r>
+        <w:t>PrivacyBuckets</w:t>
+      </w:r>
+      <w:proofErr w:type="spellEnd"/>
+      <w:r>
+        <w:t xml:space="preserve"> / </w:t>
+      </w:r>
+      <w:proofErr w:type="spellStart"/>
+      <w:r>
+        <w:t>CustomFields</w:t>
+      </w:r>
+      <w:proofErr w:type="spellEnd"/>
     </w:p>
     <w:p>
       <w:pPr>
@@ -2761,22 +3230,56 @@
         </w:numPr>
       </w:pPr>
       <w:r>
-        <w:t>API reads and writes only within that SystemId</w:t>
-      </w:r>
-    </w:p>
-    <w:p>
-      <w:r>
-        <w:t>For a first working slice, we should be able to build on top of this without disturbing the existing day-to-day tables much. The cleanest initial move would be to add the account/membership layer, seed one account and one membership for the existing demo system, then make the API resolve the current SystemId through that membership instead of assuming the demo system directly.</w:t>
-      </w:r>
-    </w:p>
-    <w:p>
-      <w:r>
-        <w:t>PluralBridge should preserve Simply Plural privacy bucket data as source-shaped import/export data. PB-native visibility behavior should live in PB Visibility Scopes.</w:t>
-      </w:r>
-    </w:p>
-    <w:p>
-      <w:r>
-        <w:t>At runtime, PluralBridge checks PB Visibility Scope first. If present, it controls visibility. If absent, PluralBridge falls back to the preserved Simply Plural privacy bucket behavior.</w:t>
+        <w:t xml:space="preserve">API reads and writes only within that </w:t>
+      </w:r>
+      <w:proofErr w:type="spellStart"/>
+      <w:r>
+        <w:t>SystemId</w:t>
+      </w:r>
+      <w:proofErr w:type="spellEnd"/>
+    </w:p>
+    <w:p>
+      <w:r>
+        <w:t xml:space="preserve">For a first working slice, we should be able to build on top of this without disturbing the existing day-to-day tables much. The cleanest initial move would be to add the account/membership layer, seed one account and one membership for the existing demo system, then make the API resolve the current </w:t>
+      </w:r>
+      <w:proofErr w:type="spellStart"/>
+      <w:r>
+        <w:t>SystemId</w:t>
+      </w:r>
+      <w:proofErr w:type="spellEnd"/>
+      <w:r>
+        <w:t xml:space="preserve"> through that membership instead of assuming the demo system directly.</w:t>
+      </w:r>
+    </w:p>
+    <w:p>
+      <w:proofErr w:type="spellStart"/>
+      <w:r>
+        <w:t>PluralBridge</w:t>
+      </w:r>
+      <w:proofErr w:type="spellEnd"/>
+      <w:r>
+        <w:t xml:space="preserve"> should preserve Simply Plural privacy bucket data as source-shaped import/export data. PB-native visibility behavior should live in PB Visibility Scopes.</w:t>
+      </w:r>
+    </w:p>
+    <w:p>
+      <w:r>
+        <w:t xml:space="preserve">At runtime, </w:t>
+      </w:r>
+      <w:proofErr w:type="spellStart"/>
+      <w:r>
+        <w:t>PluralBridge</w:t>
+      </w:r>
+      <w:proofErr w:type="spellEnd"/>
+      <w:r>
+        <w:t xml:space="preserve"> checks PB Visibility Scope first. If present, it controls visibility. If absent, </w:t>
+      </w:r>
+      <w:proofErr w:type="spellStart"/>
+      <w:r>
+        <w:t>PluralBridge</w:t>
+      </w:r>
+      <w:proofErr w:type="spellEnd"/>
+      <w:r>
+        <w:t xml:space="preserve"> falls back to the preserved Simply Plural privacy bucket behavior.</w:t>
       </w:r>
     </w:p>
     <w:p>
@@ -2956,7 +3459,15 @@
           </w:tcPr>
           <w:p>
             <w:r>
-              <w:t>Existing demo login, /api/me, system counts, and read-only data still pass before any spine work</w:t>
+              <w:t>Existing demo login, /</w:t>
+            </w:r>
+            <w:proofErr w:type="spellStart"/>
+            <w:r>
+              <w:t>api</w:t>
+            </w:r>
+            <w:proofErr w:type="spellEnd"/>
+            <w:r>
+              <w:t>/me, system counts, and read-only data still pass before any spine work</w:t>
             </w:r>
           </w:p>
         </w:tc>
@@ -2998,7 +3509,15 @@
           </w:tcPr>
           <w:p>
             <w:r>
-              <w:t>Document current Xlat tables used by runtime</w:t>
+              <w:t xml:space="preserve">Document current </w:t>
+            </w:r>
+            <w:proofErr w:type="spellStart"/>
+            <w:r>
+              <w:t>Xlat</w:t>
+            </w:r>
+            <w:proofErr w:type="spellEnd"/>
+            <w:r>
+              <w:t xml:space="preserve"> tables used by runtime</w:t>
             </w:r>
           </w:p>
         </w:tc>
@@ -3009,8 +3528,45 @@
             <w:hideMark/>
           </w:tcPr>
           <w:p>
-            <w:r>
-              <w:t>pb_systems, pb_members, pb_front_history, pb_privacy_buckets, and pb_custom_fields are confirmed as the current day-to-day data root</w:t>
+            <w:proofErr w:type="spellStart"/>
+            <w:r>
+              <w:t>pb_systems</w:t>
+            </w:r>
+            <w:proofErr w:type="spellEnd"/>
+            <w:r>
+              <w:t xml:space="preserve">, </w:t>
+            </w:r>
+            <w:proofErr w:type="spellStart"/>
+            <w:r>
+              <w:t>pb_members</w:t>
+            </w:r>
+            <w:proofErr w:type="spellEnd"/>
+            <w:r>
+              <w:t xml:space="preserve">, </w:t>
+            </w:r>
+            <w:proofErr w:type="spellStart"/>
+            <w:r>
+              <w:t>pb_front_history</w:t>
+            </w:r>
+            <w:proofErr w:type="spellEnd"/>
+            <w:r>
+              <w:t xml:space="preserve">, </w:t>
+            </w:r>
+            <w:proofErr w:type="spellStart"/>
+            <w:r>
+              <w:t>pb_privacy_buckets</w:t>
+            </w:r>
+            <w:proofErr w:type="spellEnd"/>
+            <w:r>
+              <w:t xml:space="preserve">, and </w:t>
+            </w:r>
+            <w:proofErr w:type="spellStart"/>
+            <w:r>
+              <w:t>pb_custom_fields</w:t>
+            </w:r>
+            <w:proofErr w:type="spellEnd"/>
+            <w:r>
+              <w:t xml:space="preserve"> are confirmed as the current day-to-day data root</w:t>
             </w:r>
           </w:p>
         </w:tc>
@@ -3051,9 +3607,11 @@
             <w:hideMark/>
           </w:tcPr>
           <w:p>
+            <w:proofErr w:type="spellStart"/>
             <w:r>
               <w:t>pb_account_statuses</w:t>
             </w:r>
+            <w:proofErr w:type="spellEnd"/>
           </w:p>
         </w:tc>
         <w:tc>
@@ -3064,7 +3622,15 @@
           </w:tcPr>
           <w:p>
             <w:r>
-              <w:t>Seed values exist: Active, PendingEmailVerification, Disabled, Locked, Deleted</w:t>
+              <w:t xml:space="preserve">Seed values exist: Active, </w:t>
+            </w:r>
+            <w:proofErr w:type="spellStart"/>
+            <w:r>
+              <w:t>PendingEmailVerification</w:t>
+            </w:r>
+            <w:proofErr w:type="spellEnd"/>
+            <w:r>
+              <w:t>, Disabled, Locked, Deleted</w:t>
             </w:r>
           </w:p>
         </w:tc>
@@ -3105,9 +3671,11 @@
             <w:hideMark/>
           </w:tcPr>
           <w:p>
+            <w:proofErr w:type="spellStart"/>
             <w:r>
               <w:t>pb_accounts</w:t>
             </w:r>
+            <w:proofErr w:type="spellEnd"/>
           </w:p>
         </w:tc>
         <w:tc>
@@ -3118,7 +3686,23 @@
           </w:tcPr>
           <w:p>
             <w:r>
-              <w:t>Account rows have AccountId, Email, DisplayName, AccountStatusId, timestamps</w:t>
+              <w:t xml:space="preserve">Account rows have </w:t>
+            </w:r>
+            <w:proofErr w:type="spellStart"/>
+            <w:r>
+              <w:t>AccountId</w:t>
+            </w:r>
+            <w:proofErr w:type="spellEnd"/>
+            <w:r>
+              <w:t xml:space="preserve">, Email, DisplayName, </w:t>
+            </w:r>
+            <w:proofErr w:type="spellStart"/>
+            <w:r>
+              <w:t>AccountStatusId</w:t>
+            </w:r>
+            <w:proofErr w:type="spellEnd"/>
+            <w:r>
+              <w:t>, timestamps</w:t>
             </w:r>
           </w:p>
         </w:tc>
@@ -3160,9 +3744,11 @@
             <w:hideMark/>
           </w:tcPr>
           <w:p>
+            <w:proofErr w:type="spellStart"/>
             <w:r>
               <w:t>pb_roles</w:t>
             </w:r>
+            <w:proofErr w:type="spellEnd"/>
           </w:p>
         </w:tc>
         <w:tc>
@@ -3173,8 +3759,13 @@
           </w:tcPr>
           <w:p>
             <w:r>
-              <w:t>Seed values exist: Owner, Admin, Editor, Viewer, LimitedViewer</w:t>
-            </w:r>
+              <w:t xml:space="preserve">Seed values exist: Owner, Admin, Editor, Viewer, </w:t>
+            </w:r>
+            <w:proofErr w:type="spellStart"/>
+            <w:r>
+              <w:t>LimitedViewer</w:t>
+            </w:r>
+            <w:proofErr w:type="spellEnd"/>
           </w:p>
         </w:tc>
       </w:tr>
@@ -3214,9 +3805,11 @@
             <w:hideMark/>
           </w:tcPr>
           <w:p>
+            <w:proofErr w:type="spellStart"/>
             <w:r>
               <w:t>pb_system_membership_statuses</w:t>
             </w:r>
+            <w:proofErr w:type="spellEnd"/>
           </w:p>
         </w:tc>
         <w:tc>
@@ -3268,9 +3861,11 @@
             <w:hideMark/>
           </w:tcPr>
           <w:p>
+            <w:proofErr w:type="spellStart"/>
             <w:r>
               <w:t>pb_system_memberships</w:t>
             </w:r>
+            <w:proofErr w:type="spellEnd"/>
           </w:p>
         </w:tc>
         <w:tc>
@@ -3281,8 +3876,37 @@
           </w:tcPr>
           <w:p>
             <w:r>
-              <w:t>Membership joins AccountId -&gt; SystemId -&gt; RoleId -&gt; MembershipStatusId</w:t>
-            </w:r>
+              <w:t xml:space="preserve">Membership joins </w:t>
+            </w:r>
+            <w:proofErr w:type="spellStart"/>
+            <w:r>
+              <w:t>AccountId</w:t>
+            </w:r>
+            <w:proofErr w:type="spellEnd"/>
+            <w:r>
+              <w:t xml:space="preserve"> -&gt; </w:t>
+            </w:r>
+            <w:proofErr w:type="spellStart"/>
+            <w:r>
+              <w:t>SystemId</w:t>
+            </w:r>
+            <w:proofErr w:type="spellEnd"/>
+            <w:r>
+              <w:t xml:space="preserve"> -&gt; </w:t>
+            </w:r>
+            <w:proofErr w:type="spellStart"/>
+            <w:r>
+              <w:t>RoleId</w:t>
+            </w:r>
+            <w:proofErr w:type="spellEnd"/>
+            <w:r>
+              <w:t xml:space="preserve"> -&gt; </w:t>
+            </w:r>
+            <w:proofErr w:type="spellStart"/>
+            <w:r>
+              <w:t>MembershipStatusId</w:t>
+            </w:r>
+            <w:proofErr w:type="spellEnd"/>
           </w:p>
         </w:tc>
       </w:tr>
@@ -3335,7 +3959,15 @@
           </w:tcPr>
           <w:p>
             <w:r>
-              <w:t>Existing demo user maps to a pb_accounts row</w:t>
+              <w:t xml:space="preserve">Existing demo user maps to a </w:t>
+            </w:r>
+            <w:proofErr w:type="spellStart"/>
+            <w:r>
+              <w:t>pb_accounts</w:t>
+            </w:r>
+            <w:proofErr w:type="spellEnd"/>
+            <w:r>
+              <w:t xml:space="preserve"> row</w:t>
             </w:r>
           </w:p>
         </w:tc>
@@ -3443,8 +4075,29 @@
           </w:tcPr>
           <w:p>
             <w:r>
-              <w:t>Code can represent Account, AccountStatus, Role, SystemMembership, MembershipStatus</w:t>
-            </w:r>
+              <w:t xml:space="preserve">Code can represent Account, </w:t>
+            </w:r>
+            <w:proofErr w:type="spellStart"/>
+            <w:r>
+              <w:t>AccountStatus</w:t>
+            </w:r>
+            <w:proofErr w:type="spellEnd"/>
+            <w:r>
+              <w:t xml:space="preserve">, Role, </w:t>
+            </w:r>
+            <w:proofErr w:type="spellStart"/>
+            <w:r>
+              <w:t>SystemMembership</w:t>
+            </w:r>
+            <w:proofErr w:type="spellEnd"/>
+            <w:r>
+              <w:t xml:space="preserve">, </w:t>
+            </w:r>
+            <w:proofErr w:type="spellStart"/>
+            <w:r>
+              <w:t>MembershipStatus</w:t>
+            </w:r>
+            <w:proofErr w:type="spellEnd"/>
           </w:p>
         </w:tc>
       </w:tr>
@@ -3485,8 +4138,13 @@
           </w:tcPr>
           <w:p>
             <w:r>
-              <w:t>Login identity to AccountId</w:t>
-            </w:r>
+              <w:t xml:space="preserve">Login identity to </w:t>
+            </w:r>
+            <w:proofErr w:type="spellStart"/>
+            <w:r>
+              <w:t>AccountId</w:t>
+            </w:r>
+            <w:proofErr w:type="spellEnd"/>
           </w:p>
         </w:tc>
         <w:tc>
@@ -3590,7 +4248,23 @@
           </w:tcPr>
           <w:p>
             <w:r>
-              <w:t>Reusable AccessContextHelper for account, membership, role, status, and access-context resolution. MeController keeps endpoint behavior but no longer owns shared access plumbing</w:t>
+              <w:t xml:space="preserve">Reusable </w:t>
+            </w:r>
+            <w:proofErr w:type="spellStart"/>
+            <w:r>
+              <w:t>AccessContextHelper</w:t>
+            </w:r>
+            <w:proofErr w:type="spellEnd"/>
+            <w:r>
+              <w:t xml:space="preserve"> for account, membership, role, status, and access-context resolution. </w:t>
+            </w:r>
+            <w:proofErr w:type="spellStart"/>
+            <w:r>
+              <w:t>MeController</w:t>
+            </w:r>
+            <w:proofErr w:type="spellEnd"/>
+            <w:r>
+              <w:t xml:space="preserve"> keeps endpoint behavior but no longer owns shared access plumbing</w:t>
             </w:r>
             <w:r>
               <w:t>.</w:t>
@@ -3603,8 +4277,53 @@
             <w:vAlign w:val="center"/>
           </w:tcPr>
           <w:p>
-            <w:r>
-              <w:t>AccessContextHelper.cs contains the moved records and resolver methods. MeController calls AccessContextHelper.ResolveCurrentAccessAsync(connection). The API builds. /api/me still returns currentAccount, membershipAccess, Active, Owner, PluralBridgeChap2SafeSpine, and existing counts. The branch contains a commit named Extract access context helper.</w:t>
+            <w:proofErr w:type="spellStart"/>
+            <w:r>
+              <w:t>AccessContextHelper.cs</w:t>
+            </w:r>
+            <w:proofErr w:type="spellEnd"/>
+            <w:r>
+              <w:t xml:space="preserve"> contains the moved records and resolver methods. </w:t>
+            </w:r>
+            <w:proofErr w:type="spellStart"/>
+            <w:r>
+              <w:t>MeController</w:t>
+            </w:r>
+            <w:proofErr w:type="spellEnd"/>
+            <w:r>
+              <w:t xml:space="preserve"> calls </w:t>
+            </w:r>
+            <w:proofErr w:type="spellStart"/>
+            <w:r>
+              <w:t>AccessContextHelper.ResolveCurrentAccessAsync</w:t>
+            </w:r>
+            <w:proofErr w:type="spellEnd"/>
+            <w:r>
+              <w:t>(connection). The API builds. /</w:t>
+            </w:r>
+            <w:proofErr w:type="spellStart"/>
+            <w:r>
+              <w:t>api</w:t>
+            </w:r>
+            <w:proofErr w:type="spellEnd"/>
+            <w:r>
+              <w:t xml:space="preserve">/me still returns </w:t>
+            </w:r>
+            <w:proofErr w:type="spellStart"/>
+            <w:r>
+              <w:t>currentAccount</w:t>
+            </w:r>
+            <w:proofErr w:type="spellEnd"/>
+            <w:r>
+              <w:t xml:space="preserve">, </w:t>
+            </w:r>
+            <w:proofErr w:type="spellStart"/>
+            <w:r>
+              <w:t>membershipAccess</w:t>
+            </w:r>
+            <w:proofErr w:type="spellEnd"/>
+            <w:r>
+              <w:t>, Active, Owner, PluralBridgeChap2SafeSpine, and existing counts. The branch contains a commit named Extract access context helper.</w:t>
             </w:r>
           </w:p>
         </w:tc>
@@ -3658,7 +4377,15 @@
           </w:tcPr>
           <w:p>
             <w:r>
-              <w:t>Demo path resolves SystemId through membership, rather than assuming the demo system directly</w:t>
+              <w:t xml:space="preserve">Demo path resolves </w:t>
+            </w:r>
+            <w:proofErr w:type="spellStart"/>
+            <w:r>
+              <w:t>SystemId</w:t>
+            </w:r>
+            <w:proofErr w:type="spellEnd"/>
+            <w:r>
+              <w:t xml:space="preserve"> through membership, rather than assuming the demo system directly</w:t>
             </w:r>
           </w:p>
         </w:tc>
@@ -3757,7 +4484,15 @@
           </w:tcPr>
           <w:p>
             <w:r>
-              <w:t>Preserve existing SystemId queries</w:t>
+              <w:t xml:space="preserve">Preserve existing </w:t>
+            </w:r>
+            <w:proofErr w:type="spellStart"/>
+            <w:r>
+              <w:t>SystemId</w:t>
+            </w:r>
+            <w:proofErr w:type="spellEnd"/>
+            <w:r>
+              <w:t xml:space="preserve"> queries</w:t>
             </w:r>
           </w:p>
         </w:tc>
@@ -3769,8 +4504,13 @@
           </w:tcPr>
           <w:p>
             <w:r>
-              <w:t>Existing data access still partitions by SystemId</w:t>
-            </w:r>
+              <w:t xml:space="preserve">Existing data access still partitions by </w:t>
+            </w:r>
+            <w:proofErr w:type="spellStart"/>
+            <w:r>
+              <w:t>SystemId</w:t>
+            </w:r>
+            <w:proofErr w:type="spellEnd"/>
           </w:p>
         </w:tc>
         <w:tc>
@@ -3942,8 +4682,13 @@
             <w:hideMark/>
           </w:tcPr>
           <w:p>
-            <w:r>
-              <w:t>pb_visibility_scopes or equivalent is named and designed as PB runtime visibility authority</w:t>
+            <w:proofErr w:type="spellStart"/>
+            <w:r>
+              <w:t>pb_visibility_scopes</w:t>
+            </w:r>
+            <w:proofErr w:type="spellEnd"/>
+            <w:r>
+              <w:t xml:space="preserve"> or equivalent is named and designed as PB runtime visibility authority</w:t>
             </w:r>
           </w:p>
         </w:tc>
@@ -3996,8 +4741,13 @@
             <w:hideMark/>
           </w:tcPr>
           <w:p>
-            <w:r>
-              <w:t>pb_privacy_buckets remains untouched as SP import/export fidelity data</w:t>
+            <w:proofErr w:type="spellStart"/>
+            <w:r>
+              <w:t>pb_privacy_buckets</w:t>
+            </w:r>
+            <w:proofErr w:type="spellEnd"/>
+            <w:r>
+              <w:t xml:space="preserve"> remains untouched as SP import/export fidelity data</w:t>
             </w:r>
           </w:p>
         </w:tc>
@@ -4209,7 +4959,23 @@
           </w:tcPr>
           <w:p>
             <w:r>
-              <w:t>Account resolution, membership resolution, system resolution, authorization, data access, and error handling emit minimal structured trace facts with TraceId/CorrelationId and no sensitive content.</w:t>
+              <w:t xml:space="preserve">Account resolution, membership resolution, system resolution, authorization, data access, and error handling emit minimal structured trace facts with </w:t>
+            </w:r>
+            <w:proofErr w:type="spellStart"/>
+            <w:r>
+              <w:t>TraceId</w:t>
+            </w:r>
+            <w:proofErr w:type="spellEnd"/>
+            <w:r>
+              <w:t>/</w:t>
+            </w:r>
+            <w:proofErr w:type="spellStart"/>
+            <w:r>
+              <w:t>CorrelationId</w:t>
+            </w:r>
+            <w:proofErr w:type="spellEnd"/>
+            <w:r>
+              <w:t xml:space="preserve"> and no sensitive content.</w:t>
             </w:r>
           </w:p>
         </w:tc>
@@ -4262,7 +5028,23 @@
             </w:r>
             <w:r>
               <w:lastRenderedPageBreak/>
-              <w:t>file for existing PB_LEVEL1_TRACE entries, using the current ILogger trace boundary without adding new trace facts or changing /api/me behavior.</w:t>
+              <w:t xml:space="preserve">file for existing PB_LEVEL1_TRACE entries, using the current </w:t>
+            </w:r>
+            <w:proofErr w:type="spellStart"/>
+            <w:r>
+              <w:t>ILogger</w:t>
+            </w:r>
+            <w:proofErr w:type="spellEnd"/>
+            <w:r>
+              <w:t xml:space="preserve"> trace boundary without adding new trace facts or changing /</w:t>
+            </w:r>
+            <w:proofErr w:type="spellStart"/>
+            <w:r>
+              <w:t>api</w:t>
+            </w:r>
+            <w:proofErr w:type="spellEnd"/>
+            <w:r>
+              <w:t>/me behavior.</w:t>
             </w:r>
           </w:p>
         </w:tc>
@@ -4274,11 +5056,35 @@
           <w:p>
             <w:r>
               <w:lastRenderedPageBreak/>
-              <w:t xml:space="preserve">Running /api/me writes the existing Level 1 </w:t>
+              <w:t>Running /</w:t>
+            </w:r>
+            <w:proofErr w:type="spellStart"/>
+            <w:r>
+              <w:t>api</w:t>
+            </w:r>
+            <w:proofErr w:type="spellEnd"/>
+            <w:r>
+              <w:t xml:space="preserve">/me writes the existing Level 1 </w:t>
             </w:r>
             <w:r>
               <w:lastRenderedPageBreak/>
-              <w:t>trace entries to a local rolling log file, the file can be searched for PB_LEVEL1_TRACE, TraceId, CorrelationId, Stage, and Outcome, and the API still builds and returns the verified owner path.</w:t>
+              <w:t xml:space="preserve">trace entries to a local rolling log file, the file can be searched for PB_LEVEL1_TRACE, </w:t>
+            </w:r>
+            <w:proofErr w:type="spellStart"/>
+            <w:r>
+              <w:t>TraceId</w:t>
+            </w:r>
+            <w:proofErr w:type="spellEnd"/>
+            <w:r>
+              <w:t xml:space="preserve">, </w:t>
+            </w:r>
+            <w:proofErr w:type="spellStart"/>
+            <w:r>
+              <w:t>CorrelationId</w:t>
+            </w:r>
+            <w:proofErr w:type="spellEnd"/>
+            <w:r>
+              <w:t>, Stage, and Outcome, and the API still builds and returns the verified owner path.</w:t>
             </w:r>
           </w:p>
         </w:tc>
@@ -4425,7 +5231,23 @@
           </w:tcPr>
           <w:p>
             <w:r>
-              <w:t>System-scoped group support using pb_groups and pb_group_members, preserving Simply Plural group organization as data/import structure without turning groups into accounts, systems, memberships, roles, or security boundaries.</w:t>
+              <w:t xml:space="preserve">System-scoped group support using </w:t>
+            </w:r>
+            <w:proofErr w:type="spellStart"/>
+            <w:r>
+              <w:t>pb_groups</w:t>
+            </w:r>
+            <w:proofErr w:type="spellEnd"/>
+            <w:r>
+              <w:t xml:space="preserve"> and </w:t>
+            </w:r>
+            <w:proofErr w:type="spellStart"/>
+            <w:r>
+              <w:t>pb_group_members</w:t>
+            </w:r>
+            <w:proofErr w:type="spellEnd"/>
+            <w:r>
+              <w:t>, preserving Simply Plural group organization as data/import structure without turning groups into accounts, systems, memberships, roles, or security boundaries.</w:t>
             </w:r>
           </w:p>
         </w:tc>
@@ -4435,8 +5257,29 @@
             <w:vAlign w:val="center"/>
           </w:tcPr>
           <w:p>
-            <w:r>
-              <w:t>pb_groups exists, pb_group_members exists, group constraints exist, group membership is modeled many-to-many, SQL verification passes in SSMS, /api/me owner path remains unchanged, and the branch contains a commit named Add groups support schema.</w:t>
+            <w:proofErr w:type="spellStart"/>
+            <w:r>
+              <w:t>pb_groups</w:t>
+            </w:r>
+            <w:proofErr w:type="spellEnd"/>
+            <w:r>
+              <w:t xml:space="preserve"> exists, </w:t>
+            </w:r>
+            <w:proofErr w:type="spellStart"/>
+            <w:r>
+              <w:t>pb_group_members</w:t>
+            </w:r>
+            <w:proofErr w:type="spellEnd"/>
+            <w:r>
+              <w:t xml:space="preserve"> exists, group constraints exist, group membership is modeled many-to-many, SQL verification passes in SSMS, /</w:t>
+            </w:r>
+            <w:proofErr w:type="spellStart"/>
+            <w:r>
+              <w:t>api</w:t>
+            </w:r>
+            <w:proofErr w:type="spellEnd"/>
+            <w:r>
+              <w:t>/me owner path remains unchanged, and the branch contains a commit named Add groups support schema.</w:t>
             </w:r>
           </w:p>
         </w:tc>
@@ -4475,7 +5318,31 @@
           </w:tcPr>
           <w:p>
             <w:r>
-              <w:t>System hierarchy support through pb_system_relationships, allowing one root system row with ParentSystemId = NULL and future child system rows pointing to their parent system without changing the existing pb_systems schema or current membership spine.</w:t>
+              <w:t xml:space="preserve">System hierarchy support through </w:t>
+            </w:r>
+            <w:proofErr w:type="spellStart"/>
+            <w:r>
+              <w:t>pb_system_relationships</w:t>
+            </w:r>
+            <w:proofErr w:type="spellEnd"/>
+            <w:r>
+              <w:t xml:space="preserve">, allowing one root system row with </w:t>
+            </w:r>
+            <w:proofErr w:type="spellStart"/>
+            <w:r>
+              <w:t>ParentSystemId</w:t>
+            </w:r>
+            <w:proofErr w:type="spellEnd"/>
+            <w:r>
+              <w:t xml:space="preserve"> = NULL and future child system rows pointing to their parent system without changing the existing </w:t>
+            </w:r>
+            <w:proofErr w:type="spellStart"/>
+            <w:r>
+              <w:t>pb_systems</w:t>
+            </w:r>
+            <w:proofErr w:type="spellEnd"/>
+            <w:r>
+              <w:t xml:space="preserve"> schema or current membership spine.</w:t>
             </w:r>
           </w:p>
         </w:tc>
@@ -4485,8 +5352,21 @@
             <w:vAlign w:val="center"/>
           </w:tcPr>
           <w:p>
-            <w:r>
-              <w:t>pb_system_relationships exists, the current root system has a root relationship row, parent/child constraints exist, SQL verification passes in SSMS, /api/me owner path remains unchanged, and the branch contains a commit named Add child system relationship schema.</w:t>
+            <w:proofErr w:type="spellStart"/>
+            <w:r>
+              <w:t>pb_system_relationships</w:t>
+            </w:r>
+            <w:proofErr w:type="spellEnd"/>
+            <w:r>
+              <w:t xml:space="preserve"> exists, the current root system has a root relationship row, parent/child constraints exist, SQL verification passes in SSMS, /</w:t>
+            </w:r>
+            <w:proofErr w:type="spellStart"/>
+            <w:r>
+              <w:t>api</w:t>
+            </w:r>
+            <w:proofErr w:type="spellEnd"/>
+            <w:r>
+              <w:t>/me owner path remains unchanged, and the branch contains a commit named Add child system relationship schema.</w:t>
             </w:r>
           </w:p>
         </w:tc>
@@ -4513,9 +5393,11 @@
           <w:numId w:val="9"/>
         </w:numPr>
       </w:pPr>
+      <w:proofErr w:type="spellStart"/>
       <w:r>
         <w:t>pb_systems</w:t>
       </w:r>
+      <w:proofErr w:type="spellEnd"/>
     </w:p>
     <w:p>
       <w:pPr>
@@ -4525,9 +5407,11 @@
           <w:numId w:val="9"/>
         </w:numPr>
       </w:pPr>
+      <w:proofErr w:type="spellStart"/>
       <w:r>
         <w:t>pb_members</w:t>
       </w:r>
+      <w:proofErr w:type="spellEnd"/>
     </w:p>
     <w:p>
       <w:pPr>
@@ -4537,9 +5421,11 @@
           <w:numId w:val="9"/>
         </w:numPr>
       </w:pPr>
+      <w:proofErr w:type="spellStart"/>
       <w:r>
         <w:t>pb_front_history</w:t>
       </w:r>
+      <w:proofErr w:type="spellEnd"/>
     </w:p>
     <w:p>
       <w:pPr>
@@ -4549,9 +5435,11 @@
           <w:numId w:val="9"/>
         </w:numPr>
       </w:pPr>
+      <w:proofErr w:type="spellStart"/>
       <w:r>
         <w:t>pb_privacy_buckets</w:t>
       </w:r>
+      <w:proofErr w:type="spellEnd"/>
     </w:p>
     <w:p>
       <w:pPr>
@@ -4561,9 +5449,11 @@
           <w:numId w:val="9"/>
         </w:numPr>
       </w:pPr>
+      <w:proofErr w:type="spellStart"/>
       <w:r>
         <w:t>pb_custom_fields</w:t>
       </w:r>
+      <w:proofErr w:type="spellEnd"/>
     </w:p>
     <w:p>
       <w:r>
@@ -4579,9 +5469,11 @@
           <w:numId w:val="10"/>
         </w:numPr>
       </w:pPr>
+      <w:proofErr w:type="spellStart"/>
       <w:r>
         <w:t>pb_accounts</w:t>
       </w:r>
+      <w:proofErr w:type="spellEnd"/>
     </w:p>
     <w:p>
       <w:pPr>
@@ -4591,9 +5483,11 @@
           <w:numId w:val="10"/>
         </w:numPr>
       </w:pPr>
+      <w:proofErr w:type="spellStart"/>
       <w:r>
         <w:t>pb_account_statuses</w:t>
       </w:r>
+      <w:proofErr w:type="spellEnd"/>
     </w:p>
     <w:p>
       <w:pPr>
@@ -4603,9 +5497,11 @@
           <w:numId w:val="10"/>
         </w:numPr>
       </w:pPr>
+      <w:proofErr w:type="spellStart"/>
       <w:r>
         <w:t>pb_roles</w:t>
       </w:r>
+      <w:proofErr w:type="spellEnd"/>
     </w:p>
     <w:p>
       <w:pPr>
@@ -4615,9 +5511,11 @@
           <w:numId w:val="10"/>
         </w:numPr>
       </w:pPr>
+      <w:proofErr w:type="spellStart"/>
       <w:r>
         <w:t>pb_system_memberships</w:t>
       </w:r>
+      <w:proofErr w:type="spellEnd"/>
     </w:p>
     <w:p>
       <w:pPr>
@@ -4627,9 +5525,11 @@
           <w:numId w:val="10"/>
         </w:numPr>
       </w:pPr>
+      <w:proofErr w:type="spellStart"/>
       <w:r>
         <w:t>pb_system_membership_statuses</w:t>
       </w:r>
+      <w:proofErr w:type="spellEnd"/>
     </w:p>
     <w:p>
       <w:pPr>
@@ -4639,9 +5539,11 @@
           <w:numId w:val="10"/>
         </w:numPr>
       </w:pPr>
+      <w:proofErr w:type="spellStart"/>
       <w:r>
         <w:t>pb_groups</w:t>
       </w:r>
+      <w:proofErr w:type="spellEnd"/>
     </w:p>
     <w:p>
       <w:pPr>
@@ -4651,9 +5553,11 @@
           <w:numId w:val="10"/>
         </w:numPr>
       </w:pPr>
+      <w:proofErr w:type="spellStart"/>
       <w:r>
         <w:t>pb_group_members</w:t>
       </w:r>
+      <w:proofErr w:type="spellEnd"/>
     </w:p>
     <w:p>
       <w:pPr>
@@ -4663,9 +5567,11 @@
           <w:numId w:val="10"/>
         </w:numPr>
       </w:pPr>
+      <w:proofErr w:type="spellStart"/>
       <w:r>
         <w:t>pb_system_relationships</w:t>
       </w:r>
+      <w:proofErr w:type="spellEnd"/>
     </w:p>
     <w:p>
       <w:r>
@@ -4680,9 +5586,11 @@
           <w:numId w:val="11"/>
         </w:numPr>
       </w:pPr>
+      <w:proofErr w:type="spellStart"/>
       <w:r>
         <w:t>pb_visibility_scopes</w:t>
       </w:r>
+      <w:proofErr w:type="spellEnd"/>
     </w:p>
     <w:p>
       <w:pPr>
@@ -4693,7 +5601,15 @@
         </w:numPr>
       </w:pPr>
       <w:r>
-        <w:t>possibly pb_visibility_scope_assignments later</w:t>
+        <w:t xml:space="preserve">possibly </w:t>
+      </w:r>
+      <w:proofErr w:type="spellStart"/>
+      <w:r>
+        <w:t>pb_visibility_scope_assignments</w:t>
+      </w:r>
+      <w:proofErr w:type="spellEnd"/>
+      <w:r>
+        <w:t xml:space="preserve"> later</w:t>
       </w:r>
     </w:p>
     <w:p>
@@ -4705,7 +5621,15 @@
         </w:numPr>
       </w:pPr>
       <w:r>
-        <w:t>possibly pb_visibility_scope_entity_types later</w:t>
+        <w:t xml:space="preserve">possibly </w:t>
+      </w:r>
+      <w:proofErr w:type="spellStart"/>
+      <w:r>
+        <w:t>pb_visibility_scope_entity_types</w:t>
+      </w:r>
+      <w:proofErr w:type="spellEnd"/>
+      <w:r>
+        <w:t xml:space="preserve"> later</w:t>
       </w:r>
     </w:p>
     <w:p/>
@@ -4952,9 +5876,11 @@
           <w:numId w:val="12"/>
         </w:numPr>
       </w:pPr>
+      <w:proofErr w:type="spellStart"/>
       <w:r>
         <w:t>TraceId</w:t>
       </w:r>
+      <w:proofErr w:type="spellEnd"/>
     </w:p>
     <w:p>
       <w:pPr>
@@ -4964,9 +5890,19 @@
           <w:numId w:val="12"/>
         </w:numPr>
       </w:pPr>
-      <w:r>
-        <w:t>RequestId or CorrelationId</w:t>
-      </w:r>
+      <w:proofErr w:type="spellStart"/>
+      <w:r>
+        <w:t>RequestId</w:t>
+      </w:r>
+      <w:proofErr w:type="spellEnd"/>
+      <w:r>
+        <w:t xml:space="preserve"> or </w:t>
+      </w:r>
+      <w:proofErr w:type="spellStart"/>
+      <w:r>
+        <w:t>CorrelationId</w:t>
+      </w:r>
+      <w:proofErr w:type="spellEnd"/>
     </w:p>
     <w:p>
       <w:pPr>
@@ -4976,9 +5912,11 @@
           <w:numId w:val="12"/>
         </w:numPr>
       </w:pPr>
+      <w:proofErr w:type="spellStart"/>
       <w:r>
         <w:t>TimestampUtc</w:t>
       </w:r>
+      <w:proofErr w:type="spellEnd"/>
     </w:p>
     <w:p>
       <w:pPr>
@@ -4989,8 +5927,13 @@
         </w:numPr>
       </w:pPr>
       <w:r>
-        <w:t>Route / OperationName</w:t>
-      </w:r>
+        <w:t xml:space="preserve">Route / </w:t>
+      </w:r>
+      <w:proofErr w:type="spellStart"/>
+      <w:r>
+        <w:t>OperationName</w:t>
+      </w:r>
+      <w:proofErr w:type="spellEnd"/>
     </w:p>
     <w:p>
       <w:pPr>
@@ -5012,8 +5955,13 @@
           <w:numId w:val="12"/>
         </w:numPr>
       </w:pPr>
-      <w:r>
-        <w:t>FailureCode, if any</w:t>
+      <w:proofErr w:type="spellStart"/>
+      <w:r>
+        <w:t>FailureCode</w:t>
+      </w:r>
+      <w:proofErr w:type="spellEnd"/>
+      <w:r>
+        <w:t>, if any</w:t>
       </w:r>
     </w:p>
     <w:p>
@@ -5024,9 +5972,11 @@
           <w:numId w:val="12"/>
         </w:numPr>
       </w:pPr>
+      <w:proofErr w:type="spellStart"/>
       <w:r>
         <w:t>ElapsedMs</w:t>
       </w:r>
+      <w:proofErr w:type="spellEnd"/>
     </w:p>
     <w:p>
       <w:pPr>
@@ -5036,8 +5986,13 @@
           <w:numId w:val="12"/>
         </w:numPr>
       </w:pPr>
-      <w:r>
-        <w:t>AccountId, when resolved</w:t>
+      <w:proofErr w:type="spellStart"/>
+      <w:r>
+        <w:t>AccountId</w:t>
+      </w:r>
+      <w:proofErr w:type="spellEnd"/>
+      <w:r>
+        <w:t>, when resolved</w:t>
       </w:r>
     </w:p>
     <w:p>
@@ -5048,8 +6003,13 @@
           <w:numId w:val="12"/>
         </w:numPr>
       </w:pPr>
-      <w:r>
-        <w:t>SystemMembershipId, when resolved</w:t>
+      <w:proofErr w:type="spellStart"/>
+      <w:r>
+        <w:t>SystemMembershipId</w:t>
+      </w:r>
+      <w:proofErr w:type="spellEnd"/>
+      <w:r>
+        <w:t>, when resolved</w:t>
       </w:r>
     </w:p>
     <w:p>
@@ -5060,8 +6020,13 @@
           <w:numId w:val="12"/>
         </w:numPr>
       </w:pPr>
-      <w:r>
-        <w:t>SystemId, when resolved</w:t>
+      <w:proofErr w:type="spellStart"/>
+      <w:r>
+        <w:t>SystemId</w:t>
+      </w:r>
+      <w:proofErr w:type="spellEnd"/>
+      <w:r>
+        <w:t>, when resolved</w:t>
       </w:r>
     </w:p>
     <w:p>
@@ -5084,8 +6049,13 @@
           <w:numId w:val="12"/>
         </w:numPr>
       </w:pPr>
-      <w:r>
-        <w:t>ExceptionType, if any</w:t>
+      <w:proofErr w:type="spellStart"/>
+      <w:r>
+        <w:t>ExceptionType</w:t>
+      </w:r>
+      <w:proofErr w:type="spellEnd"/>
+      <w:r>
+        <w:t>, if any</w:t>
       </w:r>
     </w:p>
     <w:p>
@@ -5372,9 +6342,11 @@
       </w:r>
     </w:p>
     <w:p>
+      <w:proofErr w:type="spellStart"/>
       <w:r>
         <w:t>DiagnosticTraceMode</w:t>
       </w:r>
+      <w:proofErr w:type="spellEnd"/>
     </w:p>
     <w:p>
       <w:r>
@@ -5411,25 +6383,42 @@
       </w:r>
     </w:p>
     <w:p>
+      <w:proofErr w:type="spellStart"/>
       <w:r>
         <w:t>pb_diagnostic_trace_modes</w:t>
       </w:r>
+      <w:proofErr w:type="spellEnd"/>
       <w:r>
         <w:br/>
-        <w:t xml:space="preserve">  DiagnosticTraceModeId</w:t>
-      </w:r>
+        <w:t xml:space="preserve">  </w:t>
+      </w:r>
+      <w:proofErr w:type="spellStart"/>
+      <w:r>
+        <w:t>DiagnosticTraceModeId</w:t>
+      </w:r>
+      <w:proofErr w:type="spellEnd"/>
       <w:r>
         <w:br/>
         <w:t xml:space="preserve">  ModeName</w:t>
       </w:r>
       <w:r>
         <w:br/>
-        <w:t xml:space="preserve">  DisplayOrder</w:t>
-      </w:r>
+        <w:t xml:space="preserve">  </w:t>
+      </w:r>
+      <w:proofErr w:type="spellStart"/>
+      <w:r>
+        <w:t>DisplayOrder</w:t>
+      </w:r>
+      <w:proofErr w:type="spellEnd"/>
       <w:r>
         <w:br/>
-        <w:t xml:space="preserve">  IsActive</w:t>
-      </w:r>
+        <w:t xml:space="preserve">  </w:t>
+      </w:r>
+      <w:proofErr w:type="spellStart"/>
+      <w:r>
+        <w:t>IsActive</w:t>
+      </w:r>
+      <w:proofErr w:type="spellEnd"/>
     </w:p>
     <w:p>
       <w:r>
@@ -5471,7 +6460,15 @@
         </w:numPr>
       </w:pPr>
       <w:r>
-        <w:t>Expanded diagnostic tracing is active only when DiagnosticTraceMode = Expanded or an equivalent runtime flag is enabled.</w:t>
+        <w:t xml:space="preserve">Expanded diagnostic tracing is active only when </w:t>
+      </w:r>
+      <w:proofErr w:type="spellStart"/>
+      <w:r>
+        <w:t>DiagnosticTraceMode</w:t>
+      </w:r>
+      <w:proofErr w:type="spellEnd"/>
+      <w:r>
+        <w:t xml:space="preserve"> = Expanded or an equivalent runtime flag is enabled.</w:t>
       </w:r>
     </w:p>
     <w:p>
@@ -5526,9 +6523,11 @@
             <w:pPr>
               <w:spacing w:after="160" w:line="278" w:lineRule="auto"/>
             </w:pPr>
+            <w:proofErr w:type="spellStart"/>
             <w:r>
               <w:t>pb_diagnostic_trace_areas</w:t>
             </w:r>
+            <w:proofErr w:type="spellEnd"/>
             <w:r>
               <w:br/>
             </w:r>
@@ -5538,16 +6537,31 @@
             </w:r>
             <w:r>
               <w:br/>
-              <w:t xml:space="preserve">  AreaName</w:t>
-            </w:r>
+              <w:t xml:space="preserve">  </w:t>
+            </w:r>
+            <w:proofErr w:type="spellStart"/>
+            <w:r>
+              <w:t>AreaName</w:t>
+            </w:r>
+            <w:proofErr w:type="spellEnd"/>
             <w:r>
               <w:br/>
-              <w:t xml:space="preserve">  DisplayOrder</w:t>
-            </w:r>
+              <w:t xml:space="preserve">  </w:t>
+            </w:r>
+            <w:proofErr w:type="spellStart"/>
+            <w:r>
+              <w:t>DisplayOrder</w:t>
+            </w:r>
+            <w:proofErr w:type="spellEnd"/>
             <w:r>
               <w:br/>
-              <w:t xml:space="preserve">  IsActive</w:t>
-            </w:r>
+              <w:t xml:space="preserve">  </w:t>
+            </w:r>
+            <w:proofErr w:type="spellStart"/>
+            <w:r>
+              <w:t>IsActive</w:t>
+            </w:r>
+            <w:proofErr w:type="spellEnd"/>
           </w:p>
         </w:tc>
         <w:tc>
@@ -5558,53 +6572,93 @@
             <w:pPr>
               <w:spacing w:after="160" w:line="278" w:lineRule="auto"/>
             </w:pPr>
+            <w:proofErr w:type="spellStart"/>
             <w:r>
               <w:lastRenderedPageBreak/>
               <w:t>AccountDiag</w:t>
             </w:r>
+            <w:proofErr w:type="spellEnd"/>
             <w:r>
               <w:br/>
             </w:r>
+            <w:proofErr w:type="spellStart"/>
             <w:r>
               <w:lastRenderedPageBreak/>
               <w:t>MembershipDiag</w:t>
             </w:r>
+            <w:proofErr w:type="spellEnd"/>
             <w:r>
               <w:br/>
+            </w:r>
+            <w:proofErr w:type="spellStart"/>
+            <w:r>
               <w:t>AuthorizationDiag</w:t>
             </w:r>
+            <w:proofErr w:type="spellEnd"/>
             <w:r>
               <w:br/>
+            </w:r>
+            <w:proofErr w:type="spellStart"/>
+            <w:r>
               <w:t>VisibilityDiag</w:t>
             </w:r>
+            <w:proofErr w:type="spellEnd"/>
             <w:r>
               <w:br/>
+            </w:r>
+            <w:proofErr w:type="spellStart"/>
+            <w:r>
               <w:t>DataAccessDiag</w:t>
             </w:r>
+            <w:proofErr w:type="spellEnd"/>
             <w:r>
               <w:br/>
+            </w:r>
+            <w:proofErr w:type="spellStart"/>
+            <w:r>
               <w:t>ImportDiag</w:t>
             </w:r>
+            <w:proofErr w:type="spellEnd"/>
             <w:r>
               <w:br/>
+            </w:r>
+            <w:proofErr w:type="spellStart"/>
+            <w:r>
               <w:t>ExportDiag</w:t>
             </w:r>
+            <w:proofErr w:type="spellEnd"/>
             <w:r>
               <w:br/>
+            </w:r>
+            <w:proofErr w:type="spellStart"/>
+            <w:r>
               <w:t>ConfigDiag</w:t>
             </w:r>
+            <w:proofErr w:type="spellEnd"/>
             <w:r>
               <w:br/>
+            </w:r>
+            <w:proofErr w:type="spellStart"/>
+            <w:r>
               <w:t>ApiDiag</w:t>
             </w:r>
+            <w:proofErr w:type="spellEnd"/>
             <w:r>
               <w:br/>
+            </w:r>
+            <w:proofErr w:type="spellStart"/>
+            <w:r>
               <w:t>UiDiag</w:t>
             </w:r>
+            <w:proofErr w:type="spellEnd"/>
             <w:r>
               <w:br/>
+            </w:r>
+            <w:proofErr w:type="spellStart"/>
+            <w:r>
               <w:t>ErrorDiag</w:t>
             </w:r>
+            <w:proofErr w:type="spellEnd"/>
           </w:p>
         </w:tc>
       </w:tr>
@@ -5624,7 +6678,23 @@
         </w:numPr>
       </w:pPr>
       <w:r>
-        <w:t>Turn on ImportDiag without turning on UiDiag.</w:t>
+        <w:t xml:space="preserve">Turn on </w:t>
+      </w:r>
+      <w:proofErr w:type="spellStart"/>
+      <w:r>
+        <w:t>ImportDiag</w:t>
+      </w:r>
+      <w:proofErr w:type="spellEnd"/>
+      <w:r>
+        <w:t xml:space="preserve"> without turning on </w:t>
+      </w:r>
+      <w:proofErr w:type="spellStart"/>
+      <w:r>
+        <w:t>UiDiag</w:t>
+      </w:r>
+      <w:proofErr w:type="spellEnd"/>
+      <w:r>
+        <w:t>.</w:t>
       </w:r>
     </w:p>
     <w:p>
@@ -5636,7 +6706,23 @@
         </w:numPr>
       </w:pPr>
       <w:r>
-        <w:t>Turn on VisibilityDiag without turning on ImportDiag.</w:t>
+        <w:t xml:space="preserve">Turn on </w:t>
+      </w:r>
+      <w:proofErr w:type="spellStart"/>
+      <w:r>
+        <w:t>VisibilityDiag</w:t>
+      </w:r>
+      <w:proofErr w:type="spellEnd"/>
+      <w:r>
+        <w:t xml:space="preserve"> without turning on </w:t>
+      </w:r>
+      <w:proofErr w:type="spellStart"/>
+      <w:r>
+        <w:t>ImportDiag</w:t>
+      </w:r>
+      <w:proofErr w:type="spellEnd"/>
+      <w:r>
+        <w:t>.</w:t>
       </w:r>
     </w:p>
     <w:p>
@@ -5648,7 +6734,15 @@
         </w:numPr>
       </w:pPr>
       <w:r>
-        <w:t>Turn on AuthorizationDiag without dumping every data-access detail.</w:t>
+        <w:t xml:space="preserve">Turn on </w:t>
+      </w:r>
+      <w:proofErr w:type="spellStart"/>
+      <w:r>
+        <w:t>AuthorizationDiag</w:t>
+      </w:r>
+      <w:proofErr w:type="spellEnd"/>
+      <w:r>
+        <w:t xml:space="preserve"> without dumping every data-access detail.</w:t>
       </w:r>
     </w:p>
     <w:p>
@@ -5698,9 +6792,11 @@
           <w:numId w:val="17"/>
         </w:numPr>
       </w:pPr>
+      <w:proofErr w:type="spellStart"/>
       <w:r>
         <w:t>ImportDiag</w:t>
       </w:r>
+      <w:proofErr w:type="spellEnd"/>
     </w:p>
     <w:p>
       <w:pPr>
@@ -5710,9 +6806,11 @@
           <w:numId w:val="17"/>
         </w:numPr>
       </w:pPr>
+      <w:proofErr w:type="spellStart"/>
       <w:r>
         <w:t>VisibilityDiag</w:t>
       </w:r>
+      <w:proofErr w:type="spellEnd"/>
     </w:p>
     <w:p>
       <w:pPr>
@@ -5722,9 +6820,11 @@
           <w:numId w:val="17"/>
         </w:numPr>
       </w:pPr>
+      <w:proofErr w:type="spellStart"/>
       <w:r>
         <w:t>AuthorizationDiag</w:t>
       </w:r>
+      <w:proofErr w:type="spellEnd"/>
     </w:p>
     <w:p>
       <w:r>
@@ -5783,9 +6883,11 @@
           <w:numId w:val="19"/>
         </w:numPr>
       </w:pPr>
+      <w:proofErr w:type="spellStart"/>
       <w:r>
         <w:t>AccountDiag</w:t>
       </w:r>
+      <w:proofErr w:type="spellEnd"/>
     </w:p>
     <w:p>
       <w:pPr>
@@ -5795,9 +6897,11 @@
           <w:numId w:val="19"/>
         </w:numPr>
       </w:pPr>
+      <w:proofErr w:type="spellStart"/>
       <w:r>
         <w:t>MembershipDiag</w:t>
       </w:r>
+      <w:proofErr w:type="spellEnd"/>
     </w:p>
     <w:p>
       <w:pPr>
@@ -5807,9 +6911,11 @@
           <w:numId w:val="19"/>
         </w:numPr>
       </w:pPr>
+      <w:proofErr w:type="spellStart"/>
       <w:r>
         <w:t>AuthorizationDiag</w:t>
       </w:r>
+      <w:proofErr w:type="spellEnd"/>
     </w:p>
     <w:p>
       <w:pPr>
@@ -5819,9 +6925,11 @@
           <w:numId w:val="19"/>
         </w:numPr>
       </w:pPr>
+      <w:proofErr w:type="spellStart"/>
       <w:r>
         <w:t>VisibilityDiag</w:t>
       </w:r>
+      <w:proofErr w:type="spellEnd"/>
     </w:p>
     <w:p>
       <w:pPr>
@@ -5831,9 +6939,11 @@
           <w:numId w:val="19"/>
         </w:numPr>
       </w:pPr>
+      <w:proofErr w:type="spellStart"/>
       <w:r>
         <w:t>DataAccessDiag</w:t>
       </w:r>
+      <w:proofErr w:type="spellEnd"/>
     </w:p>
     <w:p>
       <w:pPr>
@@ -5843,9 +6953,11 @@
           <w:numId w:val="19"/>
         </w:numPr>
       </w:pPr>
+      <w:proofErr w:type="spellStart"/>
       <w:r>
         <w:t>ConfigDiag</w:t>
       </w:r>
+      <w:proofErr w:type="spellEnd"/>
     </w:p>
     <w:p>
       <w:pPr>
@@ -5855,9 +6967,11 @@
           <w:numId w:val="19"/>
         </w:numPr>
       </w:pPr>
+      <w:proofErr w:type="spellStart"/>
       <w:r>
         <w:t>ApiDiag</w:t>
       </w:r>
+      <w:proofErr w:type="spellEnd"/>
     </w:p>
     <w:p>
       <w:pPr>
@@ -5867,10 +6981,12 @@
           <w:numId w:val="19"/>
         </w:numPr>
       </w:pPr>
+      <w:proofErr w:type="spellStart"/>
       <w:r>
         <w:lastRenderedPageBreak/>
         <w:t>ErrorDiag</w:t>
       </w:r>
+      <w:proofErr w:type="spellEnd"/>
     </w:p>
     <w:p>
       <w:r>
@@ -5885,9 +7001,11 @@
           <w:numId w:val="20"/>
         </w:numPr>
       </w:pPr>
+      <w:proofErr w:type="spellStart"/>
       <w:r>
         <w:t>ImportDiag</w:t>
       </w:r>
+      <w:proofErr w:type="spellEnd"/>
     </w:p>
     <w:p>
       <w:pPr>
@@ -5897,9 +7015,11 @@
           <w:numId w:val="20"/>
         </w:numPr>
       </w:pPr>
+      <w:proofErr w:type="spellStart"/>
       <w:r>
         <w:t>ExportDiag</w:t>
       </w:r>
+      <w:proofErr w:type="spellEnd"/>
     </w:p>
     <w:p>
       <w:pPr>
@@ -5909,9 +7029,11 @@
           <w:numId w:val="20"/>
         </w:numPr>
       </w:pPr>
+      <w:proofErr w:type="spellStart"/>
       <w:r>
         <w:t>UiDiag</w:t>
       </w:r>
+      <w:proofErr w:type="spellEnd"/>
     </w:p>
     <w:p>
       <w:pPr>
@@ -5921,9 +7043,11 @@
           <w:numId w:val="20"/>
         </w:numPr>
       </w:pPr>
+      <w:proofErr w:type="spellStart"/>
       <w:r>
         <w:t>NotificationDiag</w:t>
       </w:r>
+      <w:proofErr w:type="spellEnd"/>
     </w:p>
     <w:p>
       <w:pPr>
@@ -5983,7 +7107,15 @@
         </w:numPr>
       </w:pPr>
       <w:r>
-        <w:t>Existing Xlat data remains unchanged.</w:t>
+        <w:t xml:space="preserve">Existing </w:t>
+      </w:r>
+      <w:proofErr w:type="spellStart"/>
+      <w:r>
+        <w:t>Xlat</w:t>
+      </w:r>
+      <w:proofErr w:type="spellEnd"/>
+      <w:r>
+        <w:t xml:space="preserve"> data remains unchanged.</w:t>
       </w:r>
     </w:p>
     <w:p>
@@ -6106,7 +7238,15 @@
     </w:p>
     <w:p>
       <w:r>
-        <w:t>Build the first real editable PluralBridge data path:</w:t>
+        <w:t xml:space="preserve">Build the first real editable </w:t>
+      </w:r>
+      <w:proofErr w:type="spellStart"/>
+      <w:r>
+        <w:t>PluralBridge</w:t>
+      </w:r>
+      <w:proofErr w:type="spellEnd"/>
+      <w:r>
+        <w:t xml:space="preserve"> data path:</w:t>
       </w:r>
     </w:p>
     <w:p>
@@ -6165,8 +7305,13 @@
           <w:numId w:val="27"/>
         </w:numPr>
       </w:pPr>
-      <w:r>
-        <w:t>SystemId enforcement</w:t>
+      <w:proofErr w:type="spellStart"/>
+      <w:r>
+        <w:t>SystemId</w:t>
+      </w:r>
+      <w:proofErr w:type="spellEnd"/>
+      <w:r>
+        <w:t xml:space="preserve"> enforcement</w:t>
       </w:r>
     </w:p>
     <w:p>
@@ -6214,6 +7359,14 @@
     <w:p>
       <w:r>
         <w:t>Task 2 = request/response contract design</w:t>
+      </w:r>
+    </w:p>
+    <w:p>
+      <w:r>
+        <w:t xml:space="preserve">Task 2A = </w:t>
+      </w:r>
+      <w:r>
+        <w:t>protected browser app structure before member read/add/edit UI work expands</w:t>
       </w:r>
     </w:p>
     <w:p>
@@ -6471,11 +7624,8 @@
               <w:spacing w:after="0"/>
             </w:pPr>
             <w:r>
-              <w:t xml:space="preserve">bulk import behavior is explicitly out </w:t>
-            </w:r>
-            <w:r>
               <w:lastRenderedPageBreak/>
-              <w:t>of scope</w:t>
+              <w:t>bulk import behavior is explicitly out of scope</w:t>
             </w:r>
           </w:p>
           <w:p>
@@ -6661,8 +7811,13 @@
               </w:numPr>
               <w:spacing w:after="0"/>
             </w:pPr>
-            <w:r>
-              <w:t>SystemId handling is defined</w:t>
+            <w:proofErr w:type="spellStart"/>
+            <w:r>
+              <w:t>SystemId</w:t>
+            </w:r>
+            <w:proofErr w:type="spellEnd"/>
+            <w:r>
+              <w:t xml:space="preserve"> handling is defined</w:t>
             </w:r>
           </w:p>
           <w:p>
@@ -6704,7 +7859,6 @@
               <w:t>write success response shape is defined</w:t>
             </w:r>
           </w:p>
-          <w:p/>
         </w:tc>
       </w:tr>
       <w:tr>
@@ -6714,10 +7868,282 @@
         <w:tc>
           <w:tcPr>
             <w:tcW w:w="810" w:type="dxa"/>
-            <w:vAlign w:val="center"/>
-          </w:tcPr>
-          <w:p>
-            <w:r>
+            <w:tcBorders>
+              <w:top w:val="single" w:sz="4" w:space="0" w:color="auto"/>
+            </w:tcBorders>
+            <w:vAlign w:val="center"/>
+          </w:tcPr>
+          <w:p>
+            <w:r>
+              <w:t>2A</w:t>
+            </w:r>
+          </w:p>
+        </w:tc>
+        <w:tc>
+          <w:tcPr>
+            <w:tcW w:w="1410" w:type="dxa"/>
+            <w:tcBorders>
+              <w:top w:val="single" w:sz="4" w:space="0" w:color="auto"/>
+            </w:tcBorders>
+            <w:vAlign w:val="center"/>
+          </w:tcPr>
+          <w:p>
+            <w:r>
+              <w:t>Define protected browser app structure and UI functional rules.</w:t>
+            </w:r>
+          </w:p>
+        </w:tc>
+        <w:tc>
+          <w:tcPr>
+            <w:tcW w:w="3390" w:type="dxa"/>
+            <w:tcBorders>
+              <w:top w:val="single" w:sz="4" w:space="0" w:color="auto"/>
+            </w:tcBorders>
+            <w:vAlign w:val="center"/>
+          </w:tcPr>
+          <w:p>
+            <w:r>
+              <w:t>A functional browser app structure that prevents app.js and app.css from becoming dumping grounds while keeping the files editable in VS2022.</w:t>
+            </w:r>
+          </w:p>
+        </w:tc>
+        <w:tc>
+          <w:tcPr>
+            <w:tcW w:w="4545" w:type="dxa"/>
+            <w:tcBorders>
+              <w:top w:val="single" w:sz="4" w:space="0" w:color="auto"/>
+            </w:tcBorders>
+            <w:vAlign w:val="center"/>
+          </w:tcPr>
+          <w:p>
+            <w:pPr>
+              <w:pStyle w:val="ListParagraph"/>
+              <w:numPr>
+                <w:ilvl w:val="0"/>
+                <w:numId w:val="37"/>
+              </w:numPr>
+              <w:spacing w:after="0"/>
+            </w:pPr>
+            <w:r>
+              <w:t>app source folder is chosen</w:t>
+            </w:r>
+          </w:p>
+          <w:p>
+            <w:pPr>
+              <w:pStyle w:val="ListParagraph"/>
+              <w:numPr>
+                <w:ilvl w:val="0"/>
+                <w:numId w:val="37"/>
+              </w:numPr>
+              <w:spacing w:after="0"/>
+            </w:pPr>
+            <w:r>
+              <w:t>served app folder is identified</w:t>
+            </w:r>
+          </w:p>
+          <w:p>
+            <w:pPr>
+              <w:pStyle w:val="ListParagraph"/>
+              <w:numPr>
+                <w:ilvl w:val="0"/>
+                <w:numId w:val="37"/>
+              </w:numPr>
+              <w:spacing w:after="0"/>
+            </w:pPr>
+            <w:r>
+              <w:t>VS solution visibility is defined</w:t>
+            </w:r>
+          </w:p>
+          <w:p>
+            <w:pPr>
+              <w:pStyle w:val="ListParagraph"/>
+              <w:numPr>
+                <w:ilvl w:val="0"/>
+                <w:numId w:val="37"/>
+              </w:numPr>
+              <w:spacing w:after="0"/>
+            </w:pPr>
+            <w:r>
+              <w:t>app source remains outside ASP.NET compile ownership</w:t>
+            </w:r>
+          </w:p>
+          <w:p>
+            <w:pPr>
+              <w:pStyle w:val="ListParagraph"/>
+              <w:numPr>
+                <w:ilvl w:val="0"/>
+                <w:numId w:val="37"/>
+              </w:numPr>
+              <w:spacing w:after="0"/>
+            </w:pPr>
+            <w:r>
+              <w:t>copy/build path is defined</w:t>
+            </w:r>
+          </w:p>
+          <w:p>
+            <w:pPr>
+              <w:pStyle w:val="ListParagraph"/>
+              <w:numPr>
+                <w:ilvl w:val="0"/>
+                <w:numId w:val="37"/>
+              </w:numPr>
+              <w:spacing w:after="0"/>
+            </w:pPr>
+            <w:r>
+              <w:t>JavaScript module layout is defined</w:t>
+            </w:r>
+          </w:p>
+          <w:p>
+            <w:pPr>
+              <w:pStyle w:val="ListParagraph"/>
+              <w:numPr>
+                <w:ilvl w:val="0"/>
+                <w:numId w:val="37"/>
+              </w:numPr>
+              <w:spacing w:after="0"/>
+            </w:pPr>
+            <w:r>
+              <w:t>CSS split is defined</w:t>
+            </w:r>
+          </w:p>
+          <w:p>
+            <w:pPr>
+              <w:pStyle w:val="ListParagraph"/>
+              <w:numPr>
+                <w:ilvl w:val="0"/>
+                <w:numId w:val="37"/>
+              </w:numPr>
+              <w:spacing w:after="0"/>
+            </w:pPr>
+            <w:r>
+              <w:t>API client boundary is defined</w:t>
+            </w:r>
+          </w:p>
+          <w:p>
+            <w:pPr>
+              <w:pStyle w:val="ListParagraph"/>
+              <w:numPr>
+                <w:ilvl w:val="0"/>
+                <w:numId w:val="37"/>
+              </w:numPr>
+              <w:spacing w:after="0"/>
+            </w:pPr>
+            <w:r>
+              <w:t>member view boundary is defined</w:t>
+            </w:r>
+          </w:p>
+          <w:p>
+            <w:pPr>
+              <w:pStyle w:val="ListParagraph"/>
+              <w:numPr>
+                <w:ilvl w:val="0"/>
+                <w:numId w:val="37"/>
+              </w:numPr>
+              <w:spacing w:after="0"/>
+            </w:pPr>
+            <w:r>
+              <w:t>member form boundary is defined</w:t>
+            </w:r>
+          </w:p>
+          <w:p>
+            <w:pPr>
+              <w:pStyle w:val="ListParagraph"/>
+              <w:numPr>
+                <w:ilvl w:val="0"/>
+                <w:numId w:val="37"/>
+              </w:numPr>
+              <w:spacing w:after="0"/>
+            </w:pPr>
+            <w:r>
+              <w:t>developer tools panel boundary is defined</w:t>
+            </w:r>
+          </w:p>
+          <w:p>
+            <w:pPr>
+              <w:pStyle w:val="ListParagraph"/>
+              <w:numPr>
+                <w:ilvl w:val="0"/>
+                <w:numId w:val="37"/>
+              </w:numPr>
+              <w:spacing w:after="0"/>
+            </w:pPr>
+            <w:r>
+              <w:t>developer tools are collapsible when enabled</w:t>
+            </w:r>
+          </w:p>
+          <w:p>
+            <w:pPr>
+              <w:pStyle w:val="ListParagraph"/>
+              <w:numPr>
+                <w:ilvl w:val="0"/>
+                <w:numId w:val="37"/>
+              </w:numPr>
+              <w:spacing w:after="0"/>
+            </w:pPr>
+            <w:r>
+              <w:t>developer tools are not rendered in production</w:t>
+            </w:r>
+          </w:p>
+          <w:p>
+            <w:pPr>
+              <w:pStyle w:val="ListParagraph"/>
+              <w:numPr>
+                <w:ilvl w:val="0"/>
+                <w:numId w:val="37"/>
+              </w:numPr>
+              <w:spacing w:after="0"/>
+            </w:pPr>
+            <w:r>
+              <w:t>existing test buttons move into developer tools</w:t>
+            </w:r>
+          </w:p>
+          <w:p>
+            <w:pPr>
+              <w:pStyle w:val="ListParagraph"/>
+              <w:numPr>
+                <w:ilvl w:val="0"/>
+                <w:numId w:val="37"/>
+              </w:numPr>
+              <w:spacing w:after="0"/>
+            </w:pPr>
+            <w:r>
+              <w:t xml:space="preserve">normal user UI remains the default </w:t>
+            </w:r>
+            <w:r>
+              <w:lastRenderedPageBreak/>
+              <w:t>surface</w:t>
+            </w:r>
+          </w:p>
+          <w:p>
+            <w:pPr>
+              <w:pStyle w:val="ListParagraph"/>
+              <w:numPr>
+                <w:ilvl w:val="0"/>
+                <w:numId w:val="37"/>
+              </w:numPr>
+              <w:spacing w:after="0"/>
+            </w:pPr>
+            <w:r>
+              <w:t>visual polish remains deferred</w:t>
+            </w:r>
+          </w:p>
+        </w:tc>
+      </w:tr>
+      <w:tr>
+        <w:trPr>
+          <w:tblCellSpacing w:w="15" w:type="dxa"/>
+        </w:trPr>
+        <w:tc>
+          <w:tcPr>
+            <w:tcW w:w="810" w:type="dxa"/>
+            <w:tcBorders>
+              <w:top w:val="single" w:sz="4" w:space="0" w:color="auto"/>
+            </w:tcBorders>
+            <w:vAlign w:val="center"/>
+          </w:tcPr>
+          <w:p>
+            <w:r>
+              <w:lastRenderedPageBreak/>
               <w:t>3</w:t>
             </w:r>
           </w:p>
@@ -6725,6 +8151,9 @@
         <w:tc>
           <w:tcPr>
             <w:tcW w:w="1410" w:type="dxa"/>
+            <w:tcBorders>
+              <w:top w:val="single" w:sz="4" w:space="0" w:color="auto"/>
+            </w:tcBorders>
             <w:vAlign w:val="center"/>
           </w:tcPr>
           <w:p>
@@ -6736,6 +8165,9 @@
         <w:tc>
           <w:tcPr>
             <w:tcW w:w="3390" w:type="dxa"/>
+            <w:tcBorders>
+              <w:top w:val="single" w:sz="4" w:space="0" w:color="auto"/>
+            </w:tcBorders>
             <w:vAlign w:val="center"/>
           </w:tcPr>
           <w:p>
@@ -6747,6 +8179,9 @@
         <w:tc>
           <w:tcPr>
             <w:tcW w:w="4545" w:type="dxa"/>
+            <w:tcBorders>
+              <w:top w:val="single" w:sz="4" w:space="0" w:color="auto"/>
+            </w:tcBorders>
             <w:vAlign w:val="center"/>
           </w:tcPr>
           <w:p>
@@ -6772,8 +8207,13 @@
               <w:spacing w:after="0"/>
             </w:pPr>
             <w:r>
-              <w:t>audit records include AccountId</w:t>
-            </w:r>
+              <w:t xml:space="preserve">audit records include </w:t>
+            </w:r>
+            <w:proofErr w:type="spellStart"/>
+            <w:r>
+              <w:t>AccountId</w:t>
+            </w:r>
+            <w:proofErr w:type="spellEnd"/>
           </w:p>
           <w:p>
             <w:pPr>
@@ -6785,8 +8225,13 @@
               <w:spacing w:after="0"/>
             </w:pPr>
             <w:r>
-              <w:t>audit records include SystemId</w:t>
-            </w:r>
+              <w:t xml:space="preserve">audit records include </w:t>
+            </w:r>
+            <w:proofErr w:type="spellStart"/>
+            <w:r>
+              <w:t>SystemId</w:t>
+            </w:r>
+            <w:proofErr w:type="spellEnd"/>
           </w:p>
           <w:p>
             <w:pPr>
@@ -6798,8 +8243,13 @@
               <w:spacing w:after="0"/>
             </w:pPr>
             <w:r>
-              <w:t>audit records include MembershipId</w:t>
-            </w:r>
+              <w:t xml:space="preserve">audit records include </w:t>
+            </w:r>
+            <w:proofErr w:type="spellStart"/>
+            <w:r>
+              <w:t>MembershipId</w:t>
+            </w:r>
+            <w:proofErr w:type="spellEnd"/>
           </w:p>
           <w:p>
             <w:pPr>
@@ -6863,8 +8313,13 @@
               <w:spacing w:after="0"/>
             </w:pPr>
             <w:r>
-              <w:t>audit records include CreatedAtUtc</w:t>
-            </w:r>
+              <w:t xml:space="preserve">audit records include </w:t>
+            </w:r>
+            <w:proofErr w:type="spellStart"/>
+            <w:r>
+              <w:t>CreatedAtUtc</w:t>
+            </w:r>
+            <w:proofErr w:type="spellEnd"/>
           </w:p>
           <w:p>
             <w:pPr>
@@ -6934,6 +8389,168 @@
           </w:tcPr>
           <w:p>
             <w:r>
+              <w:t>3A</w:t>
+            </w:r>
+          </w:p>
+        </w:tc>
+        <w:tc>
+          <w:tcPr>
+            <w:tcW w:w="1410" w:type="dxa"/>
+            <w:tcBorders>
+              <w:top w:val="single" w:sz="4" w:space="0" w:color="auto"/>
+            </w:tcBorders>
+            <w:vAlign w:val="center"/>
+          </w:tcPr>
+          <w:p>
+            <w:r>
+              <w:t>UI Follow-Through</w:t>
+            </w:r>
+          </w:p>
+        </w:tc>
+        <w:tc>
+          <w:tcPr>
+            <w:tcW w:w="3390" w:type="dxa"/>
+            <w:tcBorders>
+              <w:top w:val="single" w:sz="4" w:space="0" w:color="auto"/>
+            </w:tcBorders>
+            <w:vAlign w:val="center"/>
+          </w:tcPr>
+          <w:p>
+            <w:r>
+              <w:t>A</w:t>
+            </w:r>
+            <w:r>
+              <w:t xml:space="preserve">pplies </w:t>
+            </w:r>
+            <w:proofErr w:type="spellStart"/>
+            <w:r>
+              <w:t>AccessContext</w:t>
+            </w:r>
+            <w:proofErr w:type="spellEnd"/>
+            <w:r>
+              <w:t xml:space="preserve"> enforcement to remaining API endpoints.</w:t>
+            </w:r>
+          </w:p>
+        </w:tc>
+        <w:tc>
+          <w:tcPr>
+            <w:tcW w:w="4545" w:type="dxa"/>
+            <w:tcBorders>
+              <w:top w:val="single" w:sz="4" w:space="0" w:color="auto"/>
+            </w:tcBorders>
+            <w:vAlign w:val="center"/>
+          </w:tcPr>
+          <w:p>
+            <w:pPr>
+              <w:pStyle w:val="ListParagraph"/>
+              <w:spacing w:after="0"/>
+            </w:pPr>
+            <w:r>
+              <w:t xml:space="preserve">As each read endpoint gets </w:t>
+            </w:r>
+            <w:proofErr w:type="spellStart"/>
+            <w:r>
+              <w:t>AccessContext</w:t>
+            </w:r>
+            <w:proofErr w:type="spellEnd"/>
+            <w:r>
+              <w:t xml:space="preserve"> enforcement, the demo app keeps using it through the protected session.</w:t>
+            </w:r>
+          </w:p>
+          <w:p>
+            <w:pPr>
+              <w:pStyle w:val="ListParagraph"/>
+              <w:spacing w:after="0"/>
+            </w:pPr>
+          </w:p>
+          <w:p>
+            <w:pPr>
+              <w:pStyle w:val="ListParagraph"/>
+              <w:spacing w:after="0"/>
+            </w:pPr>
+            <w:r>
+              <w:t>No major redesign.</w:t>
+            </w:r>
+          </w:p>
+          <w:p>
+            <w:pPr>
+              <w:pStyle w:val="ListParagraph"/>
+              <w:spacing w:after="0"/>
+            </w:pPr>
+            <w:r>
+              <w:t>No new operational console.</w:t>
+            </w:r>
+          </w:p>
+          <w:p>
+            <w:pPr>
+              <w:pStyle w:val="ListParagraph"/>
+              <w:spacing w:after="0"/>
+            </w:pPr>
+            <w:r>
+              <w:t>No bulk UI rebuild.</w:t>
+            </w:r>
+          </w:p>
+          <w:p>
+            <w:pPr>
+              <w:pStyle w:val="ListParagraph"/>
+              <w:spacing w:after="0"/>
+            </w:pPr>
+          </w:p>
+          <w:p>
+            <w:pPr>
+              <w:pStyle w:val="ListParagraph"/>
+              <w:spacing w:after="0"/>
+            </w:pPr>
+            <w:r>
+              <w:t>Standing Rule For Future Chapters</w:t>
+            </w:r>
+          </w:p>
+          <w:p>
+            <w:pPr>
+              <w:pStyle w:val="ListParagraph"/>
+              <w:spacing w:after="0"/>
+            </w:pPr>
+          </w:p>
+          <w:p>
+            <w:pPr>
+              <w:pStyle w:val="ListParagraph"/>
+              <w:spacing w:after="0"/>
+            </w:pPr>
+            <w:r>
+              <w:t>Every API/runtime task that changes user-visible behavior gets a matching browser follow-through step before the task is closed.</w:t>
+            </w:r>
+          </w:p>
+          <w:p>
+            <w:pPr>
+              <w:pStyle w:val="ListParagraph"/>
+              <w:spacing w:after="0"/>
+            </w:pPr>
+          </w:p>
+          <w:p>
+            <w:pPr>
+              <w:pStyle w:val="ListParagraph"/>
+              <w:spacing w:after="0"/>
+            </w:pPr>
+            <w:r>
+              <w:t>The protected browser app stays modest, functional, and honest as the backend grows.</w:t>
+            </w:r>
+          </w:p>
+        </w:tc>
+      </w:tr>
+      <w:tr>
+        <w:trPr>
+          <w:tblCellSpacing w:w="15" w:type="dxa"/>
+        </w:trPr>
+        <w:tc>
+          <w:tcPr>
+            <w:tcW w:w="810" w:type="dxa"/>
+            <w:tcBorders>
+              <w:top w:val="single" w:sz="4" w:space="0" w:color="auto"/>
+            </w:tcBorders>
+            <w:vAlign w:val="center"/>
+          </w:tcPr>
+          <w:p>
+            <w:r>
               <w:t>4</w:t>
             </w:r>
           </w:p>
@@ -7010,8 +8627,21 @@
               <w:spacing w:after="0"/>
             </w:pPr>
             <w:r>
-              <w:t>current SystemId is resolved through AccessContext</w:t>
-            </w:r>
+              <w:t xml:space="preserve">current </w:t>
+            </w:r>
+            <w:proofErr w:type="spellStart"/>
+            <w:r>
+              <w:t>SystemId</w:t>
+            </w:r>
+            <w:proofErr w:type="spellEnd"/>
+            <w:r>
+              <w:t xml:space="preserve"> is resolved through </w:t>
+            </w:r>
+            <w:proofErr w:type="spellStart"/>
+            <w:r>
+              <w:t>AccessContext</w:t>
+            </w:r>
+            <w:proofErr w:type="spellEnd"/>
           </w:p>
           <w:p>
             <w:pPr>
@@ -7023,8 +8653,14 @@
               <w:spacing w:after="0"/>
             </w:pPr>
             <w:r>
-              <w:t>member writes are scoped to current SystemId</w:t>
-            </w:r>
+              <w:t xml:space="preserve">member writes are scoped to current </w:t>
+            </w:r>
+            <w:proofErr w:type="spellStart"/>
+            <w:r>
+              <w:lastRenderedPageBreak/>
+              <w:t>SystemId</w:t>
+            </w:r>
+            <w:proofErr w:type="spellEnd"/>
           </w:p>
           <w:p>
             <w:pPr>
@@ -7036,9 +8672,21 @@
               <w:spacing w:after="0"/>
             </w:pPr>
             <w:r>
-              <w:lastRenderedPageBreak/>
-              <w:t>caller-supplied SystemId cannot escape current SystemId</w:t>
-            </w:r>
+              <w:t xml:space="preserve">caller-supplied </w:t>
+            </w:r>
+            <w:proofErr w:type="spellStart"/>
+            <w:r>
+              <w:t>SystemId</w:t>
+            </w:r>
+            <w:proofErr w:type="spellEnd"/>
+            <w:r>
+              <w:t xml:space="preserve"> cannot escape current </w:t>
+            </w:r>
+            <w:proofErr w:type="spellStart"/>
+            <w:r>
+              <w:t>SystemId</w:t>
+            </w:r>
+            <w:proofErr w:type="spellEnd"/>
           </w:p>
           <w:p>
             <w:pPr>
@@ -7124,7 +8772,15 @@
           </w:tcPr>
           <w:p>
             <w:r>
-              <w:t>A Chapter 3 member read path that proves the editable path starts from the same enforced SystemId boundary.</w:t>
+              <w:t xml:space="preserve">A Chapter 3 member read path that proves the editable path starts from the same enforced </w:t>
+            </w:r>
+            <w:proofErr w:type="spellStart"/>
+            <w:r>
+              <w:t>SystemId</w:t>
+            </w:r>
+            <w:proofErr w:type="spellEnd"/>
+            <w:r>
+              <w:t xml:space="preserve"> boundary.</w:t>
             </w:r>
           </w:p>
         </w:tc>
@@ -7146,8 +8802,13 @@
               <w:spacing w:after="0"/>
             </w:pPr>
             <w:r>
-              <w:t>member read uses AccessContext</w:t>
-            </w:r>
+              <w:t xml:space="preserve">member read uses </w:t>
+            </w:r>
+            <w:proofErr w:type="spellStart"/>
+            <w:r>
+              <w:t>AccessContext</w:t>
+            </w:r>
+            <w:proofErr w:type="spellEnd"/>
           </w:p>
           <w:p>
             <w:pPr>
@@ -7159,8 +8820,13 @@
               <w:spacing w:after="0"/>
             </w:pPr>
             <w:r>
-              <w:t>member read filters by current SystemId</w:t>
-            </w:r>
+              <w:t xml:space="preserve">member read filters by current </w:t>
+            </w:r>
+            <w:proofErr w:type="spellStart"/>
+            <w:r>
+              <w:t>SystemId</w:t>
+            </w:r>
+            <w:proofErr w:type="spellEnd"/>
           </w:p>
           <w:p>
             <w:pPr>
@@ -7172,8 +8838,13 @@
               <w:spacing w:after="0"/>
             </w:pPr>
             <w:r>
-              <w:t>member read does not leak members from another SystemId</w:t>
-            </w:r>
+              <w:t xml:space="preserve">member read does not leak members from another </w:t>
+            </w:r>
+            <w:proofErr w:type="spellStart"/>
+            <w:r>
+              <w:t>SystemId</w:t>
+            </w:r>
+            <w:proofErr w:type="spellEnd"/>
           </w:p>
           <w:p>
             <w:pPr>
@@ -7211,7 +8882,15 @@
               <w:spacing w:after="0"/>
             </w:pPr>
             <w:r>
-              <w:t>/api/me behavior remains unchanged</w:t>
+              <w:t>/</w:t>
+            </w:r>
+            <w:proofErr w:type="spellStart"/>
+            <w:r>
+              <w:t>api</w:t>
+            </w:r>
+            <w:proofErr w:type="spellEnd"/>
+            <w:r>
+              <w:t>/me behavior remains unchanged</w:t>
             </w:r>
           </w:p>
         </w:tc>
@@ -7306,8 +8985,13 @@
               <w:spacing w:after="0"/>
             </w:pPr>
             <w:r>
-              <w:t>new member receives current SystemId</w:t>
-            </w:r>
+              <w:t xml:space="preserve">new member receives current </w:t>
+            </w:r>
+            <w:proofErr w:type="spellStart"/>
+            <w:r>
+              <w:t>SystemId</w:t>
+            </w:r>
+            <w:proofErr w:type="spellEnd"/>
           </w:p>
           <w:p>
             <w:pPr>
@@ -7319,8 +9003,13 @@
               <w:spacing w:after="0"/>
             </w:pPr>
             <w:r>
-              <w:t>new member cannot choose another SystemId</w:t>
-            </w:r>
+              <w:t xml:space="preserve">new member cannot choose another </w:t>
+            </w:r>
+            <w:proofErr w:type="spellStart"/>
+            <w:r>
+              <w:t>SystemId</w:t>
+            </w:r>
+            <w:proofErr w:type="spellEnd"/>
           </w:p>
           <w:p>
             <w:pPr>
@@ -7384,7 +9073,15 @@
               <w:spacing w:after="0"/>
             </w:pPr>
             <w:r>
-              <w:t>/api/me behavior remains unchanged</w:t>
+              <w:t>/</w:t>
+            </w:r>
+            <w:proofErr w:type="spellStart"/>
+            <w:r>
+              <w:t>api</w:t>
+            </w:r>
+            <w:proofErr w:type="spellEnd"/>
+            <w:r>
+              <w:t>/me behavior remains unchanged</w:t>
             </w:r>
           </w:p>
         </w:tc>
@@ -7479,8 +9176,13 @@
               <w:spacing w:after="0"/>
             </w:pPr>
             <w:r>
-              <w:t>target member must belong to current SystemId</w:t>
-            </w:r>
+              <w:t xml:space="preserve">target member must belong to current </w:t>
+            </w:r>
+            <w:proofErr w:type="spellStart"/>
+            <w:r>
+              <w:t>SystemId</w:t>
+            </w:r>
+            <w:proofErr w:type="spellEnd"/>
           </w:p>
           <w:p>
             <w:pPr>
@@ -7492,7 +9194,15 @@
               <w:spacing w:after="0"/>
             </w:pPr>
             <w:r>
-              <w:t>member from another SystemId cannot be edited</w:t>
+              <w:t xml:space="preserve">member from another </w:t>
+            </w:r>
+            <w:proofErr w:type="spellStart"/>
+            <w:r>
+              <w:t>SystemId</w:t>
+            </w:r>
+            <w:proofErr w:type="spellEnd"/>
+            <w:r>
+              <w:t xml:space="preserve"> cannot be edited</w:t>
             </w:r>
           </w:p>
           <w:p>
@@ -7531,6 +9241,7 @@
               <w:spacing w:after="0"/>
             </w:pPr>
             <w:r>
+              <w:lastRenderedPageBreak/>
               <w:t>diagnostic trace includes the edit path</w:t>
             </w:r>
           </w:p>
@@ -7544,7 +9255,6 @@
               <w:spacing w:after="0"/>
             </w:pPr>
             <w:r>
-              <w:lastRenderedPageBreak/>
               <w:t>edited member can be read back through the system-scoped read path</w:t>
             </w:r>
           </w:p>
@@ -7558,7 +9268,15 @@
               <w:spacing w:after="0"/>
             </w:pPr>
             <w:r>
-              <w:t>/api/me behavior remains unchanged</w:t>
+              <w:t>/</w:t>
+            </w:r>
+            <w:proofErr w:type="spellStart"/>
+            <w:r>
+              <w:t>api</w:t>
+            </w:r>
+            <w:proofErr w:type="spellEnd"/>
+            <w:r>
+              <w:t>/me behavior remains unchanged</w:t>
             </w:r>
           </w:p>
         </w:tc>
@@ -7719,7 +9437,15 @@
               <w:spacing w:after="0"/>
             </w:pPr>
             <w:r>
-              <w:t>/api/me owner path remains unchanged</w:t>
+              <w:t>/</w:t>
+            </w:r>
+            <w:proofErr w:type="spellStart"/>
+            <w:r>
+              <w:t>api</w:t>
+            </w:r>
+            <w:proofErr w:type="spellEnd"/>
+            <w:r>
+              <w:t>/me owner path remains unchanged</w:t>
             </w:r>
           </w:p>
         </w:tc>
@@ -7827,7 +9553,15 @@
               <w:spacing w:after="0"/>
             </w:pPr>
             <w:r>
-              <w:t>/api/me requires login when logged out</w:t>
+              <w:t>/</w:t>
+            </w:r>
+            <w:proofErr w:type="spellStart"/>
+            <w:r>
+              <w:t>api</w:t>
+            </w:r>
+            <w:proofErr w:type="spellEnd"/>
+            <w:r>
+              <w:t>/me requires login when logged out</w:t>
             </w:r>
           </w:p>
           <w:p>
@@ -7840,7 +9574,15 @@
               <w:spacing w:after="0"/>
             </w:pPr>
             <w:r>
-              <w:t>/api/me succeeds when logged in</w:t>
+              <w:t>/</w:t>
+            </w:r>
+            <w:proofErr w:type="spellStart"/>
+            <w:r>
+              <w:t>api</w:t>
+            </w:r>
+            <w:proofErr w:type="spellEnd"/>
+            <w:r>
+              <w:t>/me succeeds when logged in</w:t>
             </w:r>
           </w:p>
           <w:p>
@@ -7904,8 +9646,13 @@
               </w:numPr>
               <w:spacing w:after="0"/>
             </w:pPr>
-            <w:r>
-              <w:t>SystemId enforcement is verified</w:t>
+            <w:proofErr w:type="spellStart"/>
+            <w:r>
+              <w:t>SystemId</w:t>
+            </w:r>
+            <w:proofErr w:type="spellEnd"/>
+            <w:r>
+              <w:t xml:space="preserve"> enforcement is verified</w:t>
             </w:r>
           </w:p>
           <w:p>
@@ -9423,6 +11170,119 @@
     </w:lvl>
   </w:abstractNum>
   <w:abstractNum w:abstractNumId="12" w15:restartNumberingAfterBreak="0">
+    <w:nsid w:val="2C5B4A29"/>
+    <w:multiLevelType w:val="hybridMultilevel"/>
+    <w:tmpl w:val="A6BCFEFC"/>
+    <w:lvl w:ilvl="0" w:tplc="04090001">
+      <w:start w:val="1"/>
+      <w:numFmt w:val="bullet"/>
+      <w:lvlText w:val=""/>
+      <w:lvlJc w:val="left"/>
+      <w:pPr>
+        <w:ind w:left="720" w:hanging="360"/>
+      </w:pPr>
+      <w:rPr>
+        <w:rFonts w:ascii="Symbol" w:hAnsi="Symbol" w:hint="default"/>
+      </w:rPr>
+    </w:lvl>
+    <w:lvl w:ilvl="1" w:tplc="04090003" w:tentative="1">
+      <w:start w:val="1"/>
+      <w:numFmt w:val="bullet"/>
+      <w:lvlText w:val="o"/>
+      <w:lvlJc w:val="left"/>
+      <w:pPr>
+        <w:ind w:left="1440" w:hanging="360"/>
+      </w:pPr>
+      <w:rPr>
+        <w:rFonts w:ascii="Courier New" w:hAnsi="Courier New" w:cs="Courier New" w:hint="default"/>
+      </w:rPr>
+    </w:lvl>
+    <w:lvl w:ilvl="2" w:tplc="04090005" w:tentative="1">
+      <w:start w:val="1"/>
+      <w:numFmt w:val="bullet"/>
+      <w:lvlText w:val=""/>
+      <w:lvlJc w:val="left"/>
+      <w:pPr>
+        <w:ind w:left="2160" w:hanging="360"/>
+      </w:pPr>
+      <w:rPr>
+        <w:rFonts w:ascii="Wingdings" w:hAnsi="Wingdings" w:hint="default"/>
+      </w:rPr>
+    </w:lvl>
+    <w:lvl w:ilvl="3" w:tplc="04090001" w:tentative="1">
+      <w:start w:val="1"/>
+      <w:numFmt w:val="bullet"/>
+      <w:lvlText w:val=""/>
+      <w:lvlJc w:val="left"/>
+      <w:pPr>
+        <w:ind w:left="2880" w:hanging="360"/>
+      </w:pPr>
+      <w:rPr>
+        <w:rFonts w:ascii="Symbol" w:hAnsi="Symbol" w:hint="default"/>
+      </w:rPr>
+    </w:lvl>
+    <w:lvl w:ilvl="4" w:tplc="04090003" w:tentative="1">
+      <w:start w:val="1"/>
+      <w:numFmt w:val="bullet"/>
+      <w:lvlText w:val="o"/>
+      <w:lvlJc w:val="left"/>
+      <w:pPr>
+        <w:ind w:left="3600" w:hanging="360"/>
+      </w:pPr>
+      <w:rPr>
+        <w:rFonts w:ascii="Courier New" w:hAnsi="Courier New" w:cs="Courier New" w:hint="default"/>
+      </w:rPr>
+    </w:lvl>
+    <w:lvl w:ilvl="5" w:tplc="04090005" w:tentative="1">
+      <w:start w:val="1"/>
+      <w:numFmt w:val="bullet"/>
+      <w:lvlText w:val=""/>
+      <w:lvlJc w:val="left"/>
+      <w:pPr>
+        <w:ind w:left="4320" w:hanging="360"/>
+      </w:pPr>
+      <w:rPr>
+        <w:rFonts w:ascii="Wingdings" w:hAnsi="Wingdings" w:hint="default"/>
+      </w:rPr>
+    </w:lvl>
+    <w:lvl w:ilvl="6" w:tplc="04090001" w:tentative="1">
+      <w:start w:val="1"/>
+      <w:numFmt w:val="bullet"/>
+      <w:lvlText w:val=""/>
+      <w:lvlJc w:val="left"/>
+      <w:pPr>
+        <w:ind w:left="5040" w:hanging="360"/>
+      </w:pPr>
+      <w:rPr>
+        <w:rFonts w:ascii="Symbol" w:hAnsi="Symbol" w:hint="default"/>
+      </w:rPr>
+    </w:lvl>
+    <w:lvl w:ilvl="7" w:tplc="04090003" w:tentative="1">
+      <w:start w:val="1"/>
+      <w:numFmt w:val="bullet"/>
+      <w:lvlText w:val="o"/>
+      <w:lvlJc w:val="left"/>
+      <w:pPr>
+        <w:ind w:left="5760" w:hanging="360"/>
+      </w:pPr>
+      <w:rPr>
+        <w:rFonts w:ascii="Courier New" w:hAnsi="Courier New" w:cs="Courier New" w:hint="default"/>
+      </w:rPr>
+    </w:lvl>
+    <w:lvl w:ilvl="8" w:tplc="04090005" w:tentative="1">
+      <w:start w:val="1"/>
+      <w:numFmt w:val="bullet"/>
+      <w:lvlText w:val=""/>
+      <w:lvlJc w:val="left"/>
+      <w:pPr>
+        <w:ind w:left="6480" w:hanging="360"/>
+      </w:pPr>
+      <w:rPr>
+        <w:rFonts w:ascii="Wingdings" w:hAnsi="Wingdings" w:hint="default"/>
+      </w:rPr>
+    </w:lvl>
+  </w:abstractNum>
+  <w:abstractNum w:abstractNumId="13" w15:restartNumberingAfterBreak="0">
     <w:nsid w:val="2D887D5F"/>
     <w:multiLevelType w:val="hybridMultilevel"/>
     <w:tmpl w:val="CF00E6F8"/>
@@ -9535,7 +11395,7 @@
       </w:rPr>
     </w:lvl>
   </w:abstractNum>
-  <w:abstractNum w:abstractNumId="13" w15:restartNumberingAfterBreak="0">
+  <w:abstractNum w:abstractNumId="14" w15:restartNumberingAfterBreak="0">
     <w:nsid w:val="343F2150"/>
     <w:multiLevelType w:val="hybridMultilevel"/>
     <w:tmpl w:val="6CBE3A94"/>
@@ -9648,7 +11508,7 @@
       </w:rPr>
     </w:lvl>
   </w:abstractNum>
-  <w:abstractNum w:abstractNumId="14" w15:restartNumberingAfterBreak="0">
+  <w:abstractNum w:abstractNumId="15" w15:restartNumberingAfterBreak="0">
     <w:nsid w:val="35AF3907"/>
     <w:multiLevelType w:val="hybridMultilevel"/>
     <w:tmpl w:val="219A72A6"/>
@@ -9761,7 +11621,7 @@
       </w:rPr>
     </w:lvl>
   </w:abstractNum>
-  <w:abstractNum w:abstractNumId="15" w15:restartNumberingAfterBreak="0">
+  <w:abstractNum w:abstractNumId="16" w15:restartNumberingAfterBreak="0">
     <w:nsid w:val="36657A01"/>
     <w:multiLevelType w:val="hybridMultilevel"/>
     <w:tmpl w:val="9CBC721A"/>
@@ -9847,7 +11707,7 @@
       </w:pPr>
     </w:lvl>
   </w:abstractNum>
-  <w:abstractNum w:abstractNumId="16" w15:restartNumberingAfterBreak="0">
+  <w:abstractNum w:abstractNumId="17" w15:restartNumberingAfterBreak="0">
     <w:nsid w:val="39B51442"/>
     <w:multiLevelType w:val="hybridMultilevel"/>
     <w:tmpl w:val="AD9E2E62"/>
@@ -9960,7 +11820,7 @@
       </w:rPr>
     </w:lvl>
   </w:abstractNum>
-  <w:abstractNum w:abstractNumId="17" w15:restartNumberingAfterBreak="0">
+  <w:abstractNum w:abstractNumId="18" w15:restartNumberingAfterBreak="0">
     <w:nsid w:val="409E2D02"/>
     <w:multiLevelType w:val="hybridMultilevel"/>
     <w:tmpl w:val="B942CD3C"/>
@@ -10073,7 +11933,7 @@
       </w:rPr>
     </w:lvl>
   </w:abstractNum>
-  <w:abstractNum w:abstractNumId="18" w15:restartNumberingAfterBreak="0">
+  <w:abstractNum w:abstractNumId="19" w15:restartNumberingAfterBreak="0">
     <w:nsid w:val="41440DF4"/>
     <w:multiLevelType w:val="hybridMultilevel"/>
     <w:tmpl w:val="EB2EFC28"/>
@@ -10186,7 +12046,7 @@
       </w:rPr>
     </w:lvl>
   </w:abstractNum>
-  <w:abstractNum w:abstractNumId="19" w15:restartNumberingAfterBreak="0">
+  <w:abstractNum w:abstractNumId="20" w15:restartNumberingAfterBreak="0">
     <w:nsid w:val="42947547"/>
     <w:multiLevelType w:val="hybridMultilevel"/>
     <w:tmpl w:val="C9CC1344"/>
@@ -10299,7 +12159,7 @@
       </w:rPr>
     </w:lvl>
   </w:abstractNum>
-  <w:abstractNum w:abstractNumId="20" w15:restartNumberingAfterBreak="0">
+  <w:abstractNum w:abstractNumId="21" w15:restartNumberingAfterBreak="0">
     <w:nsid w:val="442E4A88"/>
     <w:multiLevelType w:val="hybridMultilevel"/>
     <w:tmpl w:val="000ADE16"/>
@@ -10412,7 +12272,7 @@
       </w:rPr>
     </w:lvl>
   </w:abstractNum>
-  <w:abstractNum w:abstractNumId="21" w15:restartNumberingAfterBreak="0">
+  <w:abstractNum w:abstractNumId="22" w15:restartNumberingAfterBreak="0">
     <w:nsid w:val="4529787A"/>
     <w:multiLevelType w:val="hybridMultilevel"/>
     <w:tmpl w:val="667641C2"/>
@@ -10525,7 +12385,7 @@
       </w:rPr>
     </w:lvl>
   </w:abstractNum>
-  <w:abstractNum w:abstractNumId="22" w15:restartNumberingAfterBreak="0">
+  <w:abstractNum w:abstractNumId="23" w15:restartNumberingAfterBreak="0">
     <w:nsid w:val="4848396F"/>
     <w:multiLevelType w:val="hybridMultilevel"/>
     <w:tmpl w:val="1E3AE816"/>
@@ -10638,7 +12498,7 @@
       </w:rPr>
     </w:lvl>
   </w:abstractNum>
-  <w:abstractNum w:abstractNumId="23" w15:restartNumberingAfterBreak="0">
+  <w:abstractNum w:abstractNumId="24" w15:restartNumberingAfterBreak="0">
     <w:nsid w:val="49FB6FCC"/>
     <w:multiLevelType w:val="hybridMultilevel"/>
     <w:tmpl w:val="7710096A"/>
@@ -10751,7 +12611,7 @@
       </w:rPr>
     </w:lvl>
   </w:abstractNum>
-  <w:abstractNum w:abstractNumId="24" w15:restartNumberingAfterBreak="0">
+  <w:abstractNum w:abstractNumId="25" w15:restartNumberingAfterBreak="0">
     <w:nsid w:val="508B3D82"/>
     <w:multiLevelType w:val="hybridMultilevel"/>
     <w:tmpl w:val="C11CC89E"/>
@@ -10864,7 +12724,7 @@
       </w:rPr>
     </w:lvl>
   </w:abstractNum>
-  <w:abstractNum w:abstractNumId="25" w15:restartNumberingAfterBreak="0">
+  <w:abstractNum w:abstractNumId="26" w15:restartNumberingAfterBreak="0">
     <w:nsid w:val="517C3D40"/>
     <w:multiLevelType w:val="hybridMultilevel"/>
     <w:tmpl w:val="DDC8EFBC"/>
@@ -10977,7 +12837,7 @@
       </w:rPr>
     </w:lvl>
   </w:abstractNum>
-  <w:abstractNum w:abstractNumId="26" w15:restartNumberingAfterBreak="0">
+  <w:abstractNum w:abstractNumId="27" w15:restartNumberingAfterBreak="0">
     <w:nsid w:val="56AA75E0"/>
     <w:multiLevelType w:val="hybridMultilevel"/>
     <w:tmpl w:val="A7227706"/>
@@ -11090,7 +12950,7 @@
       </w:rPr>
     </w:lvl>
   </w:abstractNum>
-  <w:abstractNum w:abstractNumId="27" w15:restartNumberingAfterBreak="0">
+  <w:abstractNum w:abstractNumId="28" w15:restartNumberingAfterBreak="0">
     <w:nsid w:val="5B2D0E7D"/>
     <w:multiLevelType w:val="hybridMultilevel"/>
     <w:tmpl w:val="FB825F40"/>
@@ -11203,7 +13063,7 @@
       </w:rPr>
     </w:lvl>
   </w:abstractNum>
-  <w:abstractNum w:abstractNumId="28" w15:restartNumberingAfterBreak="0">
+  <w:abstractNum w:abstractNumId="29" w15:restartNumberingAfterBreak="0">
     <w:nsid w:val="5B4B0F6C"/>
     <w:multiLevelType w:val="hybridMultilevel"/>
     <w:tmpl w:val="CE145320"/>
@@ -11316,7 +13176,7 @@
       </w:rPr>
     </w:lvl>
   </w:abstractNum>
-  <w:abstractNum w:abstractNumId="29" w15:restartNumberingAfterBreak="0">
+  <w:abstractNum w:abstractNumId="30" w15:restartNumberingAfterBreak="0">
     <w:nsid w:val="5C5D1EDC"/>
     <w:multiLevelType w:val="hybridMultilevel"/>
     <w:tmpl w:val="05B2BD02"/>
@@ -11429,7 +13289,7 @@
       </w:rPr>
     </w:lvl>
   </w:abstractNum>
-  <w:abstractNum w:abstractNumId="30" w15:restartNumberingAfterBreak="0">
+  <w:abstractNum w:abstractNumId="31" w15:restartNumberingAfterBreak="0">
     <w:nsid w:val="608D45AB"/>
     <w:multiLevelType w:val="hybridMultilevel"/>
     <w:tmpl w:val="D9345EA6"/>
@@ -11542,7 +13402,7 @@
       </w:rPr>
     </w:lvl>
   </w:abstractNum>
-  <w:abstractNum w:abstractNumId="31" w15:restartNumberingAfterBreak="0">
+  <w:abstractNum w:abstractNumId="32" w15:restartNumberingAfterBreak="0">
     <w:nsid w:val="6B0F6190"/>
     <w:multiLevelType w:val="hybridMultilevel"/>
     <w:tmpl w:val="30F8E8C0"/>
@@ -11655,7 +13515,7 @@
       </w:rPr>
     </w:lvl>
   </w:abstractNum>
-  <w:abstractNum w:abstractNumId="32" w15:restartNumberingAfterBreak="0">
+  <w:abstractNum w:abstractNumId="33" w15:restartNumberingAfterBreak="0">
     <w:nsid w:val="6D3848C7"/>
     <w:multiLevelType w:val="hybridMultilevel"/>
     <w:tmpl w:val="63842770"/>
@@ -11768,7 +13628,7 @@
       </w:rPr>
     </w:lvl>
   </w:abstractNum>
-  <w:abstractNum w:abstractNumId="33" w15:restartNumberingAfterBreak="0">
+  <w:abstractNum w:abstractNumId="34" w15:restartNumberingAfterBreak="0">
     <w:nsid w:val="7B8D1B7B"/>
     <w:multiLevelType w:val="hybridMultilevel"/>
     <w:tmpl w:val="02942032"/>
@@ -11881,7 +13741,7 @@
       </w:rPr>
     </w:lvl>
   </w:abstractNum>
-  <w:abstractNum w:abstractNumId="34" w15:restartNumberingAfterBreak="0">
+  <w:abstractNum w:abstractNumId="35" w15:restartNumberingAfterBreak="0">
     <w:nsid w:val="7EDE6229"/>
     <w:multiLevelType w:val="hybridMultilevel"/>
     <w:tmpl w:val="34945C06"/>
@@ -11994,7 +13854,7 @@
       </w:rPr>
     </w:lvl>
   </w:abstractNum>
-  <w:abstractNum w:abstractNumId="35" w15:restartNumberingAfterBreak="0">
+  <w:abstractNum w:abstractNumId="36" w15:restartNumberingAfterBreak="0">
     <w:nsid w:val="7FF65407"/>
     <w:multiLevelType w:val="hybridMultilevel"/>
     <w:tmpl w:val="CAAA563C"/>
@@ -12111,28 +13971,28 @@
     <w:abstractNumId w:val="7"/>
   </w:num>
   <w:num w:numId="2" w16cid:durableId="217133460">
-    <w:abstractNumId w:val="20"/>
+    <w:abstractNumId w:val="21"/>
   </w:num>
   <w:num w:numId="3" w16cid:durableId="514803117">
-    <w:abstractNumId w:val="21"/>
+    <w:abstractNumId w:val="22"/>
   </w:num>
   <w:num w:numId="4" w16cid:durableId="1576670211">
-    <w:abstractNumId w:val="29"/>
+    <w:abstractNumId w:val="30"/>
   </w:num>
   <w:num w:numId="5" w16cid:durableId="1668703457">
-    <w:abstractNumId w:val="27"/>
+    <w:abstractNumId w:val="28"/>
   </w:num>
   <w:num w:numId="6" w16cid:durableId="907035537">
-    <w:abstractNumId w:val="30"/>
+    <w:abstractNumId w:val="31"/>
   </w:num>
   <w:num w:numId="7" w16cid:durableId="39980543">
-    <w:abstractNumId w:val="13"/>
+    <w:abstractNumId w:val="14"/>
   </w:num>
   <w:num w:numId="8" w16cid:durableId="905145948">
     <w:abstractNumId w:val="5"/>
   </w:num>
   <w:num w:numId="9" w16cid:durableId="759059323">
-    <w:abstractNumId w:val="28"/>
+    <w:abstractNumId w:val="29"/>
   </w:num>
   <w:num w:numId="10" w16cid:durableId="779836732">
     <w:abstractNumId w:val="0"/>
@@ -12141,34 +14001,34 @@
     <w:abstractNumId w:val="4"/>
   </w:num>
   <w:num w:numId="12" w16cid:durableId="1107191646">
-    <w:abstractNumId w:val="23"/>
+    <w:abstractNumId w:val="24"/>
   </w:num>
   <w:num w:numId="13" w16cid:durableId="1210655280">
-    <w:abstractNumId w:val="25"/>
+    <w:abstractNumId w:val="26"/>
   </w:num>
   <w:num w:numId="14" w16cid:durableId="220755351">
-    <w:abstractNumId w:val="35"/>
+    <w:abstractNumId w:val="36"/>
   </w:num>
   <w:num w:numId="15" w16cid:durableId="472454215">
-    <w:abstractNumId w:val="12"/>
+    <w:abstractNumId w:val="13"/>
   </w:num>
   <w:num w:numId="16" w16cid:durableId="211500607">
-    <w:abstractNumId w:val="15"/>
+    <w:abstractNumId w:val="16"/>
   </w:num>
   <w:num w:numId="17" w16cid:durableId="1495147969">
     <w:abstractNumId w:val="3"/>
   </w:num>
   <w:num w:numId="18" w16cid:durableId="367947514">
-    <w:abstractNumId w:val="22"/>
+    <w:abstractNumId w:val="23"/>
   </w:num>
   <w:num w:numId="19" w16cid:durableId="223880672">
-    <w:abstractNumId w:val="17"/>
+    <w:abstractNumId w:val="18"/>
   </w:num>
   <w:num w:numId="20" w16cid:durableId="712080595">
-    <w:abstractNumId w:val="34"/>
+    <w:abstractNumId w:val="35"/>
   </w:num>
   <w:num w:numId="21" w16cid:durableId="51738637">
-    <w:abstractNumId w:val="24"/>
+    <w:abstractNumId w:val="25"/>
   </w:num>
   <w:num w:numId="22" w16cid:durableId="831523958">
     <w:abstractNumId w:val="11"/>
@@ -12177,16 +14037,16 @@
     <w:abstractNumId w:val="9"/>
   </w:num>
   <w:num w:numId="24" w16cid:durableId="1154448970">
-    <w:abstractNumId w:val="14"/>
+    <w:abstractNumId w:val="15"/>
   </w:num>
   <w:num w:numId="25" w16cid:durableId="1623228143">
-    <w:abstractNumId w:val="32"/>
+    <w:abstractNumId w:val="33"/>
   </w:num>
   <w:num w:numId="26" w16cid:durableId="1360156104">
     <w:abstractNumId w:val="10"/>
   </w:num>
   <w:num w:numId="27" w16cid:durableId="282926766">
-    <w:abstractNumId w:val="19"/>
+    <w:abstractNumId w:val="20"/>
   </w:num>
   <w:num w:numId="28" w16cid:durableId="1010529074">
     <w:abstractNumId w:val="6"/>
@@ -12195,25 +14055,28 @@
     <w:abstractNumId w:val="1"/>
   </w:num>
   <w:num w:numId="30" w16cid:durableId="1532910577">
-    <w:abstractNumId w:val="33"/>
+    <w:abstractNumId w:val="34"/>
   </w:num>
   <w:num w:numId="31" w16cid:durableId="477499357">
-    <w:abstractNumId w:val="16"/>
+    <w:abstractNumId w:val="17"/>
   </w:num>
   <w:num w:numId="32" w16cid:durableId="1002010938">
-    <w:abstractNumId w:val="31"/>
+    <w:abstractNumId w:val="32"/>
   </w:num>
   <w:num w:numId="33" w16cid:durableId="1446461177">
     <w:abstractNumId w:val="8"/>
   </w:num>
   <w:num w:numId="34" w16cid:durableId="36127356">
-    <w:abstractNumId w:val="26"/>
+    <w:abstractNumId w:val="27"/>
   </w:num>
   <w:num w:numId="35" w16cid:durableId="2060087837">
     <w:abstractNumId w:val="2"/>
   </w:num>
   <w:num w:numId="36" w16cid:durableId="677346480">
-    <w:abstractNumId w:val="18"/>
+    <w:abstractNumId w:val="19"/>
+  </w:num>
+  <w:num w:numId="37" w16cid:durableId="1102382634">
+    <w:abstractNumId w:val="12"/>
   </w:num>
 </w:numbering>
 </file>

</xml_diff>